<commit_message>
Upload “src/content/bios/Van Lennep-E 2017.docx”
</commit_message>
<xml_diff>
--- a/src/content/bios/Van Lennep-E 2017.docx
+++ b/src/content/bios/Van Lennep-E 2017.docx
@@ -1,6 +1,6 @@
 
 <file path=word/document.xml><?xml version="1.0" encoding="utf-8"?>
-<w:document xmlns:wpc="http://schemas.microsoft.com/office/word/2010/wordprocessingCanvas" xmlns:cx="http://schemas.microsoft.com/office/drawing/2014/chartex" xmlns:cx1="http://schemas.microsoft.com/office/drawing/2015/9/8/chartex" xmlns:cx2="http://schemas.microsoft.com/office/drawing/2015/10/21/chartex" xmlns:cx3="http://schemas.microsoft.com/office/drawing/2016/5/9/chartex" xmlns:cx4="http://schemas.microsoft.com/office/drawing/2016/5/10/chartex" xmlns:cx5="http://schemas.microsoft.com/office/drawing/2016/5/11/chartex" xmlns:cx6="http://schemas.microsoft.com/office/drawing/2016/5/12/chartex" xmlns:cx7="http://schemas.microsoft.com/office/drawing/2016/5/13/chartex" xmlns:cx8="http://schemas.microsoft.com/office/drawing/2016/5/14/chartex" xmlns:mc="http://schemas.openxmlformats.org/markup-compatibility/2006" xmlns:aink="http://schemas.microsoft.com/office/drawing/2016/ink" xmlns:am3d="http://schemas.microsoft.com/office/drawing/2017/model3d" xmlns:o="urn:schemas-microsoft-com:office:office" xmlns:oel="http://schemas.microsoft.com/office/2019/extlst" xmlns:r="http://schemas.openxmlformats.org/officeDocument/2006/relationships" xmlns:m="http://schemas.openxmlformats.org/officeDocument/2006/math" xmlns:v="urn:schemas-microsoft-com:vml" xmlns:wp14="http://schemas.microsoft.com/office/word/2010/wordprocessingDrawing" xmlns:wp="http://schemas.openxmlformats.org/drawingml/2006/wordprocessingDrawing" xmlns:w10="urn:schemas-microsoft-com:office:word" xmlns:w="http://schemas.openxmlformats.org/wordprocessingml/2006/main" xmlns:w14="http://schemas.microsoft.com/office/word/2010/wordml" xmlns:w15="http://schemas.microsoft.com/office/word/2012/wordml" xmlns:w16cex="http://schemas.microsoft.com/office/word/2018/wordml/cex" xmlns:w16cid="http://schemas.microsoft.com/office/word/2016/wordml/cid" xmlns:w16="http://schemas.microsoft.com/office/word/2018/wordml" xmlns:w16du="http://schemas.microsoft.com/office/word/2023/wordml/word16du" xmlns:w16sdtdh="http://schemas.microsoft.com/office/word/2020/wordml/sdtdatahash" xmlns:w16sdtfl="http://schemas.microsoft.com/office/word/2024/wordml/sdtformatlock" xmlns:w16se="http://schemas.microsoft.com/office/word/2015/wordml/symex" xmlns:wpg="http://schemas.microsoft.com/office/word/2010/wordprocessingGroup" xmlns:wpi="http://schemas.microsoft.com/office/word/2010/wordprocessingInk" xmlns:wne="http://schemas.microsoft.com/office/word/2006/wordml" xmlns:wps="http://schemas.microsoft.com/office/word/2010/wordprocessingShape" mc:Ignorable="w14 w15 w16se w16cid w16 w16cex w16sdtdh w16sdtfl w16du wp14">
+<w:document xmlns:wpc="http://schemas.microsoft.com/office/word/2010/wordprocessingCanvas" xmlns:cx="http://schemas.microsoft.com/office/drawing/2014/chartex" xmlns:cx1="http://schemas.microsoft.com/office/drawing/2015/9/8/chartex" xmlns:cx2="http://schemas.microsoft.com/office/drawing/2015/10/21/chartex" xmlns:cx3="http://schemas.microsoft.com/office/drawing/2016/5/9/chartex" xmlns:cx4="http://schemas.microsoft.com/office/drawing/2016/5/10/chartex" xmlns:cx5="http://schemas.microsoft.com/office/drawing/2016/5/11/chartex" xmlns:cx6="http://schemas.microsoft.com/office/drawing/2016/5/12/chartex" xmlns:cx7="http://schemas.microsoft.com/office/drawing/2016/5/13/chartex" xmlns:cx8="http://schemas.microsoft.com/office/drawing/2016/5/14/chartex" xmlns:mc="http://schemas.openxmlformats.org/markup-compatibility/2006" xmlns:m="http://schemas.openxmlformats.org/officeDocument/2006/math" xmlns:aink="http://schemas.microsoft.com/office/drawing/2016/ink" xmlns:am3d="http://schemas.microsoft.com/office/drawing/2017/model3d" xmlns:oel="http://schemas.microsoft.com/office/2019/extlst" xmlns:r="http://schemas.openxmlformats.org/officeDocument/2006/relationships" xmlns:wp14="http://schemas.microsoft.com/office/word/2010/wordprocessingDrawing" xmlns:wp="http://schemas.openxmlformats.org/drawingml/2006/wordprocessingDrawing" xmlns:wpg="http://schemas.microsoft.com/office/word/2010/wordprocessingGroup" xmlns:wpi="http://schemas.microsoft.com/office/word/2010/wordprocessingInk" xmlns:wps="http://schemas.microsoft.com/office/word/2010/wordprocessingShape" xmlns:o="urn:schemas-microsoft-com:office:office" xmlns:v="urn:schemas-microsoft-com:vml" xmlns:w10="urn:schemas-microsoft-com:office:word" xmlns:w="http://schemas.openxmlformats.org/wordprocessingml/2006/main" xmlns:w14="http://schemas.microsoft.com/office/word/2010/wordml" xmlns:w15="http://schemas.microsoft.com/office/word/2012/wordml" xmlns:w16cei="http://schemas.microsoft.com/office/word/2026/wordml/cei" xmlns:w16cex="http://schemas.microsoft.com/office/word/2018/wordml/cex" xmlns:w16cid="http://schemas.microsoft.com/office/word/2016/wordml/cid" xmlns:w16="http://schemas.microsoft.com/office/word/2018/wordml" xmlns:w16sdtdh="http://schemas.microsoft.com/office/word/2020/wordml/sdtdatahash" xmlns:w16sdtfl="http://schemas.microsoft.com/office/word/2024/wordml/sdtformatlock" xmlns:w16se="http://schemas.microsoft.com/office/word/2015/wordml/symex" xmlns:w16du="http://schemas.microsoft.com/office/word/2023/wordml/word16du" xmlns:wne="http://schemas.microsoft.com/office/word/2006/wordml" mc:Ignorable="w14 w15 w16se w16cid w16 w16cex w16sdtdh w16sdtfl w16du wp14">
   <w:body>
     <w:p>
       <w:pPr>
@@ -176,14 +176,13 @@
       <w:r>
         <w:rPr>
           <w:rFonts w:ascii="Times New Roman" w:hAnsi="Times New Roman" w:cs="Times New Roman"/>
-          <w:noProof/>
-          <w:lang w:val="nl-NL" w:eastAsia="nl-NL"/>
+          <w:lang w:val="en-GB"/>
         </w:rPr>
         <w:drawing>
-          <wp:inline distT="0" distB="0" distL="0" distR="0" wp14:anchorId="4F58A7E3" wp14:editId="54D3F0AB">
-            <wp:extent cx="2660650" cy="1776656"/>
-            <wp:effectExtent l="12700" t="12700" r="6350" b="14605"/>
-            <wp:docPr id="1" name="Image 1"/>
+          <wp:inline distT="0" distB="0" distL="0" distR="0" wp14:anchorId="69D81AF4" wp14:editId="0E5E3046">
+            <wp:extent cx="2355357" cy="2950108"/>
+            <wp:effectExtent l="0" t="0" r="0" b="0"/>
+            <wp:docPr id="1634830512" name="Afbeelding 1"/>
             <wp:cNvGraphicFramePr>
               <a:graphicFrameLocks xmlns:a="http://schemas.openxmlformats.org/drawingml/2006/main" noChangeAspect="1"/>
             </wp:cNvGraphicFramePr>
@@ -191,38 +190,23 @@
               <a:graphicData uri="http://schemas.openxmlformats.org/drawingml/2006/picture">
                 <pic:pic xmlns:pic="http://schemas.openxmlformats.org/drawingml/2006/picture">
                   <pic:nvPicPr>
-                    <pic:cNvPr id="0" name="Picture 1"/>
-                    <pic:cNvPicPr>
-                      <a:picLocks noChangeAspect="1" noChangeArrowheads="1"/>
-                    </pic:cNvPicPr>
+                    <pic:cNvPr id="1634830512" name=""/>
+                    <pic:cNvPicPr/>
                   </pic:nvPicPr>
                   <pic:blipFill>
-                    <a:blip r:embed="rId8">
-                      <a:extLst>
-                        <a:ext uri="{28A0092B-C50C-407E-A947-70E740481C1C}">
-                          <a14:useLocalDpi xmlns:a14="http://schemas.microsoft.com/office/drawing/2010/main" val="0"/>
-                        </a:ext>
-                      </a:extLst>
-                    </a:blip>
-                    <a:srcRect/>
+                    <a:blip r:embed="rId8"/>
                     <a:stretch>
                       <a:fillRect/>
                     </a:stretch>
                   </pic:blipFill>
-                  <pic:spPr bwMode="auto">
+                  <pic:spPr>
                     <a:xfrm>
                       <a:off x="0" y="0"/>
-                      <a:ext cx="2679437" cy="1789201"/>
+                      <a:ext cx="2378158" cy="2978666"/>
                     </a:xfrm>
                     <a:prstGeom prst="rect">
                       <a:avLst/>
                     </a:prstGeom>
-                    <a:noFill/>
-                    <a:ln>
-                      <a:solidFill>
-                        <a:schemeClr val="tx1"/>
-                      </a:solidFill>
-                    </a:ln>
                   </pic:spPr>
                 </pic:pic>
               </a:graphicData>
@@ -253,23 +237,28 @@
         </w:rPr>
         <w:t xml:space="preserve">: </w:t>
       </w:r>
-      <w:hyperlink r:id="rId9" w:history="1">
-        <w:r>
-          <w:rPr>
-            <w:rStyle w:val="Hyperlink"/>
-            <w:rFonts w:ascii="Times New Roman" w:hAnsi="Times New Roman" w:cs="Times New Roman"/>
-            <w:u w:val="none"/>
-            <w:lang w:val="en-GB"/>
-          </w:rPr>
-          <w:t>https://ambtenarengeschiedenis.pleio.nl/file/download/28049992</w:t>
-        </w:r>
-      </w:hyperlink>
-      <w:r>
-        <w:rPr>
-          <w:rFonts w:ascii="Times New Roman" w:hAnsi="Times New Roman" w:cs="Times New Roman"/>
-          <w:lang w:val="en-GB"/>
-        </w:rPr>
-        <w:t xml:space="preserve"> </w:t>
+      <w:r>
+        <w:rPr>
+          <w:rFonts w:ascii="Times New Roman" w:hAnsi="Times New Roman" w:cs="Times New Roman"/>
+          <w:lang w:val="en-GB"/>
+        </w:rPr>
+        <w:t xml:space="preserve">Van </w:t>
+      </w:r>
+      <w:proofErr w:type="spellStart"/>
+      <w:r>
+        <w:rPr>
+          <w:rFonts w:ascii="Times New Roman" w:hAnsi="Times New Roman" w:cs="Times New Roman"/>
+          <w:lang w:val="en-GB"/>
+        </w:rPr>
+        <w:t>Lennep</w:t>
+      </w:r>
+      <w:proofErr w:type="spellEnd"/>
+      <w:r>
+        <w:rPr>
+          <w:rFonts w:ascii="Times New Roman" w:hAnsi="Times New Roman" w:cs="Times New Roman"/>
+          <w:lang w:val="en-GB"/>
+        </w:rPr>
+        <w:t>, n.d., OECD, Flickr, C79-30-18</w:t>
       </w:r>
     </w:p>
     <w:p>
@@ -347,7 +336,23 @@
           <w:rFonts w:ascii="Times New Roman" w:hAnsi="Times New Roman" w:cs="Times New Roman"/>
           <w:lang w:val="en-GB"/>
         </w:rPr>
-        <w:t xml:space="preserve">family that had been elevated to nobility by royal decree in 1903. His father was a manager in the Van Eeghen bank in Amsterdam and an adviser to </w:t>
+        <w:t xml:space="preserve">family that had been elevated to nobility by royal decree in 1903. His father was a manager in the Van </w:t>
+      </w:r>
+      <w:proofErr w:type="spellStart"/>
+      <w:r>
+        <w:rPr>
+          <w:rFonts w:ascii="Times New Roman" w:hAnsi="Times New Roman" w:cs="Times New Roman"/>
+          <w:lang w:val="en-GB"/>
+        </w:rPr>
+        <w:t>Eeghen</w:t>
+      </w:r>
+      <w:proofErr w:type="spellEnd"/>
+      <w:r>
+        <w:rPr>
+          <w:rFonts w:ascii="Times New Roman" w:hAnsi="Times New Roman" w:cs="Times New Roman"/>
+          <w:lang w:val="en-GB"/>
+        </w:rPr>
+        <w:t xml:space="preserve"> bank in Amsterdam and an adviser to </w:t>
       </w:r>
       <w:r>
         <w:rPr>
@@ -396,8 +401,17 @@
           <w:rFonts w:ascii="Times New Roman" w:hAnsi="Times New Roman" w:cs="Times New Roman"/>
           <w:lang w:val="en-GB"/>
         </w:rPr>
-        <w:t>Van Lennep’s</w:t>
-      </w:r>
+        <w:t xml:space="preserve">Van </w:t>
+      </w:r>
+      <w:proofErr w:type="spellStart"/>
+      <w:r>
+        <w:rPr>
+          <w:rFonts w:ascii="Times New Roman" w:hAnsi="Times New Roman" w:cs="Times New Roman"/>
+          <w:lang w:val="en-GB"/>
+        </w:rPr>
+        <w:t>Lennep’s</w:t>
+      </w:r>
+      <w:proofErr w:type="spellEnd"/>
       <w:r>
         <w:rPr>
           <w:rFonts w:ascii="Times New Roman" w:hAnsi="Times New Roman" w:cs="Times New Roman"/>
@@ -470,8 +484,17 @@
           <w:rFonts w:ascii="Times New Roman" w:hAnsi="Times New Roman" w:cs="Times New Roman"/>
           <w:lang w:val="en-GB"/>
         </w:rPr>
-        <w:t>Van Lennep</w:t>
-      </w:r>
+        <w:t xml:space="preserve">Van </w:t>
+      </w:r>
+      <w:proofErr w:type="spellStart"/>
+      <w:r>
+        <w:rPr>
+          <w:rFonts w:ascii="Times New Roman" w:hAnsi="Times New Roman" w:cs="Times New Roman"/>
+          <w:lang w:val="en-GB"/>
+        </w:rPr>
+        <w:t>Lennep</w:t>
+      </w:r>
+      <w:proofErr w:type="spellEnd"/>
       <w:r>
         <w:rPr>
           <w:rFonts w:ascii="Times New Roman" w:hAnsi="Times New Roman" w:cs="Times New Roman"/>
@@ -493,12 +516,21 @@
         </w:rPr>
         <w:t xml:space="preserve">received an elite education at the </w:t>
       </w:r>
-      <w:r>
-        <w:rPr>
-          <w:rFonts w:ascii="Times New Roman" w:hAnsi="Times New Roman" w:cs="Times New Roman"/>
-          <w:lang w:val="en-GB"/>
-        </w:rPr>
-        <w:t xml:space="preserve">Barlaeus </w:t>
+      <w:proofErr w:type="spellStart"/>
+      <w:r>
+        <w:rPr>
+          <w:rFonts w:ascii="Times New Roman" w:hAnsi="Times New Roman" w:cs="Times New Roman"/>
+          <w:lang w:val="en-GB"/>
+        </w:rPr>
+        <w:t>Barlaeus</w:t>
+      </w:r>
+      <w:proofErr w:type="spellEnd"/>
+      <w:r>
+        <w:rPr>
+          <w:rFonts w:ascii="Times New Roman" w:hAnsi="Times New Roman" w:cs="Times New Roman"/>
+          <w:lang w:val="en-GB"/>
+        </w:rPr>
+        <w:t xml:space="preserve"> </w:t>
       </w:r>
       <w:r>
         <w:rPr>
@@ -771,7 +803,23 @@
           <w:rFonts w:ascii="Times New Roman" w:hAnsi="Times New Roman" w:cs="Times New Roman"/>
           <w:lang w:val="en-GB"/>
         </w:rPr>
-        <w:t xml:space="preserve">Van Lennep </w:t>
+        <w:t xml:space="preserve">Van </w:t>
+      </w:r>
+      <w:proofErr w:type="spellStart"/>
+      <w:r>
+        <w:rPr>
+          <w:rFonts w:ascii="Times New Roman" w:hAnsi="Times New Roman" w:cs="Times New Roman"/>
+          <w:lang w:val="en-GB"/>
+        </w:rPr>
+        <w:t>Lennep</w:t>
+      </w:r>
+      <w:proofErr w:type="spellEnd"/>
+      <w:r>
+        <w:rPr>
+          <w:rFonts w:ascii="Times New Roman" w:hAnsi="Times New Roman" w:cs="Times New Roman"/>
+          <w:lang w:val="en-GB"/>
+        </w:rPr>
+        <w:t xml:space="preserve"> </w:t>
       </w:r>
       <w:r>
         <w:rPr>
@@ -904,7 +952,23 @@
           <w:rFonts w:ascii="Times New Roman" w:hAnsi="Times New Roman" w:cs="Times New Roman"/>
           <w:lang w:val="en-GB"/>
         </w:rPr>
-        <w:t xml:space="preserve">an Lennep </w:t>
+        <w:t xml:space="preserve">an </w:t>
+      </w:r>
+      <w:proofErr w:type="spellStart"/>
+      <w:r>
+        <w:rPr>
+          <w:rFonts w:ascii="Times New Roman" w:hAnsi="Times New Roman" w:cs="Times New Roman"/>
+          <w:lang w:val="en-GB"/>
+        </w:rPr>
+        <w:t>Lennep</w:t>
+      </w:r>
+      <w:proofErr w:type="spellEnd"/>
+      <w:r>
+        <w:rPr>
+          <w:rFonts w:ascii="Times New Roman" w:hAnsi="Times New Roman" w:cs="Times New Roman"/>
+          <w:lang w:val="en-GB"/>
+        </w:rPr>
+        <w:t xml:space="preserve"> </w:t>
       </w:r>
       <w:r>
         <w:rPr>
@@ -1296,14 +1360,31 @@
           <w:rFonts w:ascii="Times New Roman" w:hAnsi="Times New Roman" w:cs="Times New Roman"/>
           <w:lang w:val="en-GB"/>
         </w:rPr>
-        <w:t>Van Lennep</w:t>
-      </w:r>
-      <w:r>
-        <w:rPr>
-          <w:rFonts w:ascii="Times New Roman" w:hAnsi="Times New Roman" w:cs="Times New Roman"/>
-          <w:lang w:val="en-GB"/>
-        </w:rPr>
-        <w:t xml:space="preserve"> s</w:t>
+        <w:t xml:space="preserve">Van </w:t>
+      </w:r>
+      <w:proofErr w:type="spellStart"/>
+      <w:r>
+        <w:rPr>
+          <w:rFonts w:ascii="Times New Roman" w:hAnsi="Times New Roman" w:cs="Times New Roman"/>
+          <w:lang w:val="en-GB"/>
+        </w:rPr>
+        <w:t>Lennep</w:t>
+      </w:r>
+      <w:proofErr w:type="spellEnd"/>
+      <w:r>
+        <w:rPr>
+          <w:rFonts w:ascii="Times New Roman" w:hAnsi="Times New Roman" w:cs="Times New Roman"/>
+          <w:lang w:val="en-GB"/>
+        </w:rPr>
+        <w:t xml:space="preserve"> </w:t>
+      </w:r>
+      <w:r>
+        <w:rPr>
+          <w:rFonts w:ascii="Times New Roman" w:hAnsi="Times New Roman" w:cs="Times New Roman"/>
+          <w:lang w:val="en-GB"/>
+        </w:rPr>
+        <w:lastRenderedPageBreak/>
+        <w:t>s</w:t>
       </w:r>
       <w:r>
         <w:rPr>
@@ -1408,14 +1489,30 @@
           <w:rFonts w:ascii="Times New Roman" w:hAnsi="Times New Roman" w:cs="Times New Roman"/>
           <w:lang w:val="en-GB"/>
         </w:rPr>
-        <w:t>, Van Lennep’</w:t>
-      </w:r>
-      <w:r>
-        <w:rPr>
-          <w:rFonts w:ascii="Times New Roman" w:hAnsi="Times New Roman" w:cs="Times New Roman"/>
-          <w:lang w:val="en-GB"/>
-        </w:rPr>
-        <w:t xml:space="preserve">s duties included the </w:t>
+        <w:t xml:space="preserve">, Van </w:t>
+      </w:r>
+      <w:proofErr w:type="spellStart"/>
+      <w:r>
+        <w:rPr>
+          <w:rFonts w:ascii="Times New Roman" w:hAnsi="Times New Roman" w:cs="Times New Roman"/>
+          <w:lang w:val="en-GB"/>
+        </w:rPr>
+        <w:t>Lennep’</w:t>
+      </w:r>
+      <w:r>
+        <w:rPr>
+          <w:rFonts w:ascii="Times New Roman" w:hAnsi="Times New Roman" w:cs="Times New Roman"/>
+          <w:lang w:val="en-GB"/>
+        </w:rPr>
+        <w:t>s</w:t>
+      </w:r>
+      <w:proofErr w:type="spellEnd"/>
+      <w:r>
+        <w:rPr>
+          <w:rFonts w:ascii="Times New Roman" w:hAnsi="Times New Roman" w:cs="Times New Roman"/>
+          <w:lang w:val="en-GB"/>
+        </w:rPr>
+        <w:t xml:space="preserve"> duties included the </w:t>
       </w:r>
       <w:r>
         <w:rPr>
@@ -1514,7 +1611,7 @@
           <w:color w:val="262626"/>
           <w:lang w:val="en-GB"/>
         </w:rPr>
-        <w:t xml:space="preserve"> economists were a minority in finance ministries and Van Lennep’s law background was </w:t>
+        <w:t xml:space="preserve"> economists were a minority in finance ministries and Van Lennep’s law background was characteristic of a period during which, as </w:t>
       </w:r>
       <w:r>
         <w:rPr>
@@ -1522,17 +1619,18 @@
           <w:color w:val="262626"/>
           <w:lang w:val="en-GB"/>
         </w:rPr>
-        <w:lastRenderedPageBreak/>
-        <w:t xml:space="preserve">characteristic of a period during which, as </w:t>
-      </w:r>
+        <w:t xml:space="preserve">Van </w:t>
+      </w:r>
+      <w:proofErr w:type="spellStart"/>
       <w:r>
         <w:rPr>
           <w:rFonts w:ascii="Times New Roman" w:hAnsi="Times New Roman" w:cs="Times New Roman"/>
           <w:color w:val="262626"/>
           <w:lang w:val="en-GB"/>
         </w:rPr>
-        <w:t>Van Lennep</w:t>
-      </w:r>
+        <w:t>Lennep</w:t>
+      </w:r>
+      <w:proofErr w:type="spellEnd"/>
       <w:r>
         <w:rPr>
           <w:rFonts w:ascii="Times New Roman" w:hAnsi="Times New Roman" w:cs="Times New Roman"/>
@@ -1640,7 +1738,23 @@
           <w:rFonts w:ascii="Times New Roman" w:hAnsi="Times New Roman" w:cs="Times New Roman"/>
           <w:lang w:val="en-GB"/>
         </w:rPr>
-        <w:t xml:space="preserve"> Van Lennep was involved in efforts </w:t>
+        <w:t xml:space="preserve"> Van </w:t>
+      </w:r>
+      <w:proofErr w:type="spellStart"/>
+      <w:r>
+        <w:rPr>
+          <w:rFonts w:ascii="Times New Roman" w:hAnsi="Times New Roman" w:cs="Times New Roman"/>
+          <w:lang w:val="en-GB"/>
+        </w:rPr>
+        <w:t>Lennep</w:t>
+      </w:r>
+      <w:proofErr w:type="spellEnd"/>
+      <w:r>
+        <w:rPr>
+          <w:rFonts w:ascii="Times New Roman" w:hAnsi="Times New Roman" w:cs="Times New Roman"/>
+          <w:lang w:val="en-GB"/>
+        </w:rPr>
+        <w:t xml:space="preserve"> was involved in efforts </w:t>
       </w:r>
       <w:r>
         <w:rPr>
@@ -1815,8 +1929,17 @@
           <w:rFonts w:ascii="Times New Roman" w:hAnsi="Times New Roman" w:cs="Times New Roman"/>
           <w:lang w:val="en-GB"/>
         </w:rPr>
-        <w:t>Van Lennep</w:t>
-      </w:r>
+        <w:t xml:space="preserve">Van </w:t>
+      </w:r>
+      <w:proofErr w:type="spellStart"/>
+      <w:r>
+        <w:rPr>
+          <w:rFonts w:ascii="Times New Roman" w:hAnsi="Times New Roman" w:cs="Times New Roman"/>
+          <w:lang w:val="en-GB"/>
+        </w:rPr>
+        <w:t>Lennep</w:t>
+      </w:r>
+      <w:proofErr w:type="spellEnd"/>
       <w:r>
         <w:rPr>
           <w:rFonts w:ascii="Times New Roman" w:hAnsi="Times New Roman" w:cs="Times New Roman"/>
@@ -1892,7 +2015,23 @@
           <w:rFonts w:ascii="Times New Roman" w:hAnsi="Times New Roman" w:cs="Times New Roman"/>
           <w:lang w:val="en-GB"/>
         </w:rPr>
-        <w:t xml:space="preserve">established a new type of international cooperation: ‘regular meetings by a limited number of policy-making officials from EEC capital cities, discussing each others’ policies, problems, concerns and </w:t>
+        <w:t xml:space="preserve">established a new type of international cooperation: ‘regular meetings by a limited number of policy-making officials from EEC capital cities, discussing </w:t>
+      </w:r>
+      <w:proofErr w:type="spellStart"/>
+      <w:r>
+        <w:rPr>
+          <w:rFonts w:ascii="Times New Roman" w:hAnsi="Times New Roman" w:cs="Times New Roman"/>
+          <w:lang w:val="en-GB"/>
+        </w:rPr>
+        <w:t>each others’</w:t>
+      </w:r>
+      <w:proofErr w:type="spellEnd"/>
+      <w:r>
+        <w:rPr>
+          <w:rFonts w:ascii="Times New Roman" w:hAnsi="Times New Roman" w:cs="Times New Roman"/>
+          <w:lang w:val="en-GB"/>
+        </w:rPr>
+        <w:t xml:space="preserve"> policies, problems, concerns and </w:t>
       </w:r>
       <w:proofErr w:type="gramStart"/>
       <w:r>
@@ -1929,7 +2068,23 @@
           <w:rFonts w:ascii="Times New Roman" w:hAnsi="Times New Roman" w:cs="Times New Roman"/>
           <w:lang w:val="en-GB"/>
         </w:rPr>
-        <w:t xml:space="preserve">Van Lennep was a </w:t>
+        <w:t xml:space="preserve">Van </w:t>
+      </w:r>
+      <w:proofErr w:type="spellStart"/>
+      <w:r>
+        <w:rPr>
+          <w:rFonts w:ascii="Times New Roman" w:hAnsi="Times New Roman" w:cs="Times New Roman"/>
+          <w:lang w:val="en-GB"/>
+        </w:rPr>
+        <w:t>Lennep</w:t>
+      </w:r>
+      <w:proofErr w:type="spellEnd"/>
+      <w:r>
+        <w:rPr>
+          <w:rFonts w:ascii="Times New Roman" w:hAnsi="Times New Roman" w:cs="Times New Roman"/>
+          <w:lang w:val="en-GB"/>
+        </w:rPr>
+        <w:t xml:space="preserve"> was a </w:t>
       </w:r>
       <w:r>
         <w:rPr>
@@ -2097,8 +2252,17 @@
           <w:rFonts w:ascii="Times New Roman" w:hAnsi="Times New Roman" w:cs="Times New Roman"/>
           <w:lang w:val="en-GB"/>
         </w:rPr>
-        <w:t>Van Lennep</w:t>
-      </w:r>
+        <w:t xml:space="preserve">Van </w:t>
+      </w:r>
+      <w:proofErr w:type="spellStart"/>
+      <w:r>
+        <w:rPr>
+          <w:rFonts w:ascii="Times New Roman" w:hAnsi="Times New Roman" w:cs="Times New Roman"/>
+          <w:lang w:val="en-GB"/>
+        </w:rPr>
+        <w:t>Lennep</w:t>
+      </w:r>
+      <w:proofErr w:type="spellEnd"/>
       <w:r>
         <w:rPr>
           <w:rFonts w:ascii="Times New Roman" w:hAnsi="Times New Roman" w:cs="Times New Roman"/>
@@ -2223,7 +2387,23 @@
           <w:rFonts w:ascii="Times New Roman" w:hAnsi="Times New Roman" w:cs="Times New Roman"/>
           <w:lang w:val="en-GB"/>
         </w:rPr>
-        <w:t>an Lennep, a perennial insider of mul</w:t>
+        <w:t xml:space="preserve">an </w:t>
+      </w:r>
+      <w:proofErr w:type="spellStart"/>
+      <w:r>
+        <w:rPr>
+          <w:rFonts w:ascii="Times New Roman" w:hAnsi="Times New Roman" w:cs="Times New Roman"/>
+          <w:lang w:val="en-GB"/>
+        </w:rPr>
+        <w:t>Lennep</w:t>
+      </w:r>
+      <w:proofErr w:type="spellEnd"/>
+      <w:r>
+        <w:rPr>
+          <w:rFonts w:ascii="Times New Roman" w:hAnsi="Times New Roman" w:cs="Times New Roman"/>
+          <w:lang w:val="en-GB"/>
+        </w:rPr>
+        <w:t>, a perennial insider of mul</w:t>
       </w:r>
       <w:r>
         <w:rPr>
@@ -2337,7 +2517,23 @@
           <w:rFonts w:ascii="Times New Roman" w:hAnsi="Times New Roman" w:cs="Times New Roman"/>
           <w:lang w:val="en-GB"/>
         </w:rPr>
-        <w:t xml:space="preserve">an Lennep was </w:t>
+        <w:t xml:space="preserve">an </w:t>
+      </w:r>
+      <w:proofErr w:type="spellStart"/>
+      <w:r>
+        <w:rPr>
+          <w:rFonts w:ascii="Times New Roman" w:hAnsi="Times New Roman" w:cs="Times New Roman"/>
+          <w:lang w:val="en-GB"/>
+        </w:rPr>
+        <w:t>Lennep</w:t>
+      </w:r>
+      <w:proofErr w:type="spellEnd"/>
+      <w:r>
+        <w:rPr>
+          <w:rFonts w:ascii="Times New Roman" w:hAnsi="Times New Roman" w:cs="Times New Roman"/>
+          <w:lang w:val="en-GB"/>
+        </w:rPr>
+        <w:t xml:space="preserve"> was </w:t>
       </w:r>
       <w:r>
         <w:rPr>
@@ -2477,7 +2673,23 @@
           <w:rFonts w:ascii="Times New Roman" w:hAnsi="Times New Roman" w:cs="Times New Roman"/>
           <w:lang w:val="en-GB"/>
         </w:rPr>
-        <w:t xml:space="preserve">an Lennep did not come </w:t>
+        <w:t xml:space="preserve">an </w:t>
+      </w:r>
+      <w:proofErr w:type="spellStart"/>
+      <w:r>
+        <w:rPr>
+          <w:rFonts w:ascii="Times New Roman" w:hAnsi="Times New Roman" w:cs="Times New Roman"/>
+          <w:lang w:val="en-GB"/>
+        </w:rPr>
+        <w:t>Lennep</w:t>
+      </w:r>
+      <w:proofErr w:type="spellEnd"/>
+      <w:r>
+        <w:rPr>
+          <w:rFonts w:ascii="Times New Roman" w:hAnsi="Times New Roman" w:cs="Times New Roman"/>
+          <w:lang w:val="en-GB"/>
+        </w:rPr>
+        <w:t xml:space="preserve"> did not come </w:t>
       </w:r>
       <w:r>
         <w:rPr>
@@ -2764,8 +2976,17 @@
           <w:rFonts w:ascii="Times New Roman" w:hAnsi="Times New Roman" w:cs="Times New Roman"/>
           <w:lang w:val="en-GB"/>
         </w:rPr>
-        <w:t>Van Lennep</w:t>
-      </w:r>
+        <w:t xml:space="preserve">Van </w:t>
+      </w:r>
+      <w:proofErr w:type="spellStart"/>
+      <w:r>
+        <w:rPr>
+          <w:rFonts w:ascii="Times New Roman" w:hAnsi="Times New Roman" w:cs="Times New Roman"/>
+          <w:lang w:val="en-GB"/>
+        </w:rPr>
+        <w:t>Lennep</w:t>
+      </w:r>
+      <w:proofErr w:type="spellEnd"/>
       <w:r>
         <w:rPr>
           <w:rFonts w:ascii="Times New Roman" w:hAnsi="Times New Roman" w:cs="Times New Roman"/>
@@ -2869,7 +3090,23 @@
           <w:rFonts w:ascii="Times New Roman" w:hAnsi="Times New Roman" w:cs="Times New Roman"/>
           <w:lang w:val="en-GB"/>
         </w:rPr>
-        <w:t xml:space="preserve">an Lennep had already been designated as the natural candidate to succeed him, months in advance </w:t>
+        <w:t xml:space="preserve">an </w:t>
+      </w:r>
+      <w:proofErr w:type="spellStart"/>
+      <w:r>
+        <w:rPr>
+          <w:rFonts w:ascii="Times New Roman" w:hAnsi="Times New Roman" w:cs="Times New Roman"/>
+          <w:lang w:val="en-GB"/>
+        </w:rPr>
+        <w:t>Lennep</w:t>
+      </w:r>
+      <w:proofErr w:type="spellEnd"/>
+      <w:r>
+        <w:rPr>
+          <w:rFonts w:ascii="Times New Roman" w:hAnsi="Times New Roman" w:cs="Times New Roman"/>
+          <w:lang w:val="en-GB"/>
+        </w:rPr>
+        <w:t xml:space="preserve"> had already been designated as the natural candidate to succeed him, months in advance </w:t>
       </w:r>
       <w:r>
         <w:rPr>
@@ -2934,7 +3171,15 @@
           <w:rFonts w:ascii="Times New Roman" w:hAnsi="Times New Roman" w:cs="Times New Roman"/>
           <w:lang w:val="en-GB"/>
         </w:rPr>
-        <w:t xml:space="preserve"> also opened the l</w:t>
+        <w:t xml:space="preserve"> </w:t>
+      </w:r>
+      <w:r>
+        <w:rPr>
+          <w:rFonts w:ascii="Times New Roman" w:hAnsi="Times New Roman" w:cs="Times New Roman"/>
+          <w:lang w:val="en-GB"/>
+        </w:rPr>
+        <w:lastRenderedPageBreak/>
+        <w:t>also opened the l</w:t>
       </w:r>
       <w:r>
         <w:rPr>
@@ -2976,7 +3221,23 @@
           <w:rFonts w:ascii="Times New Roman" w:hAnsi="Times New Roman" w:cs="Times New Roman"/>
           <w:lang w:val="en-GB"/>
         </w:rPr>
-        <w:t>an Lennep belonged to a quartet of prominent Dutch officials</w:t>
+        <w:t xml:space="preserve">an </w:t>
+      </w:r>
+      <w:proofErr w:type="spellStart"/>
+      <w:r>
+        <w:rPr>
+          <w:rFonts w:ascii="Times New Roman" w:hAnsi="Times New Roman" w:cs="Times New Roman"/>
+          <w:lang w:val="en-GB"/>
+        </w:rPr>
+        <w:t>Lennep</w:t>
+      </w:r>
+      <w:proofErr w:type="spellEnd"/>
+      <w:r>
+        <w:rPr>
+          <w:rFonts w:ascii="Times New Roman" w:hAnsi="Times New Roman" w:cs="Times New Roman"/>
+          <w:lang w:val="en-GB"/>
+        </w:rPr>
+        <w:t xml:space="preserve"> belonged to a quartet of prominent Dutch officials</w:t>
       </w:r>
       <w:r>
         <w:rPr>
@@ -3109,7 +3370,23 @@
           <w:rFonts w:ascii="Times New Roman" w:hAnsi="Times New Roman" w:cs="Times New Roman"/>
           <w:lang w:val="en-GB"/>
         </w:rPr>
-        <w:t xml:space="preserve">an Lennep faced </w:t>
+        <w:t xml:space="preserve">an </w:t>
+      </w:r>
+      <w:proofErr w:type="spellStart"/>
+      <w:r>
+        <w:rPr>
+          <w:rFonts w:ascii="Times New Roman" w:hAnsi="Times New Roman" w:cs="Times New Roman"/>
+          <w:lang w:val="en-GB"/>
+        </w:rPr>
+        <w:t>Lennep</w:t>
+      </w:r>
+      <w:proofErr w:type="spellEnd"/>
+      <w:r>
+        <w:rPr>
+          <w:rFonts w:ascii="Times New Roman" w:hAnsi="Times New Roman" w:cs="Times New Roman"/>
+          <w:lang w:val="en-GB"/>
+        </w:rPr>
+        <w:t xml:space="preserve"> faced </w:t>
       </w:r>
       <w:r>
         <w:rPr>
@@ -3207,7 +3484,23 @@
           <w:rFonts w:ascii="Times New Roman" w:hAnsi="Times New Roman" w:cs="Times New Roman"/>
           <w:lang w:val="en-GB"/>
         </w:rPr>
-        <w:t xml:space="preserve">. Van Lennep </w:t>
+        <w:t xml:space="preserve">. Van </w:t>
+      </w:r>
+      <w:proofErr w:type="spellStart"/>
+      <w:r>
+        <w:rPr>
+          <w:rFonts w:ascii="Times New Roman" w:hAnsi="Times New Roman" w:cs="Times New Roman"/>
+          <w:lang w:val="en-GB"/>
+        </w:rPr>
+        <w:t>Lennep</w:t>
+      </w:r>
+      <w:proofErr w:type="spellEnd"/>
+      <w:r>
+        <w:rPr>
+          <w:rFonts w:ascii="Times New Roman" w:hAnsi="Times New Roman" w:cs="Times New Roman"/>
+          <w:lang w:val="en-GB"/>
+        </w:rPr>
+        <w:t xml:space="preserve"> </w:t>
       </w:r>
       <w:r>
         <w:rPr>
@@ -3221,15 +3514,7 @@
           <w:rFonts w:ascii="Times New Roman" w:hAnsi="Times New Roman" w:cs="Times New Roman"/>
           <w:lang w:val="en-GB"/>
         </w:rPr>
-        <w:t xml:space="preserve"> to make the OECD the central forum </w:t>
-      </w:r>
-      <w:r>
-        <w:rPr>
-          <w:rFonts w:ascii="Times New Roman" w:hAnsi="Times New Roman" w:cs="Times New Roman"/>
-          <w:lang w:val="en-GB"/>
-        </w:rPr>
-        <w:lastRenderedPageBreak/>
-        <w:t xml:space="preserve">where Western countries would cooperate to cope with monetary, economic and </w:t>
+        <w:t xml:space="preserve"> to make the OECD the central forum where Western countries would cooperate to cope with monetary, economic and </w:t>
       </w:r>
       <w:r>
         <w:rPr>
@@ -3726,7 +4011,23 @@
           <w:rFonts w:ascii="Times New Roman" w:hAnsi="Times New Roman" w:cs="Times New Roman"/>
           <w:lang w:val="en-GB"/>
         </w:rPr>
-        <w:t xml:space="preserve">an Lennep was </w:t>
+        <w:t xml:space="preserve">an </w:t>
+      </w:r>
+      <w:proofErr w:type="spellStart"/>
+      <w:r>
+        <w:rPr>
+          <w:rFonts w:ascii="Times New Roman" w:hAnsi="Times New Roman" w:cs="Times New Roman"/>
+          <w:lang w:val="en-GB"/>
+        </w:rPr>
+        <w:t>Lennep</w:t>
+      </w:r>
+      <w:proofErr w:type="spellEnd"/>
+      <w:r>
+        <w:rPr>
+          <w:rFonts w:ascii="Times New Roman" w:hAnsi="Times New Roman" w:cs="Times New Roman"/>
+          <w:lang w:val="en-GB"/>
+        </w:rPr>
+        <w:t xml:space="preserve"> was </w:t>
       </w:r>
       <w:r>
         <w:rPr>
@@ -3964,7 +4265,23 @@
           <w:rFonts w:ascii="Times New Roman" w:hAnsi="Times New Roman" w:cs="Times New Roman"/>
           <w:lang w:val="en-GB"/>
         </w:rPr>
-        <w:t xml:space="preserve">an Lennep mobilized </w:t>
+        <w:t xml:space="preserve">an </w:t>
+      </w:r>
+      <w:proofErr w:type="spellStart"/>
+      <w:r>
+        <w:rPr>
+          <w:rFonts w:ascii="Times New Roman" w:hAnsi="Times New Roman" w:cs="Times New Roman"/>
+          <w:lang w:val="en-GB"/>
+        </w:rPr>
+        <w:t>Lennep</w:t>
+      </w:r>
+      <w:proofErr w:type="spellEnd"/>
+      <w:r>
+        <w:rPr>
+          <w:rFonts w:ascii="Times New Roman" w:hAnsi="Times New Roman" w:cs="Times New Roman"/>
+          <w:lang w:val="en-GB"/>
+        </w:rPr>
+        <w:t xml:space="preserve"> mobilized </w:t>
       </w:r>
       <w:r>
         <w:rPr>
@@ -4174,7 +4491,23 @@
           <w:rFonts w:ascii="Times New Roman" w:hAnsi="Times New Roman" w:cs="Times New Roman"/>
           <w:lang w:val="en-GB"/>
         </w:rPr>
-        <w:t xml:space="preserve">an Lennep </w:t>
+        <w:t xml:space="preserve">an </w:t>
+      </w:r>
+      <w:proofErr w:type="spellStart"/>
+      <w:r>
+        <w:rPr>
+          <w:rFonts w:ascii="Times New Roman" w:hAnsi="Times New Roman" w:cs="Times New Roman"/>
+          <w:lang w:val="en-GB"/>
+        </w:rPr>
+        <w:t>Lennep</w:t>
+      </w:r>
+      <w:proofErr w:type="spellEnd"/>
+      <w:r>
+        <w:rPr>
+          <w:rFonts w:ascii="Times New Roman" w:hAnsi="Times New Roman" w:cs="Times New Roman"/>
+          <w:lang w:val="en-GB"/>
+        </w:rPr>
+        <w:t xml:space="preserve"> </w:t>
       </w:r>
       <w:r>
         <w:rPr>
@@ -4223,7 +4556,23 @@
           <w:rFonts w:ascii="Times New Roman" w:hAnsi="Times New Roman" w:cs="Times New Roman"/>
           <w:lang w:val="en-GB"/>
         </w:rPr>
-        <w:t xml:space="preserve">Van Lennep </w:t>
+        <w:t xml:space="preserve">Van </w:t>
+      </w:r>
+      <w:proofErr w:type="spellStart"/>
+      <w:r>
+        <w:rPr>
+          <w:rFonts w:ascii="Times New Roman" w:hAnsi="Times New Roman" w:cs="Times New Roman"/>
+          <w:lang w:val="en-GB"/>
+        </w:rPr>
+        <w:t>Lennep</w:t>
+      </w:r>
+      <w:proofErr w:type="spellEnd"/>
+      <w:r>
+        <w:rPr>
+          <w:rFonts w:ascii="Times New Roman" w:hAnsi="Times New Roman" w:cs="Times New Roman"/>
+          <w:lang w:val="en-GB"/>
+        </w:rPr>
+        <w:t xml:space="preserve"> </w:t>
       </w:r>
       <w:r>
         <w:rPr>
@@ -4316,12 +4665,21 @@
         </w:rPr>
         <w:t xml:space="preserve">an </w:t>
       </w:r>
-      <w:r>
-        <w:rPr>
-          <w:rFonts w:ascii="Times New Roman" w:hAnsi="Times New Roman" w:cs="Times New Roman"/>
-          <w:lang w:val="en-GB"/>
-        </w:rPr>
-        <w:t>Lennep established an economic Bureau</w:t>
+      <w:proofErr w:type="spellStart"/>
+      <w:r>
+        <w:rPr>
+          <w:rFonts w:ascii="Times New Roman" w:hAnsi="Times New Roman" w:cs="Times New Roman"/>
+          <w:lang w:val="en-GB"/>
+        </w:rPr>
+        <w:t>Lennep</w:t>
+      </w:r>
+      <w:proofErr w:type="spellEnd"/>
+      <w:r>
+        <w:rPr>
+          <w:rFonts w:ascii="Times New Roman" w:hAnsi="Times New Roman" w:cs="Times New Roman"/>
+          <w:lang w:val="en-GB"/>
+        </w:rPr>
+        <w:t xml:space="preserve"> established an economic Bureau</w:t>
       </w:r>
       <w:r>
         <w:rPr>
@@ -4540,7 +4898,23 @@
           <w:rFonts w:ascii="Times New Roman" w:hAnsi="Times New Roman" w:cs="Times New Roman"/>
           <w:lang w:val="en-GB"/>
         </w:rPr>
-        <w:t xml:space="preserve">an Lennep was excluded from the final negotiations that led to the </w:t>
+        <w:t xml:space="preserve">an </w:t>
+      </w:r>
+      <w:proofErr w:type="spellStart"/>
+      <w:r>
+        <w:rPr>
+          <w:rFonts w:ascii="Times New Roman" w:hAnsi="Times New Roman" w:cs="Times New Roman"/>
+          <w:lang w:val="en-GB"/>
+        </w:rPr>
+        <w:t>Lennep</w:t>
+      </w:r>
+      <w:proofErr w:type="spellEnd"/>
+      <w:r>
+        <w:rPr>
+          <w:rFonts w:ascii="Times New Roman" w:hAnsi="Times New Roman" w:cs="Times New Roman"/>
+          <w:lang w:val="en-GB"/>
+        </w:rPr>
+        <w:t xml:space="preserve"> was excluded from the final negotiations that led to the </w:t>
       </w:r>
       <w:r>
         <w:rPr>
@@ -4617,7 +4991,23 @@
           <w:rFonts w:ascii="Times New Roman" w:hAnsi="Times New Roman" w:cs="Times New Roman"/>
           <w:lang w:val="en-GB"/>
         </w:rPr>
-        <w:t>an Lennep hoped that</w:t>
+        <w:t xml:space="preserve">an </w:t>
+      </w:r>
+      <w:proofErr w:type="spellStart"/>
+      <w:r>
+        <w:rPr>
+          <w:rFonts w:ascii="Times New Roman" w:hAnsi="Times New Roman" w:cs="Times New Roman"/>
+          <w:lang w:val="en-GB"/>
+        </w:rPr>
+        <w:t>Lennep</w:t>
+      </w:r>
+      <w:proofErr w:type="spellEnd"/>
+      <w:r>
+        <w:rPr>
+          <w:rFonts w:ascii="Times New Roman" w:hAnsi="Times New Roman" w:cs="Times New Roman"/>
+          <w:lang w:val="en-GB"/>
+        </w:rPr>
+        <w:t xml:space="preserve"> hoped that</w:t>
       </w:r>
       <w:r>
         <w:rPr>
@@ -4631,23 +5021,7 @@
           <w:rFonts w:ascii="Times New Roman" w:hAnsi="Times New Roman" w:cs="Times New Roman"/>
           <w:lang w:val="en-GB"/>
         </w:rPr>
-        <w:t xml:space="preserve"> far-reaching monetary and trade negotiations </w:t>
-      </w:r>
-      <w:proofErr w:type="gramStart"/>
-      <w:r>
-        <w:rPr>
-          <w:rFonts w:ascii="Times New Roman" w:hAnsi="Times New Roman" w:cs="Times New Roman"/>
-          <w:lang w:val="en-GB"/>
-        </w:rPr>
-        <w:t>in order to</w:t>
-      </w:r>
-      <w:proofErr w:type="gramEnd"/>
-      <w:r>
-        <w:rPr>
-          <w:rFonts w:ascii="Times New Roman" w:hAnsi="Times New Roman" w:cs="Times New Roman"/>
-          <w:lang w:val="en-GB"/>
-        </w:rPr>
-        <w:t xml:space="preserve"> stabilize the in</w:t>
+        <w:t xml:space="preserve"> far-reaching monetary and trade negotiations in order to stabilize the in</w:t>
       </w:r>
       <w:r>
         <w:rPr>
@@ -4948,7 +5322,23 @@
           <w:rFonts w:ascii="Times New Roman" w:hAnsi="Times New Roman" w:cs="Times New Roman"/>
           <w:lang w:val="en-GB"/>
         </w:rPr>
-        <w:t xml:space="preserve">an Lennep’s </w:t>
+        <w:t xml:space="preserve">an </w:t>
+      </w:r>
+      <w:proofErr w:type="spellStart"/>
+      <w:r>
+        <w:rPr>
+          <w:rFonts w:ascii="Times New Roman" w:hAnsi="Times New Roman" w:cs="Times New Roman"/>
+          <w:lang w:val="en-GB"/>
+        </w:rPr>
+        <w:t>Lennep’s</w:t>
+      </w:r>
+      <w:proofErr w:type="spellEnd"/>
+      <w:r>
+        <w:rPr>
+          <w:rFonts w:ascii="Times New Roman" w:hAnsi="Times New Roman" w:cs="Times New Roman"/>
+          <w:lang w:val="en-GB"/>
+        </w:rPr>
+        <w:t xml:space="preserve"> </w:t>
       </w:r>
       <w:r>
         <w:rPr>
@@ -4990,8 +5380,17 @@
           <w:rFonts w:ascii="Times New Roman" w:hAnsi="Times New Roman" w:cs="Times New Roman"/>
           <w:lang w:val="en-GB"/>
         </w:rPr>
-        <w:t>Van Lennep</w:t>
-      </w:r>
+        <w:t xml:space="preserve">Van </w:t>
+      </w:r>
+      <w:proofErr w:type="spellStart"/>
+      <w:r>
+        <w:rPr>
+          <w:rFonts w:ascii="Times New Roman" w:hAnsi="Times New Roman" w:cs="Times New Roman"/>
+          <w:lang w:val="en-GB"/>
+        </w:rPr>
+        <w:t>Lennep</w:t>
+      </w:r>
+      <w:proofErr w:type="spellEnd"/>
       <w:r>
         <w:rPr>
           <w:rFonts w:ascii="Times New Roman" w:hAnsi="Times New Roman" w:cs="Times New Roman"/>
@@ -5130,6 +5529,7 @@
           <w:rFonts w:ascii="Times New Roman" w:hAnsi="Times New Roman" w:cs="Times New Roman"/>
           <w:lang w:val="en-GB"/>
         </w:rPr>
+        <w:lastRenderedPageBreak/>
         <w:t>preferred instead to</w:t>
       </w:r>
       <w:r>
@@ -5529,15 +5929,7 @@
           <w:rFonts w:ascii="Times New Roman" w:hAnsi="Times New Roman" w:cs="Times New Roman"/>
           <w:lang w:val="en-GB"/>
         </w:rPr>
-        <w:t xml:space="preserve">In his editorials in the </w:t>
-      </w:r>
-      <w:r>
-        <w:rPr>
-          <w:rFonts w:ascii="Times New Roman" w:hAnsi="Times New Roman" w:cs="Times New Roman"/>
-          <w:lang w:val="en-GB"/>
-        </w:rPr>
-        <w:lastRenderedPageBreak/>
-        <w:t xml:space="preserve">monthly </w:t>
+        <w:t xml:space="preserve">In his editorials in the monthly </w:t>
       </w:r>
       <w:r>
         <w:rPr>
@@ -5559,7 +5951,23 @@
           <w:rFonts w:ascii="Times New Roman" w:hAnsi="Times New Roman" w:cs="Times New Roman"/>
           <w:lang w:val="en-GB"/>
         </w:rPr>
-        <w:t xml:space="preserve">an Lennep called the OECD the </w:t>
+        <w:t xml:space="preserve">an </w:t>
+      </w:r>
+      <w:proofErr w:type="spellStart"/>
+      <w:r>
+        <w:rPr>
+          <w:rFonts w:ascii="Times New Roman" w:hAnsi="Times New Roman" w:cs="Times New Roman"/>
+          <w:lang w:val="en-GB"/>
+        </w:rPr>
+        <w:t>Lennep</w:t>
+      </w:r>
+      <w:proofErr w:type="spellEnd"/>
+      <w:r>
+        <w:rPr>
+          <w:rFonts w:ascii="Times New Roman" w:hAnsi="Times New Roman" w:cs="Times New Roman"/>
+          <w:lang w:val="en-GB"/>
+        </w:rPr>
+        <w:t xml:space="preserve"> called the OECD the </w:t>
       </w:r>
       <w:r>
         <w:rPr>
@@ -5706,7 +6114,23 @@
           <w:rFonts w:ascii="Times New Roman" w:hAnsi="Times New Roman" w:cs="Times New Roman"/>
           <w:lang w:val="en-GB"/>
         </w:rPr>
-        <w:t xml:space="preserve">an Lennep </w:t>
+        <w:t xml:space="preserve">an </w:t>
+      </w:r>
+      <w:proofErr w:type="spellStart"/>
+      <w:r>
+        <w:rPr>
+          <w:rFonts w:ascii="Times New Roman" w:hAnsi="Times New Roman" w:cs="Times New Roman"/>
+          <w:lang w:val="en-GB"/>
+        </w:rPr>
+        <w:t>Lennep</w:t>
+      </w:r>
+      <w:proofErr w:type="spellEnd"/>
+      <w:r>
+        <w:rPr>
+          <w:rFonts w:ascii="Times New Roman" w:hAnsi="Times New Roman" w:cs="Times New Roman"/>
+          <w:lang w:val="en-GB"/>
+        </w:rPr>
+        <w:t xml:space="preserve"> </w:t>
       </w:r>
       <w:r>
         <w:rPr>
@@ -5902,14 +6326,30 @@
           <w:rFonts w:ascii="Times New Roman" w:hAnsi="Times New Roman" w:cs="Times New Roman"/>
           <w:lang w:val="en-GB"/>
         </w:rPr>
-        <w:t>an L</w:t>
-      </w:r>
-      <w:r>
-        <w:rPr>
-          <w:rFonts w:ascii="Times New Roman" w:hAnsi="Times New Roman" w:cs="Times New Roman"/>
-          <w:lang w:val="en-GB"/>
-        </w:rPr>
-        <w:t xml:space="preserve">ennep was kept out of </w:t>
+        <w:t xml:space="preserve">an </w:t>
+      </w:r>
+      <w:proofErr w:type="spellStart"/>
+      <w:r>
+        <w:rPr>
+          <w:rFonts w:ascii="Times New Roman" w:hAnsi="Times New Roman" w:cs="Times New Roman"/>
+          <w:lang w:val="en-GB"/>
+        </w:rPr>
+        <w:t>L</w:t>
+      </w:r>
+      <w:r>
+        <w:rPr>
+          <w:rFonts w:ascii="Times New Roman" w:hAnsi="Times New Roman" w:cs="Times New Roman"/>
+          <w:lang w:val="en-GB"/>
+        </w:rPr>
+        <w:t>ennep</w:t>
+      </w:r>
+      <w:proofErr w:type="spellEnd"/>
+      <w:r>
+        <w:rPr>
+          <w:rFonts w:ascii="Times New Roman" w:hAnsi="Times New Roman" w:cs="Times New Roman"/>
+          <w:lang w:val="en-GB"/>
+        </w:rPr>
+        <w:t xml:space="preserve"> was kept out of </w:t>
       </w:r>
       <w:r>
         <w:rPr>
@@ -6191,14 +6631,30 @@
           <w:rFonts w:ascii="Times New Roman" w:hAnsi="Times New Roman" w:cs="Times New Roman"/>
           <w:lang w:val="en-GB"/>
         </w:rPr>
-        <w:t>an Lennep’</w:t>
-      </w:r>
-      <w:r>
-        <w:rPr>
-          <w:rFonts w:ascii="Times New Roman" w:hAnsi="Times New Roman" w:cs="Times New Roman"/>
-          <w:lang w:val="en-GB"/>
-        </w:rPr>
-        <w:t xml:space="preserve">s more successful </w:t>
+        <w:t xml:space="preserve">an </w:t>
+      </w:r>
+      <w:proofErr w:type="spellStart"/>
+      <w:r>
+        <w:rPr>
+          <w:rFonts w:ascii="Times New Roman" w:hAnsi="Times New Roman" w:cs="Times New Roman"/>
+          <w:lang w:val="en-GB"/>
+        </w:rPr>
+        <w:t>Lennep’</w:t>
+      </w:r>
+      <w:r>
+        <w:rPr>
+          <w:rFonts w:ascii="Times New Roman" w:hAnsi="Times New Roman" w:cs="Times New Roman"/>
+          <w:lang w:val="en-GB"/>
+        </w:rPr>
+        <w:t>s</w:t>
+      </w:r>
+      <w:proofErr w:type="spellEnd"/>
+      <w:r>
+        <w:rPr>
+          <w:rFonts w:ascii="Times New Roman" w:hAnsi="Times New Roman" w:cs="Times New Roman"/>
+          <w:lang w:val="en-GB"/>
+        </w:rPr>
+        <w:t xml:space="preserve"> more successful </w:t>
       </w:r>
       <w:r>
         <w:rPr>
@@ -6261,7 +6717,23 @@
           <w:rFonts w:ascii="Times New Roman" w:hAnsi="Times New Roman" w:cs="Times New Roman"/>
           <w:lang w:val="en-GB"/>
         </w:rPr>
-        <w:t xml:space="preserve">an Lennep </w:t>
+        <w:t xml:space="preserve">an </w:t>
+      </w:r>
+      <w:proofErr w:type="spellStart"/>
+      <w:r>
+        <w:rPr>
+          <w:rFonts w:ascii="Times New Roman" w:hAnsi="Times New Roman" w:cs="Times New Roman"/>
+          <w:lang w:val="en-GB"/>
+        </w:rPr>
+        <w:t>Lennep</w:t>
+      </w:r>
+      <w:proofErr w:type="spellEnd"/>
+      <w:r>
+        <w:rPr>
+          <w:rFonts w:ascii="Times New Roman" w:hAnsi="Times New Roman" w:cs="Times New Roman"/>
+          <w:lang w:val="en-GB"/>
+        </w:rPr>
+        <w:t xml:space="preserve"> </w:t>
       </w:r>
       <w:r>
         <w:rPr>
@@ -6640,7 +7112,23 @@
           <w:rFonts w:ascii="Times New Roman" w:hAnsi="Times New Roman" w:cs="Times New Roman"/>
           <w:lang w:val="en-GB"/>
         </w:rPr>
-        <w:t>an Lennep fought a</w:t>
+        <w:t xml:space="preserve">an </w:t>
+      </w:r>
+      <w:proofErr w:type="spellStart"/>
+      <w:r>
+        <w:rPr>
+          <w:rFonts w:ascii="Times New Roman" w:hAnsi="Times New Roman" w:cs="Times New Roman"/>
+          <w:lang w:val="en-GB"/>
+        </w:rPr>
+        <w:t>Lennep</w:t>
+      </w:r>
+      <w:proofErr w:type="spellEnd"/>
+      <w:r>
+        <w:rPr>
+          <w:rFonts w:ascii="Times New Roman" w:hAnsi="Times New Roman" w:cs="Times New Roman"/>
+          <w:lang w:val="en-GB"/>
+        </w:rPr>
+        <w:t xml:space="preserve"> fought a</w:t>
       </w:r>
       <w:r>
         <w:rPr>
@@ -7702,7 +8190,23 @@
           <w:rFonts w:ascii="Times New Roman" w:hAnsi="Times New Roman" w:cs="Times New Roman"/>
           <w:lang w:val="en-GB"/>
         </w:rPr>
-        <w:t xml:space="preserve">an Lennep strove </w:t>
+        <w:t xml:space="preserve">an </w:t>
+      </w:r>
+      <w:proofErr w:type="spellStart"/>
+      <w:r>
+        <w:rPr>
+          <w:rFonts w:ascii="Times New Roman" w:hAnsi="Times New Roman" w:cs="Times New Roman"/>
+          <w:lang w:val="en-GB"/>
+        </w:rPr>
+        <w:t>Lennep</w:t>
+      </w:r>
+      <w:proofErr w:type="spellEnd"/>
+      <w:r>
+        <w:rPr>
+          <w:rFonts w:ascii="Times New Roman" w:hAnsi="Times New Roman" w:cs="Times New Roman"/>
+          <w:lang w:val="en-GB"/>
+        </w:rPr>
+        <w:t xml:space="preserve"> strove </w:t>
       </w:r>
       <w:r>
         <w:rPr>
@@ -7779,7 +8283,15 @@
           <w:rFonts w:ascii="Times New Roman" w:hAnsi="Times New Roman" w:cs="Times New Roman"/>
           <w:lang w:val="en-GB"/>
         </w:rPr>
-        <w:t xml:space="preserve"> contributed to the increasing shift away from Keynesian short-term fine-tuning of demand at the national level towards a medium-term demand management base</w:t>
+        <w:t xml:space="preserve"> contributed </w:t>
+      </w:r>
+      <w:r>
+        <w:rPr>
+          <w:rFonts w:ascii="Times New Roman" w:hAnsi="Times New Roman" w:cs="Times New Roman"/>
+          <w:lang w:val="en-GB"/>
+        </w:rPr>
+        <w:lastRenderedPageBreak/>
+        <w:t>to the increasing shift away from Keynesian short-term fine-tuning of demand at the national level towards a medium-term demand management base</w:t>
       </w:r>
       <w:r>
         <w:rPr>
@@ -7870,7 +8382,23 @@
           <w:rFonts w:ascii="Times New Roman" w:hAnsi="Times New Roman" w:cs="Times New Roman"/>
           <w:lang w:val="en-GB"/>
         </w:rPr>
-        <w:t xml:space="preserve">an Lennep as an ally </w:t>
+        <w:t xml:space="preserve">an </w:t>
+      </w:r>
+      <w:proofErr w:type="spellStart"/>
+      <w:r>
+        <w:rPr>
+          <w:rFonts w:ascii="Times New Roman" w:hAnsi="Times New Roman" w:cs="Times New Roman"/>
+          <w:lang w:val="en-GB"/>
+        </w:rPr>
+        <w:t>Lennep</w:t>
+      </w:r>
+      <w:proofErr w:type="spellEnd"/>
+      <w:r>
+        <w:rPr>
+          <w:rFonts w:ascii="Times New Roman" w:hAnsi="Times New Roman" w:cs="Times New Roman"/>
+          <w:lang w:val="en-GB"/>
+        </w:rPr>
+        <w:t xml:space="preserve"> as an ally </w:t>
       </w:r>
       <w:r>
         <w:rPr>
@@ -7954,8 +8482,17 @@
           <w:rFonts w:ascii="Times New Roman" w:hAnsi="Times New Roman" w:cs="Times New Roman"/>
           <w:lang w:val="en-GB"/>
         </w:rPr>
-        <w:t>Van Lennep</w:t>
-      </w:r>
+        <w:t xml:space="preserve">Van </w:t>
+      </w:r>
+      <w:proofErr w:type="spellStart"/>
+      <w:r>
+        <w:rPr>
+          <w:rFonts w:ascii="Times New Roman" w:hAnsi="Times New Roman" w:cs="Times New Roman"/>
+          <w:lang w:val="en-GB"/>
+        </w:rPr>
+        <w:t>Lennep</w:t>
+      </w:r>
+      <w:proofErr w:type="spellEnd"/>
       <w:r>
         <w:rPr>
           <w:rFonts w:ascii="Times New Roman" w:hAnsi="Times New Roman" w:cs="Times New Roman"/>
@@ -8045,15 +8582,7 @@
           <w:rFonts w:ascii="Times New Roman" w:hAnsi="Times New Roman" w:cs="Times New Roman"/>
           <w:lang w:val="en-GB"/>
         </w:rPr>
-        <w:t xml:space="preserve">In </w:t>
-      </w:r>
-      <w:r>
-        <w:rPr>
-          <w:rFonts w:ascii="Times New Roman" w:hAnsi="Times New Roman" w:cs="Times New Roman"/>
-          <w:lang w:val="en-GB"/>
-        </w:rPr>
-        <w:lastRenderedPageBreak/>
-        <w:t>parallel, the OECD star</w:t>
+        <w:t>In parallel, the OECD star</w:t>
       </w:r>
       <w:r>
         <w:rPr>
@@ -8426,7 +8955,23 @@
           <w:rFonts w:ascii="Times New Roman" w:hAnsi="Times New Roman" w:cs="Times New Roman"/>
           <w:lang w:val="en-GB"/>
         </w:rPr>
-        <w:t xml:space="preserve">an Lennep was re-elected for a </w:t>
+        <w:t xml:space="preserve">an </w:t>
+      </w:r>
+      <w:proofErr w:type="spellStart"/>
+      <w:r>
+        <w:rPr>
+          <w:rFonts w:ascii="Times New Roman" w:hAnsi="Times New Roman" w:cs="Times New Roman"/>
+          <w:lang w:val="en-GB"/>
+        </w:rPr>
+        <w:t>Lennep</w:t>
+      </w:r>
+      <w:proofErr w:type="spellEnd"/>
+      <w:r>
+        <w:rPr>
+          <w:rFonts w:ascii="Times New Roman" w:hAnsi="Times New Roman" w:cs="Times New Roman"/>
+          <w:lang w:val="en-GB"/>
+        </w:rPr>
+        <w:t xml:space="preserve"> was re-elected for a </w:t>
       </w:r>
       <w:r>
         <w:rPr>
@@ -8496,7 +9041,23 @@
           <w:rFonts w:ascii="Times New Roman" w:hAnsi="Times New Roman" w:cs="Times New Roman"/>
           <w:lang w:val="en-GB"/>
         </w:rPr>
-        <w:t xml:space="preserve">an Lennep was supposed to retire </w:t>
+        <w:t xml:space="preserve">an </w:t>
+      </w:r>
+      <w:proofErr w:type="spellStart"/>
+      <w:r>
+        <w:rPr>
+          <w:rFonts w:ascii="Times New Roman" w:hAnsi="Times New Roman" w:cs="Times New Roman"/>
+          <w:lang w:val="en-GB"/>
+        </w:rPr>
+        <w:t>Lennep</w:t>
+      </w:r>
+      <w:proofErr w:type="spellEnd"/>
+      <w:r>
+        <w:rPr>
+          <w:rFonts w:ascii="Times New Roman" w:hAnsi="Times New Roman" w:cs="Times New Roman"/>
+          <w:lang w:val="en-GB"/>
+        </w:rPr>
+        <w:t xml:space="preserve"> was supposed to retire </w:t>
       </w:r>
       <w:r>
         <w:rPr>
@@ -8608,7 +9169,23 @@
           <w:rFonts w:ascii="Times New Roman" w:hAnsi="Times New Roman" w:cs="Times New Roman"/>
           <w:lang w:val="en-GB"/>
         </w:rPr>
-        <w:t xml:space="preserve"> Van Lennep continued </w:t>
+        <w:t xml:space="preserve"> Van </w:t>
+      </w:r>
+      <w:proofErr w:type="spellStart"/>
+      <w:r>
+        <w:rPr>
+          <w:rFonts w:ascii="Times New Roman" w:hAnsi="Times New Roman" w:cs="Times New Roman"/>
+          <w:lang w:val="en-GB"/>
+        </w:rPr>
+        <w:t>Lennep</w:t>
+      </w:r>
+      <w:proofErr w:type="spellEnd"/>
+      <w:r>
+        <w:rPr>
+          <w:rFonts w:ascii="Times New Roman" w:hAnsi="Times New Roman" w:cs="Times New Roman"/>
+          <w:lang w:val="en-GB"/>
+        </w:rPr>
+        <w:t xml:space="preserve"> continued </w:t>
       </w:r>
       <w:r>
         <w:rPr>
@@ -8937,7 +9514,23 @@
           <w:rFonts w:ascii="Times New Roman" w:hAnsi="Times New Roman" w:cs="Times New Roman"/>
           <w:lang w:val="en-GB"/>
         </w:rPr>
-        <w:t xml:space="preserve"> Lennep </w:t>
+        <w:t xml:space="preserve"> </w:t>
+      </w:r>
+      <w:proofErr w:type="spellStart"/>
+      <w:r>
+        <w:rPr>
+          <w:rFonts w:ascii="Times New Roman" w:hAnsi="Times New Roman" w:cs="Times New Roman"/>
+          <w:lang w:val="en-GB"/>
+        </w:rPr>
+        <w:t>Lennep</w:t>
+      </w:r>
+      <w:proofErr w:type="spellEnd"/>
+      <w:r>
+        <w:rPr>
+          <w:rFonts w:ascii="Times New Roman" w:hAnsi="Times New Roman" w:cs="Times New Roman"/>
+          <w:lang w:val="en-GB"/>
+        </w:rPr>
+        <w:t xml:space="preserve"> </w:t>
       </w:r>
       <w:r>
         <w:rPr>
@@ -9084,8 +9677,17 @@
           <w:rFonts w:ascii="Times New Roman" w:hAnsi="Times New Roman" w:cs="Times New Roman"/>
           <w:lang w:val="en-GB"/>
         </w:rPr>
-        <w:t>an Lennep</w:t>
-      </w:r>
+        <w:t xml:space="preserve">an </w:t>
+      </w:r>
+      <w:proofErr w:type="spellStart"/>
+      <w:r>
+        <w:rPr>
+          <w:rFonts w:ascii="Times New Roman" w:hAnsi="Times New Roman" w:cs="Times New Roman"/>
+          <w:lang w:val="en-GB"/>
+        </w:rPr>
+        <w:t>Lennep</w:t>
+      </w:r>
+      <w:proofErr w:type="spellEnd"/>
       <w:r>
         <w:rPr>
           <w:rFonts w:ascii="Times New Roman" w:hAnsi="Times New Roman" w:cs="Times New Roman"/>
@@ -9602,7 +10204,23 @@
           <w:rFonts w:ascii="Times New Roman" w:hAnsi="Times New Roman" w:cs="Times New Roman"/>
           <w:lang w:val="en-GB"/>
         </w:rPr>
-        <w:t>an Lennep wa</w:t>
+        <w:t xml:space="preserve">an </w:t>
+      </w:r>
+      <w:proofErr w:type="spellStart"/>
+      <w:r>
+        <w:rPr>
+          <w:rFonts w:ascii="Times New Roman" w:hAnsi="Times New Roman" w:cs="Times New Roman"/>
+          <w:lang w:val="en-GB"/>
+        </w:rPr>
+        <w:t>Lennep</w:t>
+      </w:r>
+      <w:proofErr w:type="spellEnd"/>
+      <w:r>
+        <w:rPr>
+          <w:rFonts w:ascii="Times New Roman" w:hAnsi="Times New Roman" w:cs="Times New Roman"/>
+          <w:lang w:val="en-GB"/>
+        </w:rPr>
+        <w:t xml:space="preserve"> wa</w:t>
       </w:r>
       <w:r>
         <w:rPr>
@@ -9651,7 +10269,15 @@
           <w:rFonts w:ascii="Times New Roman" w:hAnsi="Times New Roman" w:cs="Times New Roman"/>
           <w:lang w:val="en-GB"/>
         </w:rPr>
-        <w:t xml:space="preserve">the Freedom from Want Award. In 1996 he was engaged in preparing the </w:t>
+        <w:t xml:space="preserve">the Freedom from Want Award. In 1996 he was </w:t>
+      </w:r>
+      <w:r>
+        <w:rPr>
+          <w:rFonts w:ascii="Times New Roman" w:hAnsi="Times New Roman" w:cs="Times New Roman"/>
+          <w:lang w:val="en-GB"/>
+        </w:rPr>
+        <w:lastRenderedPageBreak/>
+        <w:t xml:space="preserve">engaged in preparing the </w:t>
       </w:r>
       <w:r>
         <w:rPr>
@@ -9700,8 +10326,17 @@
           <w:rFonts w:ascii="Times New Roman" w:hAnsi="Times New Roman" w:cs="Times New Roman"/>
           <w:lang w:val="en-GB"/>
         </w:rPr>
-        <w:t>an Lennep</w:t>
-      </w:r>
+        <w:t xml:space="preserve">an </w:t>
+      </w:r>
+      <w:proofErr w:type="spellStart"/>
+      <w:r>
+        <w:rPr>
+          <w:rFonts w:ascii="Times New Roman" w:hAnsi="Times New Roman" w:cs="Times New Roman"/>
+          <w:lang w:val="en-GB"/>
+        </w:rPr>
+        <w:t>Lennep</w:t>
+      </w:r>
+      <w:proofErr w:type="spellEnd"/>
       <w:r>
         <w:rPr>
           <w:rFonts w:ascii="Times New Roman" w:hAnsi="Times New Roman" w:cs="Times New Roman"/>
@@ -9829,14 +10464,46 @@
           <w:rFonts w:ascii="Times New Roman" w:hAnsi="Times New Roman" w:cs="Times New Roman"/>
           <w:lang w:val="en-GB"/>
         </w:rPr>
-        <w:t>Van Lennep family archives</w:t>
-      </w:r>
-      <w:r>
-        <w:rPr>
-          <w:rFonts w:ascii="Times New Roman" w:hAnsi="Times New Roman" w:cs="Times New Roman"/>
-          <w:lang w:val="en-GB"/>
-        </w:rPr>
-        <w:t xml:space="preserve"> in Stadsarchief Amsterdam</w:t>
+        <w:t xml:space="preserve">Van </w:t>
+      </w:r>
+      <w:proofErr w:type="spellStart"/>
+      <w:r>
+        <w:rPr>
+          <w:rFonts w:ascii="Times New Roman" w:hAnsi="Times New Roman" w:cs="Times New Roman"/>
+          <w:lang w:val="en-GB"/>
+        </w:rPr>
+        <w:t>Lennep</w:t>
+      </w:r>
+      <w:proofErr w:type="spellEnd"/>
+      <w:r>
+        <w:rPr>
+          <w:rFonts w:ascii="Times New Roman" w:hAnsi="Times New Roman" w:cs="Times New Roman"/>
+          <w:lang w:val="en-GB"/>
+        </w:rPr>
+        <w:t xml:space="preserve"> family archives</w:t>
+      </w:r>
+      <w:r>
+        <w:rPr>
+          <w:rFonts w:ascii="Times New Roman" w:hAnsi="Times New Roman" w:cs="Times New Roman"/>
+          <w:lang w:val="en-GB"/>
+        </w:rPr>
+        <w:t xml:space="preserve"> in </w:t>
+      </w:r>
+      <w:proofErr w:type="spellStart"/>
+      <w:r>
+        <w:rPr>
+          <w:rFonts w:ascii="Times New Roman" w:hAnsi="Times New Roman" w:cs="Times New Roman"/>
+          <w:lang w:val="en-GB"/>
+        </w:rPr>
+        <w:t>Stadsarchief</w:t>
+      </w:r>
+      <w:proofErr w:type="spellEnd"/>
+      <w:r>
+        <w:rPr>
+          <w:rFonts w:ascii="Times New Roman" w:hAnsi="Times New Roman" w:cs="Times New Roman"/>
+          <w:lang w:val="en-GB"/>
+        </w:rPr>
+        <w:t xml:space="preserve"> Amsterdam</w:t>
       </w:r>
       <w:r>
         <w:rPr>
@@ -9857,8 +10524,17 @@
           <w:rFonts w:ascii="Times New Roman" w:hAnsi="Times New Roman" w:cs="Times New Roman"/>
           <w:lang w:val="en-GB"/>
         </w:rPr>
-        <w:t>see for Emile van Lennep</w:t>
-      </w:r>
+        <w:t xml:space="preserve">see for Emile van </w:t>
+      </w:r>
+      <w:proofErr w:type="spellStart"/>
+      <w:r>
+        <w:rPr>
+          <w:rFonts w:ascii="Times New Roman" w:hAnsi="Times New Roman" w:cs="Times New Roman"/>
+          <w:lang w:val="en-GB"/>
+        </w:rPr>
+        <w:t>Lennep</w:t>
+      </w:r>
+      <w:proofErr w:type="spellEnd"/>
       <w:r>
         <w:rPr>
           <w:rFonts w:ascii="Times New Roman" w:hAnsi="Times New Roman" w:cs="Times New Roman"/>
@@ -9901,7 +10577,7 @@
         </w:rPr>
         <w:t xml:space="preserve"> </w:t>
       </w:r>
-      <w:hyperlink r:id="rId10" w:history="1">
+      <w:hyperlink r:id="rId9" w:history="1">
         <w:r>
           <w:rPr>
             <w:rStyle w:val="Hyperlink"/>
@@ -9935,7 +10611,6 @@
           <w:b/>
           <w:lang w:val="en-US"/>
         </w:rPr>
-        <w:lastRenderedPageBreak/>
         <w:t>PUBLICATIONS</w:t>
       </w:r>
       <w:r>
@@ -9964,30 +10639,136 @@
           <w:rFonts w:ascii="Times New Roman" w:hAnsi="Times New Roman" w:cs="Times New Roman"/>
           <w:lang w:val="en-US"/>
         </w:rPr>
-        <w:t>Het beta</w:t>
-      </w:r>
+        <w:t xml:space="preserve">Het </w:t>
+      </w:r>
+      <w:proofErr w:type="spellStart"/>
       <w:r>
         <w:rPr>
           <w:rFonts w:ascii="Times New Roman" w:hAnsi="Times New Roman" w:cs="Times New Roman"/>
           <w:lang w:val="en-US"/>
         </w:rPr>
-        <w:t>lingsverkeer met het buitenland’</w:t>
+        <w:t>beta</w:t>
       </w:r>
       <w:r>
         <w:rPr>
           <w:rFonts w:ascii="Times New Roman" w:hAnsi="Times New Roman" w:cs="Times New Roman"/>
           <w:lang w:val="en-US"/>
         </w:rPr>
+        <w:t>lingsverkeer</w:t>
+      </w:r>
+      <w:proofErr w:type="spellEnd"/>
+      <w:r>
+        <w:rPr>
+          <w:rFonts w:ascii="Times New Roman" w:hAnsi="Times New Roman" w:cs="Times New Roman"/>
+          <w:lang w:val="en-US"/>
+        </w:rPr>
+        <w:t xml:space="preserve"> met het </w:t>
+      </w:r>
+      <w:proofErr w:type="spellStart"/>
+      <w:r>
+        <w:rPr>
+          <w:rFonts w:ascii="Times New Roman" w:hAnsi="Times New Roman" w:cs="Times New Roman"/>
+          <w:lang w:val="en-US"/>
+        </w:rPr>
+        <w:t>buitenland</w:t>
+      </w:r>
+      <w:proofErr w:type="spellEnd"/>
+      <w:r>
+        <w:rPr>
+          <w:rFonts w:ascii="Times New Roman" w:hAnsi="Times New Roman" w:cs="Times New Roman"/>
+          <w:lang w:val="en-US"/>
+        </w:rPr>
+        <w:t>’</w:t>
+      </w:r>
+      <w:r>
+        <w:rPr>
+          <w:rFonts w:ascii="Times New Roman" w:hAnsi="Times New Roman" w:cs="Times New Roman"/>
+          <w:lang w:val="en-US"/>
+        </w:rPr>
         <w:t xml:space="preserve"> in: </w:t>
       </w:r>
+      <w:proofErr w:type="spellStart"/>
       <w:r>
         <w:rPr>
           <w:rFonts w:ascii="Times New Roman" w:hAnsi="Times New Roman" w:cs="Times New Roman"/>
           <w:i/>
           <w:lang w:val="en-US"/>
         </w:rPr>
-        <w:t>Financieele uitgangspunten voor Nederlands wederopbouw</w:t>
-      </w:r>
+        <w:t>Financieele</w:t>
+      </w:r>
+      <w:proofErr w:type="spellEnd"/>
+      <w:r>
+        <w:rPr>
+          <w:rFonts w:ascii="Times New Roman" w:hAnsi="Times New Roman" w:cs="Times New Roman"/>
+          <w:i/>
+          <w:lang w:val="en-US"/>
+        </w:rPr>
+        <w:t xml:space="preserve"> </w:t>
+      </w:r>
+      <w:proofErr w:type="spellStart"/>
+      <w:r>
+        <w:rPr>
+          <w:rFonts w:ascii="Times New Roman" w:hAnsi="Times New Roman" w:cs="Times New Roman"/>
+          <w:i/>
+          <w:lang w:val="en-US"/>
+        </w:rPr>
+        <w:t>uitgangspunten</w:t>
+      </w:r>
+      <w:proofErr w:type="spellEnd"/>
+      <w:r>
+        <w:rPr>
+          <w:rFonts w:ascii="Times New Roman" w:hAnsi="Times New Roman" w:cs="Times New Roman"/>
+          <w:i/>
+          <w:lang w:val="en-US"/>
+        </w:rPr>
+        <w:t xml:space="preserve"> </w:t>
+      </w:r>
+      <w:proofErr w:type="spellStart"/>
+      <w:r>
+        <w:rPr>
+          <w:rFonts w:ascii="Times New Roman" w:hAnsi="Times New Roman" w:cs="Times New Roman"/>
+          <w:i/>
+          <w:lang w:val="en-US"/>
+        </w:rPr>
+        <w:t>voor</w:t>
+      </w:r>
+      <w:proofErr w:type="spellEnd"/>
+      <w:r>
+        <w:rPr>
+          <w:rFonts w:ascii="Times New Roman" w:hAnsi="Times New Roman" w:cs="Times New Roman"/>
+          <w:i/>
+          <w:lang w:val="en-US"/>
+        </w:rPr>
+        <w:t xml:space="preserve"> </w:t>
+      </w:r>
+      <w:proofErr w:type="spellStart"/>
+      <w:r>
+        <w:rPr>
+          <w:rFonts w:ascii="Times New Roman" w:hAnsi="Times New Roman" w:cs="Times New Roman"/>
+          <w:i/>
+          <w:lang w:val="en-US"/>
+        </w:rPr>
+        <w:t>Nederlands</w:t>
+      </w:r>
+      <w:proofErr w:type="spellEnd"/>
+      <w:r>
+        <w:rPr>
+          <w:rFonts w:ascii="Times New Roman" w:hAnsi="Times New Roman" w:cs="Times New Roman"/>
+          <w:i/>
+          <w:lang w:val="en-US"/>
+        </w:rPr>
+        <w:t xml:space="preserve"> </w:t>
+      </w:r>
+      <w:proofErr w:type="spellStart"/>
+      <w:r>
+        <w:rPr>
+          <w:rFonts w:ascii="Times New Roman" w:hAnsi="Times New Roman" w:cs="Times New Roman"/>
+          <w:i/>
+          <w:lang w:val="en-US"/>
+        </w:rPr>
+        <w:t>wederopbouw</w:t>
+      </w:r>
+      <w:proofErr w:type="spellEnd"/>
       <w:r>
         <w:rPr>
           <w:rFonts w:ascii="Times New Roman" w:hAnsi="Times New Roman" w:cs="Times New Roman"/>
@@ -10029,15 +10810,89 @@
           <w:rFonts w:ascii="Times New Roman" w:hAnsi="Times New Roman" w:cs="Times New Roman"/>
           <w:lang w:val="en-US"/>
         </w:rPr>
-        <w:t xml:space="preserve">‘De regeling van de monetaire problematiek in het E.E.G.-verdrag’ in </w:t>
-      </w:r>
+        <w:t xml:space="preserve">‘De </w:t>
+      </w:r>
+      <w:proofErr w:type="spellStart"/>
+      <w:r>
+        <w:rPr>
+          <w:rFonts w:ascii="Times New Roman" w:hAnsi="Times New Roman" w:cs="Times New Roman"/>
+          <w:lang w:val="en-US"/>
+        </w:rPr>
+        <w:t>regeling</w:t>
+      </w:r>
+      <w:proofErr w:type="spellEnd"/>
+      <w:r>
+        <w:rPr>
+          <w:rFonts w:ascii="Times New Roman" w:hAnsi="Times New Roman" w:cs="Times New Roman"/>
+          <w:lang w:val="en-US"/>
+        </w:rPr>
+        <w:t xml:space="preserve"> van de </w:t>
+      </w:r>
+      <w:proofErr w:type="spellStart"/>
+      <w:r>
+        <w:rPr>
+          <w:rFonts w:ascii="Times New Roman" w:hAnsi="Times New Roman" w:cs="Times New Roman"/>
+          <w:lang w:val="en-US"/>
+        </w:rPr>
+        <w:t>monetaire</w:t>
+      </w:r>
+      <w:proofErr w:type="spellEnd"/>
+      <w:r>
+        <w:rPr>
+          <w:rFonts w:ascii="Times New Roman" w:hAnsi="Times New Roman" w:cs="Times New Roman"/>
+          <w:lang w:val="en-US"/>
+        </w:rPr>
+        <w:t xml:space="preserve"> </w:t>
+      </w:r>
+      <w:proofErr w:type="spellStart"/>
+      <w:r>
+        <w:rPr>
+          <w:rFonts w:ascii="Times New Roman" w:hAnsi="Times New Roman" w:cs="Times New Roman"/>
+          <w:lang w:val="en-US"/>
+        </w:rPr>
+        <w:t>problematiek</w:t>
+      </w:r>
+      <w:proofErr w:type="spellEnd"/>
+      <w:r>
+        <w:rPr>
+          <w:rFonts w:ascii="Times New Roman" w:hAnsi="Times New Roman" w:cs="Times New Roman"/>
+          <w:lang w:val="en-US"/>
+        </w:rPr>
+        <w:t xml:space="preserve"> in het E.E.G.-</w:t>
+      </w:r>
+      <w:proofErr w:type="spellStart"/>
+      <w:r>
+        <w:rPr>
+          <w:rFonts w:ascii="Times New Roman" w:hAnsi="Times New Roman" w:cs="Times New Roman"/>
+          <w:lang w:val="en-US"/>
+        </w:rPr>
+        <w:t>verdrag</w:t>
+      </w:r>
+      <w:proofErr w:type="spellEnd"/>
+      <w:r>
+        <w:rPr>
+          <w:rFonts w:ascii="Times New Roman" w:hAnsi="Times New Roman" w:cs="Times New Roman"/>
+          <w:lang w:val="en-US"/>
+        </w:rPr>
+        <w:t xml:space="preserve">’ in </w:t>
+      </w:r>
+      <w:proofErr w:type="spellStart"/>
       <w:r>
         <w:rPr>
           <w:rFonts w:ascii="Times New Roman" w:hAnsi="Times New Roman" w:cs="Times New Roman"/>
           <w:i/>
           <w:lang w:val="en-US"/>
         </w:rPr>
-        <w:t>Internationale Spectator</w:t>
+        <w:t>Internationale</w:t>
+      </w:r>
+      <w:proofErr w:type="spellEnd"/>
+      <w:r>
+        <w:rPr>
+          <w:rFonts w:ascii="Times New Roman" w:hAnsi="Times New Roman" w:cs="Times New Roman"/>
+          <w:i/>
+          <w:lang w:val="en-US"/>
+        </w:rPr>
+        <w:t xml:space="preserve"> Spectator</w:t>
       </w:r>
       <w:r>
         <w:rPr>
@@ -10054,14 +10909,106 @@
         </w:rPr>
         <w:t xml:space="preserve"> </w:t>
       </w:r>
+      <w:proofErr w:type="spellStart"/>
       <w:r>
         <w:rPr>
           <w:rFonts w:ascii="Times New Roman" w:hAnsi="Times New Roman" w:cs="Times New Roman"/>
           <w:i/>
           <w:lang w:val="en-US"/>
         </w:rPr>
-        <w:t>Enige grondbeginselen bij de beoordeling van openbare uitgaven</w:t>
-      </w:r>
+        <w:t>Enige</w:t>
+      </w:r>
+      <w:proofErr w:type="spellEnd"/>
+      <w:r>
+        <w:rPr>
+          <w:rFonts w:ascii="Times New Roman" w:hAnsi="Times New Roman" w:cs="Times New Roman"/>
+          <w:i/>
+          <w:lang w:val="en-US"/>
+        </w:rPr>
+        <w:t xml:space="preserve"> </w:t>
+      </w:r>
+      <w:proofErr w:type="spellStart"/>
+      <w:r>
+        <w:rPr>
+          <w:rFonts w:ascii="Times New Roman" w:hAnsi="Times New Roman" w:cs="Times New Roman"/>
+          <w:i/>
+          <w:lang w:val="en-US"/>
+        </w:rPr>
+        <w:t>grondbeginselen</w:t>
+      </w:r>
+      <w:proofErr w:type="spellEnd"/>
+      <w:r>
+        <w:rPr>
+          <w:rFonts w:ascii="Times New Roman" w:hAnsi="Times New Roman" w:cs="Times New Roman"/>
+          <w:i/>
+          <w:lang w:val="en-US"/>
+        </w:rPr>
+        <w:t xml:space="preserve"> </w:t>
+      </w:r>
+      <w:proofErr w:type="spellStart"/>
+      <w:r>
+        <w:rPr>
+          <w:rFonts w:ascii="Times New Roman" w:hAnsi="Times New Roman" w:cs="Times New Roman"/>
+          <w:i/>
+          <w:lang w:val="en-US"/>
+        </w:rPr>
+        <w:t>bij</w:t>
+      </w:r>
+      <w:proofErr w:type="spellEnd"/>
+      <w:r>
+        <w:rPr>
+          <w:rFonts w:ascii="Times New Roman" w:hAnsi="Times New Roman" w:cs="Times New Roman"/>
+          <w:i/>
+          <w:lang w:val="en-US"/>
+        </w:rPr>
+        <w:t xml:space="preserve"> de </w:t>
+      </w:r>
+      <w:proofErr w:type="spellStart"/>
+      <w:r>
+        <w:rPr>
+          <w:rFonts w:ascii="Times New Roman" w:hAnsi="Times New Roman" w:cs="Times New Roman"/>
+          <w:i/>
+          <w:lang w:val="en-US"/>
+        </w:rPr>
+        <w:t>beoordeling</w:t>
+      </w:r>
+      <w:proofErr w:type="spellEnd"/>
+      <w:r>
+        <w:rPr>
+          <w:rFonts w:ascii="Times New Roman" w:hAnsi="Times New Roman" w:cs="Times New Roman"/>
+          <w:i/>
+          <w:lang w:val="en-US"/>
+        </w:rPr>
+        <w:t xml:space="preserve"> van </w:t>
+      </w:r>
+      <w:proofErr w:type="spellStart"/>
+      <w:r>
+        <w:rPr>
+          <w:rFonts w:ascii="Times New Roman" w:hAnsi="Times New Roman" w:cs="Times New Roman"/>
+          <w:i/>
+          <w:lang w:val="en-US"/>
+        </w:rPr>
+        <w:t>openbare</w:t>
+      </w:r>
+      <w:proofErr w:type="spellEnd"/>
+      <w:r>
+        <w:rPr>
+          <w:rFonts w:ascii="Times New Roman" w:hAnsi="Times New Roman" w:cs="Times New Roman"/>
+          <w:i/>
+          <w:lang w:val="en-US"/>
+        </w:rPr>
+        <w:t xml:space="preserve"> </w:t>
+      </w:r>
+      <w:proofErr w:type="spellStart"/>
+      <w:r>
+        <w:rPr>
+          <w:rFonts w:ascii="Times New Roman" w:hAnsi="Times New Roman" w:cs="Times New Roman"/>
+          <w:i/>
+          <w:lang w:val="en-US"/>
+        </w:rPr>
+        <w:t>uitgaven</w:t>
+      </w:r>
+      <w:proofErr w:type="spellEnd"/>
       <w:r>
         <w:rPr>
           <w:rFonts w:ascii="Times New Roman" w:hAnsi="Times New Roman" w:cs="Times New Roman"/>
@@ -10324,14 +11271,62 @@
           <w:rFonts w:ascii="Times New Roman" w:hAnsi="Times New Roman" w:cs="Times New Roman"/>
           <w:lang w:val="en-GB"/>
         </w:rPr>
-        <w:t>La coopération internatio</w:t>
-      </w:r>
-      <w:r>
-        <w:rPr>
-          <w:rFonts w:ascii="Times New Roman" w:hAnsi="Times New Roman" w:cs="Times New Roman"/>
-          <w:lang w:val="en-GB"/>
-        </w:rPr>
-        <w:t>nale: problèmes et perspectives</w:t>
+        <w:t xml:space="preserve">La </w:t>
+      </w:r>
+      <w:proofErr w:type="spellStart"/>
+      <w:r>
+        <w:rPr>
+          <w:rFonts w:ascii="Times New Roman" w:hAnsi="Times New Roman" w:cs="Times New Roman"/>
+          <w:lang w:val="en-GB"/>
+        </w:rPr>
+        <w:t>coopération</w:t>
+      </w:r>
+      <w:proofErr w:type="spellEnd"/>
+      <w:r>
+        <w:rPr>
+          <w:rFonts w:ascii="Times New Roman" w:hAnsi="Times New Roman" w:cs="Times New Roman"/>
+          <w:lang w:val="en-GB"/>
+        </w:rPr>
+        <w:t xml:space="preserve"> </w:t>
+      </w:r>
+      <w:proofErr w:type="spellStart"/>
+      <w:r>
+        <w:rPr>
+          <w:rFonts w:ascii="Times New Roman" w:hAnsi="Times New Roman" w:cs="Times New Roman"/>
+          <w:lang w:val="en-GB"/>
+        </w:rPr>
+        <w:t>internatio</w:t>
+      </w:r>
+      <w:r>
+        <w:rPr>
+          <w:rFonts w:ascii="Times New Roman" w:hAnsi="Times New Roman" w:cs="Times New Roman"/>
+          <w:lang w:val="en-GB"/>
+        </w:rPr>
+        <w:t>nale</w:t>
+      </w:r>
+      <w:proofErr w:type="spellEnd"/>
+      <w:r>
+        <w:rPr>
+          <w:rFonts w:ascii="Times New Roman" w:hAnsi="Times New Roman" w:cs="Times New Roman"/>
+          <w:lang w:val="en-GB"/>
+        </w:rPr>
+        <w:t xml:space="preserve">: </w:t>
+      </w:r>
+      <w:proofErr w:type="spellStart"/>
+      <w:r>
+        <w:rPr>
+          <w:rFonts w:ascii="Times New Roman" w:hAnsi="Times New Roman" w:cs="Times New Roman"/>
+          <w:lang w:val="en-GB"/>
+        </w:rPr>
+        <w:t>problèmes</w:t>
+      </w:r>
+      <w:proofErr w:type="spellEnd"/>
+      <w:r>
+        <w:rPr>
+          <w:rFonts w:ascii="Times New Roman" w:hAnsi="Times New Roman" w:cs="Times New Roman"/>
+          <w:lang w:val="en-GB"/>
+        </w:rPr>
+        <w:t xml:space="preserve"> et perspectives</w:t>
       </w:r>
       <w:r>
         <w:rPr>
@@ -10368,15 +11363,16 @@
           <w:i/>
           <w:lang w:val="en-GB"/>
         </w:rPr>
-        <w:t>de l’</w:t>
-      </w:r>
+        <w:t xml:space="preserve">de </w:t>
+      </w:r>
+      <w:proofErr w:type="spellStart"/>
       <w:r>
         <w:rPr>
           <w:rFonts w:ascii="Times New Roman" w:hAnsi="Times New Roman" w:cs="Times New Roman"/>
           <w:i/>
           <w:lang w:val="en-GB"/>
         </w:rPr>
-        <w:t>Académie des sciences morales et politiques e</w:t>
+        <w:t>l’</w:t>
       </w:r>
       <w:r>
         <w:rPr>
@@ -10384,7 +11380,78 @@
           <w:i/>
           <w:lang w:val="en-GB"/>
         </w:rPr>
-        <w:t>t comptes rendus de ses séances</w:t>
+        <w:t>Académie</w:t>
+      </w:r>
+      <w:proofErr w:type="spellEnd"/>
+      <w:r>
+        <w:rPr>
+          <w:rFonts w:ascii="Times New Roman" w:hAnsi="Times New Roman" w:cs="Times New Roman"/>
+          <w:i/>
+          <w:lang w:val="en-GB"/>
+        </w:rPr>
+        <w:t xml:space="preserve"> des sciences morales et politiques e</w:t>
+      </w:r>
+      <w:r>
+        <w:rPr>
+          <w:rFonts w:ascii="Times New Roman" w:hAnsi="Times New Roman" w:cs="Times New Roman"/>
+          <w:i/>
+          <w:lang w:val="en-GB"/>
+        </w:rPr>
+        <w:t xml:space="preserve">t </w:t>
+      </w:r>
+      <w:proofErr w:type="spellStart"/>
+      <w:r>
+        <w:rPr>
+          <w:rFonts w:ascii="Times New Roman" w:hAnsi="Times New Roman" w:cs="Times New Roman"/>
+          <w:i/>
+          <w:lang w:val="en-GB"/>
+        </w:rPr>
+        <w:t>comptes</w:t>
+      </w:r>
+      <w:proofErr w:type="spellEnd"/>
+      <w:r>
+        <w:rPr>
+          <w:rFonts w:ascii="Times New Roman" w:hAnsi="Times New Roman" w:cs="Times New Roman"/>
+          <w:i/>
+          <w:lang w:val="en-GB"/>
+        </w:rPr>
+        <w:t xml:space="preserve"> </w:t>
+      </w:r>
+      <w:proofErr w:type="spellStart"/>
+      <w:r>
+        <w:rPr>
+          <w:rFonts w:ascii="Times New Roman" w:hAnsi="Times New Roman" w:cs="Times New Roman"/>
+          <w:i/>
+          <w:lang w:val="en-GB"/>
+        </w:rPr>
+        <w:t>rendus</w:t>
+      </w:r>
+      <w:proofErr w:type="spellEnd"/>
+      <w:r>
+        <w:rPr>
+          <w:rFonts w:ascii="Times New Roman" w:hAnsi="Times New Roman" w:cs="Times New Roman"/>
+          <w:i/>
+          <w:lang w:val="en-GB"/>
+        </w:rPr>
+        <w:t xml:space="preserve"> de </w:t>
+      </w:r>
+      <w:proofErr w:type="spellStart"/>
+      <w:r>
+        <w:rPr>
+          <w:rFonts w:ascii="Times New Roman" w:hAnsi="Times New Roman" w:cs="Times New Roman"/>
+          <w:i/>
+          <w:lang w:val="en-GB"/>
+        </w:rPr>
+        <w:t>ses</w:t>
+      </w:r>
+      <w:proofErr w:type="spellEnd"/>
+      <w:r>
+        <w:rPr>
+          <w:rFonts w:ascii="Times New Roman" w:hAnsi="Times New Roman" w:cs="Times New Roman"/>
+          <w:i/>
+          <w:lang w:val="en-GB"/>
+        </w:rPr>
+        <w:t xml:space="preserve"> séances</w:t>
       </w:r>
       <w:r>
         <w:rPr>
@@ -10485,20 +11552,204 @@
           <w:rFonts w:ascii="Times New Roman" w:eastAsia="MS Mincho" w:hAnsi="Times New Roman" w:cs="Times New Roman"/>
           <w:lang w:val="en-GB"/>
         </w:rPr>
-        <w:t>‘De Organisatie voor Economische Samenwerking en Ontwikkeling (OESO) en haar aanpassi</w:t>
-      </w:r>
+        <w:t xml:space="preserve">‘De </w:t>
+      </w:r>
+      <w:proofErr w:type="spellStart"/>
       <w:r>
         <w:rPr>
           <w:rFonts w:ascii="Times New Roman" w:eastAsia="MS Mincho" w:hAnsi="Times New Roman" w:cs="Times New Roman"/>
           <w:lang w:val="en-GB"/>
         </w:rPr>
-        <w:t>ng aan nieuwe problemen van i</w:t>
-      </w:r>
+        <w:t>Organisatie</w:t>
+      </w:r>
+      <w:proofErr w:type="spellEnd"/>
       <w:r>
         <w:rPr>
           <w:rFonts w:ascii="Times New Roman" w:eastAsia="MS Mincho" w:hAnsi="Times New Roman" w:cs="Times New Roman"/>
           <w:lang w:val="en-GB"/>
         </w:rPr>
+        <w:t xml:space="preserve"> </w:t>
+      </w:r>
+      <w:proofErr w:type="spellStart"/>
+      <w:r>
+        <w:rPr>
+          <w:rFonts w:ascii="Times New Roman" w:eastAsia="MS Mincho" w:hAnsi="Times New Roman" w:cs="Times New Roman"/>
+          <w:lang w:val="en-GB"/>
+        </w:rPr>
+        <w:t>voor</w:t>
+      </w:r>
+      <w:proofErr w:type="spellEnd"/>
+      <w:r>
+        <w:rPr>
+          <w:rFonts w:ascii="Times New Roman" w:eastAsia="MS Mincho" w:hAnsi="Times New Roman" w:cs="Times New Roman"/>
+          <w:lang w:val="en-GB"/>
+        </w:rPr>
+        <w:t xml:space="preserve"> </w:t>
+      </w:r>
+      <w:proofErr w:type="spellStart"/>
+      <w:r>
+        <w:rPr>
+          <w:rFonts w:ascii="Times New Roman" w:eastAsia="MS Mincho" w:hAnsi="Times New Roman" w:cs="Times New Roman"/>
+          <w:lang w:val="en-GB"/>
+        </w:rPr>
+        <w:t>Economische</w:t>
+      </w:r>
+      <w:proofErr w:type="spellEnd"/>
+      <w:r>
+        <w:rPr>
+          <w:rFonts w:ascii="Times New Roman" w:eastAsia="MS Mincho" w:hAnsi="Times New Roman" w:cs="Times New Roman"/>
+          <w:lang w:val="en-GB"/>
+        </w:rPr>
+        <w:t xml:space="preserve"> </w:t>
+      </w:r>
+      <w:proofErr w:type="spellStart"/>
+      <w:r>
+        <w:rPr>
+          <w:rFonts w:ascii="Times New Roman" w:eastAsia="MS Mincho" w:hAnsi="Times New Roman" w:cs="Times New Roman"/>
+          <w:lang w:val="en-GB"/>
+        </w:rPr>
+        <w:t>Samenwerking</w:t>
+      </w:r>
+      <w:proofErr w:type="spellEnd"/>
+      <w:r>
+        <w:rPr>
+          <w:rFonts w:ascii="Times New Roman" w:eastAsia="MS Mincho" w:hAnsi="Times New Roman" w:cs="Times New Roman"/>
+          <w:lang w:val="en-GB"/>
+        </w:rPr>
+        <w:t xml:space="preserve"> </w:t>
+      </w:r>
+      <w:proofErr w:type="spellStart"/>
+      <w:r>
+        <w:rPr>
+          <w:rFonts w:ascii="Times New Roman" w:eastAsia="MS Mincho" w:hAnsi="Times New Roman" w:cs="Times New Roman"/>
+          <w:lang w:val="en-GB"/>
+        </w:rPr>
+        <w:t>en</w:t>
+      </w:r>
+      <w:proofErr w:type="spellEnd"/>
+      <w:r>
+        <w:rPr>
+          <w:rFonts w:ascii="Times New Roman" w:eastAsia="MS Mincho" w:hAnsi="Times New Roman" w:cs="Times New Roman"/>
+          <w:lang w:val="en-GB"/>
+        </w:rPr>
+        <w:t xml:space="preserve"> Ontwikkeling (OESO) </w:t>
+      </w:r>
+      <w:proofErr w:type="spellStart"/>
+      <w:r>
+        <w:rPr>
+          <w:rFonts w:ascii="Times New Roman" w:eastAsia="MS Mincho" w:hAnsi="Times New Roman" w:cs="Times New Roman"/>
+          <w:lang w:val="en-GB"/>
+        </w:rPr>
+        <w:t>en</w:t>
+      </w:r>
+      <w:proofErr w:type="spellEnd"/>
+      <w:r>
+        <w:rPr>
+          <w:rFonts w:ascii="Times New Roman" w:eastAsia="MS Mincho" w:hAnsi="Times New Roman" w:cs="Times New Roman"/>
+          <w:lang w:val="en-GB"/>
+        </w:rPr>
+        <w:t xml:space="preserve"> </w:t>
+      </w:r>
+      <w:proofErr w:type="spellStart"/>
+      <w:r>
+        <w:rPr>
+          <w:rFonts w:ascii="Times New Roman" w:eastAsia="MS Mincho" w:hAnsi="Times New Roman" w:cs="Times New Roman"/>
+          <w:lang w:val="en-GB"/>
+        </w:rPr>
+        <w:t>haar</w:t>
+      </w:r>
+      <w:proofErr w:type="spellEnd"/>
+      <w:r>
+        <w:rPr>
+          <w:rFonts w:ascii="Times New Roman" w:eastAsia="MS Mincho" w:hAnsi="Times New Roman" w:cs="Times New Roman"/>
+          <w:lang w:val="en-GB"/>
+        </w:rPr>
+        <w:t xml:space="preserve"> </w:t>
+      </w:r>
+      <w:proofErr w:type="spellStart"/>
+      <w:r>
+        <w:rPr>
+          <w:rFonts w:ascii="Times New Roman" w:eastAsia="MS Mincho" w:hAnsi="Times New Roman" w:cs="Times New Roman"/>
+          <w:lang w:val="en-GB"/>
+        </w:rPr>
+        <w:t>aanpassi</w:t>
+      </w:r>
+      <w:r>
+        <w:rPr>
+          <w:rFonts w:ascii="Times New Roman" w:eastAsia="MS Mincho" w:hAnsi="Times New Roman" w:cs="Times New Roman"/>
+          <w:lang w:val="en-GB"/>
+        </w:rPr>
+        <w:t>ng</w:t>
+      </w:r>
+      <w:proofErr w:type="spellEnd"/>
+      <w:r>
+        <w:rPr>
+          <w:rFonts w:ascii="Times New Roman" w:eastAsia="MS Mincho" w:hAnsi="Times New Roman" w:cs="Times New Roman"/>
+          <w:lang w:val="en-GB"/>
+        </w:rPr>
+        <w:t xml:space="preserve"> </w:t>
+      </w:r>
+      <w:proofErr w:type="spellStart"/>
+      <w:r>
+        <w:rPr>
+          <w:rFonts w:ascii="Times New Roman" w:eastAsia="MS Mincho" w:hAnsi="Times New Roman" w:cs="Times New Roman"/>
+          <w:lang w:val="en-GB"/>
+        </w:rPr>
+        <w:t>aan</w:t>
+      </w:r>
+      <w:proofErr w:type="spellEnd"/>
+      <w:r>
+        <w:rPr>
+          <w:rFonts w:ascii="Times New Roman" w:eastAsia="MS Mincho" w:hAnsi="Times New Roman" w:cs="Times New Roman"/>
+          <w:lang w:val="en-GB"/>
+        </w:rPr>
+        <w:t xml:space="preserve"> </w:t>
+      </w:r>
+      <w:proofErr w:type="spellStart"/>
+      <w:r>
+        <w:rPr>
+          <w:rFonts w:ascii="Times New Roman" w:eastAsia="MS Mincho" w:hAnsi="Times New Roman" w:cs="Times New Roman"/>
+          <w:lang w:val="en-GB"/>
+        </w:rPr>
+        <w:t>nieuwe</w:t>
+      </w:r>
+      <w:proofErr w:type="spellEnd"/>
+      <w:r>
+        <w:rPr>
+          <w:rFonts w:ascii="Times New Roman" w:eastAsia="MS Mincho" w:hAnsi="Times New Roman" w:cs="Times New Roman"/>
+          <w:lang w:val="en-GB"/>
+        </w:rPr>
+        <w:t xml:space="preserve"> </w:t>
+      </w:r>
+      <w:proofErr w:type="spellStart"/>
+      <w:r>
+        <w:rPr>
+          <w:rFonts w:ascii="Times New Roman" w:eastAsia="MS Mincho" w:hAnsi="Times New Roman" w:cs="Times New Roman"/>
+          <w:lang w:val="en-GB"/>
+        </w:rPr>
+        <w:t>problemen</w:t>
+      </w:r>
+      <w:proofErr w:type="spellEnd"/>
+      <w:r>
+        <w:rPr>
+          <w:rFonts w:ascii="Times New Roman" w:eastAsia="MS Mincho" w:hAnsi="Times New Roman" w:cs="Times New Roman"/>
+          <w:lang w:val="en-GB"/>
+        </w:rPr>
+        <w:t xml:space="preserve"> van </w:t>
+      </w:r>
+      <w:proofErr w:type="spellStart"/>
+      <w:r>
+        <w:rPr>
+          <w:rFonts w:ascii="Times New Roman" w:eastAsia="MS Mincho" w:hAnsi="Times New Roman" w:cs="Times New Roman"/>
+          <w:lang w:val="en-GB"/>
+        </w:rPr>
+        <w:t>i</w:t>
+      </w:r>
+      <w:r>
+        <w:rPr>
+          <w:rFonts w:ascii="Times New Roman" w:eastAsia="MS Mincho" w:hAnsi="Times New Roman" w:cs="Times New Roman"/>
+          <w:lang w:val="en-GB"/>
+        </w:rPr>
         <w:t>nternational</w:t>
       </w:r>
       <w:r>
@@ -10506,14 +11757,38 @@
           <w:rFonts w:ascii="Times New Roman" w:eastAsia="MS Mincho" w:hAnsi="Times New Roman" w:cs="Times New Roman"/>
           <w:lang w:val="en-GB"/>
         </w:rPr>
-        <w:t>e s</w:t>
-      </w:r>
+        <w:t>e</w:t>
+      </w:r>
+      <w:proofErr w:type="spellEnd"/>
       <w:r>
         <w:rPr>
           <w:rFonts w:ascii="Times New Roman" w:eastAsia="MS Mincho" w:hAnsi="Times New Roman" w:cs="Times New Roman"/>
           <w:lang w:val="en-GB"/>
         </w:rPr>
-        <w:t xml:space="preserve">amenwerking, in </w:t>
+        <w:t xml:space="preserve"> </w:t>
+      </w:r>
+      <w:proofErr w:type="spellStart"/>
+      <w:r>
+        <w:rPr>
+          <w:rFonts w:ascii="Times New Roman" w:eastAsia="MS Mincho" w:hAnsi="Times New Roman" w:cs="Times New Roman"/>
+          <w:lang w:val="en-GB"/>
+        </w:rPr>
+        <w:t>s</w:t>
+      </w:r>
+      <w:r>
+        <w:rPr>
+          <w:rFonts w:ascii="Times New Roman" w:eastAsia="MS Mincho" w:hAnsi="Times New Roman" w:cs="Times New Roman"/>
+          <w:lang w:val="en-GB"/>
+        </w:rPr>
+        <w:t>amenwerking</w:t>
+      </w:r>
+      <w:proofErr w:type="spellEnd"/>
+      <w:r>
+        <w:rPr>
+          <w:rFonts w:ascii="Times New Roman" w:eastAsia="MS Mincho" w:hAnsi="Times New Roman" w:cs="Times New Roman"/>
+          <w:lang w:val="en-GB"/>
+        </w:rPr>
+        <w:t xml:space="preserve">, in </w:t>
       </w:r>
       <w:r>
         <w:rPr>
@@ -11225,16 +12500,44 @@
           <w:i/>
           <w:lang w:val="en-GB"/>
         </w:rPr>
-        <w:t>Wege aus der Wel</w:t>
-      </w:r>
+        <w:t xml:space="preserve">Wege </w:t>
+      </w:r>
+      <w:proofErr w:type="spellStart"/>
       <w:r>
         <w:rPr>
           <w:rFonts w:ascii="Times New Roman" w:hAnsi="Times New Roman" w:cs="Times New Roman"/>
           <w:i/>
           <w:lang w:val="en-GB"/>
         </w:rPr>
+        <w:t>aus</w:t>
+      </w:r>
+      <w:proofErr w:type="spellEnd"/>
+      <w:r>
+        <w:rPr>
+          <w:rFonts w:ascii="Times New Roman" w:hAnsi="Times New Roman" w:cs="Times New Roman"/>
+          <w:i/>
+          <w:lang w:val="en-GB"/>
+        </w:rPr>
+        <w:t xml:space="preserve"> der </w:t>
+      </w:r>
+      <w:proofErr w:type="spellStart"/>
+      <w:r>
+        <w:rPr>
+          <w:rFonts w:ascii="Times New Roman" w:hAnsi="Times New Roman" w:cs="Times New Roman"/>
+          <w:i/>
+          <w:lang w:val="en-GB"/>
+        </w:rPr>
+        <w:t>Wel</w:t>
+      </w:r>
+      <w:r>
+        <w:rPr>
+          <w:rFonts w:ascii="Times New Roman" w:hAnsi="Times New Roman" w:cs="Times New Roman"/>
+          <w:i/>
+          <w:lang w:val="en-GB"/>
+        </w:rPr>
         <w:t>twirtschaftskrise</w:t>
       </w:r>
+      <w:proofErr w:type="spellEnd"/>
       <w:r>
         <w:rPr>
           <w:rFonts w:ascii="Times New Roman" w:hAnsi="Times New Roman" w:cs="Times New Roman"/>
@@ -11242,6 +12545,7 @@
         </w:rPr>
         <w:t xml:space="preserve">, </w:t>
       </w:r>
+      <w:proofErr w:type="spellStart"/>
       <w:r>
         <w:rPr>
           <w:rFonts w:ascii="Times New Roman" w:hAnsi="Times New Roman" w:cs="Times New Roman"/>
@@ -11249,6 +12553,7 @@
         </w:rPr>
         <w:t>Diessenhofen</w:t>
       </w:r>
+      <w:proofErr w:type="spellEnd"/>
       <w:r>
         <w:rPr>
           <w:rFonts w:ascii="Times New Roman" w:hAnsi="Times New Roman" w:cs="Times New Roman"/>
@@ -11395,7 +12700,43 @@
           <w:i/>
           <w:lang w:val="en-GB"/>
         </w:rPr>
-        <w:t xml:space="preserve">an Lennep in de wereldeconomie. </w:t>
+        <w:t xml:space="preserve">an </w:t>
+      </w:r>
+      <w:proofErr w:type="spellStart"/>
+      <w:r>
+        <w:rPr>
+          <w:rFonts w:ascii="Times New Roman" w:hAnsi="Times New Roman" w:cs="Times New Roman"/>
+          <w:i/>
+          <w:lang w:val="en-GB"/>
+        </w:rPr>
+        <w:t>Lennep</w:t>
+      </w:r>
+      <w:proofErr w:type="spellEnd"/>
+      <w:r>
+        <w:rPr>
+          <w:rFonts w:ascii="Times New Roman" w:hAnsi="Times New Roman" w:cs="Times New Roman"/>
+          <w:i/>
+          <w:lang w:val="en-GB"/>
+        </w:rPr>
+        <w:t xml:space="preserve"> in de </w:t>
+      </w:r>
+      <w:proofErr w:type="spellStart"/>
+      <w:r>
+        <w:rPr>
+          <w:rFonts w:ascii="Times New Roman" w:hAnsi="Times New Roman" w:cs="Times New Roman"/>
+          <w:i/>
+          <w:lang w:val="en-GB"/>
+        </w:rPr>
+        <w:t>wereldeconomie</w:t>
+      </w:r>
+      <w:proofErr w:type="spellEnd"/>
+      <w:r>
+        <w:rPr>
+          <w:rFonts w:ascii="Times New Roman" w:hAnsi="Times New Roman" w:cs="Times New Roman"/>
+          <w:i/>
+          <w:lang w:val="en-GB"/>
+        </w:rPr>
+        <w:t xml:space="preserve">. </w:t>
       </w:r>
       <w:r>
         <w:rPr>
@@ -11426,12 +12767,37 @@
         </w:rPr>
         <w:t xml:space="preserve"> (</w:t>
       </w:r>
+      <w:proofErr w:type="spellStart"/>
       <w:r>
         <w:rPr>
           <w:rFonts w:ascii="Times New Roman" w:hAnsi="Times New Roman" w:cs="Times New Roman"/>
           <w:lang w:val="nl-NL"/>
         </w:rPr>
-        <w:t>with E. Schoorl; English version in 1998);</w:t>
+        <w:t>with</w:t>
+      </w:r>
+      <w:proofErr w:type="spellEnd"/>
+      <w:r>
+        <w:rPr>
+          <w:rFonts w:ascii="Times New Roman" w:hAnsi="Times New Roman" w:cs="Times New Roman"/>
+          <w:lang w:val="nl-NL"/>
+        </w:rPr>
+        <w:t xml:space="preserve"> E. Schoorl; English </w:t>
+      </w:r>
+      <w:proofErr w:type="spellStart"/>
+      <w:r>
+        <w:rPr>
+          <w:rFonts w:ascii="Times New Roman" w:hAnsi="Times New Roman" w:cs="Times New Roman"/>
+          <w:lang w:val="nl-NL"/>
+        </w:rPr>
+        <w:t>version</w:t>
+      </w:r>
+      <w:proofErr w:type="spellEnd"/>
+      <w:r>
+        <w:rPr>
+          <w:rFonts w:ascii="Times New Roman" w:hAnsi="Times New Roman" w:cs="Times New Roman"/>
+          <w:lang w:val="nl-NL"/>
+        </w:rPr>
+        <w:t xml:space="preserve"> in 1998);</w:t>
       </w:r>
       <w:r>
         <w:rPr>
@@ -11531,14 +12897,88 @@
         </w:rPr>
         <w:t xml:space="preserve"> </w:t>
       </w:r>
+      <w:proofErr w:type="spellStart"/>
       <w:r>
         <w:rPr>
           <w:rFonts w:ascii="Times New Roman" w:hAnsi="Times New Roman" w:cs="Times New Roman"/>
           <w:i/>
           <w:lang w:val="nl-NL"/>
         </w:rPr>
-        <w:t>Working for the World Economy: A Personal History</w:t>
-      </w:r>
+        <w:t>Working</w:t>
+      </w:r>
+      <w:proofErr w:type="spellEnd"/>
+      <w:r>
+        <w:rPr>
+          <w:rFonts w:ascii="Times New Roman" w:hAnsi="Times New Roman" w:cs="Times New Roman"/>
+          <w:i/>
+          <w:lang w:val="nl-NL"/>
+        </w:rPr>
+        <w:t xml:space="preserve"> </w:t>
+      </w:r>
+      <w:proofErr w:type="spellStart"/>
+      <w:r>
+        <w:rPr>
+          <w:rFonts w:ascii="Times New Roman" w:hAnsi="Times New Roman" w:cs="Times New Roman"/>
+          <w:i/>
+          <w:lang w:val="nl-NL"/>
+        </w:rPr>
+        <w:t>for</w:t>
+      </w:r>
+      <w:proofErr w:type="spellEnd"/>
+      <w:r>
+        <w:rPr>
+          <w:rFonts w:ascii="Times New Roman" w:hAnsi="Times New Roman" w:cs="Times New Roman"/>
+          <w:i/>
+          <w:lang w:val="nl-NL"/>
+        </w:rPr>
+        <w:t xml:space="preserve"> </w:t>
+      </w:r>
+      <w:proofErr w:type="spellStart"/>
+      <w:r>
+        <w:rPr>
+          <w:rFonts w:ascii="Times New Roman" w:hAnsi="Times New Roman" w:cs="Times New Roman"/>
+          <w:i/>
+          <w:lang w:val="nl-NL"/>
+        </w:rPr>
+        <w:t>the</w:t>
+      </w:r>
+      <w:proofErr w:type="spellEnd"/>
+      <w:r>
+        <w:rPr>
+          <w:rFonts w:ascii="Times New Roman" w:hAnsi="Times New Roman" w:cs="Times New Roman"/>
+          <w:i/>
+          <w:lang w:val="nl-NL"/>
+        </w:rPr>
+        <w:t xml:space="preserve"> World </w:t>
+      </w:r>
+      <w:proofErr w:type="spellStart"/>
+      <w:r>
+        <w:rPr>
+          <w:rFonts w:ascii="Times New Roman" w:hAnsi="Times New Roman" w:cs="Times New Roman"/>
+          <w:i/>
+          <w:lang w:val="nl-NL"/>
+        </w:rPr>
+        <w:t>Economy</w:t>
+      </w:r>
+      <w:proofErr w:type="spellEnd"/>
+      <w:r>
+        <w:rPr>
+          <w:rFonts w:ascii="Times New Roman" w:hAnsi="Times New Roman" w:cs="Times New Roman"/>
+          <w:i/>
+          <w:lang w:val="nl-NL"/>
+        </w:rPr>
+        <w:t xml:space="preserve">: A Personal </w:t>
+      </w:r>
+      <w:proofErr w:type="spellStart"/>
+      <w:r>
+        <w:rPr>
+          <w:rFonts w:ascii="Times New Roman" w:hAnsi="Times New Roman" w:cs="Times New Roman"/>
+          <w:i/>
+          <w:lang w:val="nl-NL"/>
+        </w:rPr>
+        <w:t>History</w:t>
+      </w:r>
+      <w:proofErr w:type="spellEnd"/>
       <w:r>
         <w:rPr>
           <w:rFonts w:ascii="Times New Roman" w:hAnsi="Times New Roman" w:cs="Times New Roman"/>
@@ -11680,12 +13120,21 @@
         </w:rPr>
         <w:t>, ‘</w:t>
       </w:r>
-      <w:r>
-        <w:rPr>
-          <w:rFonts w:ascii="Times New Roman" w:hAnsi="Times New Roman" w:cs="Times New Roman"/>
-          <w:lang w:val="en-GB"/>
-        </w:rPr>
-        <w:t>Transgovernmental Interaction in the Inte</w:t>
+      <w:proofErr w:type="spellStart"/>
+      <w:r>
+        <w:rPr>
+          <w:rFonts w:ascii="Times New Roman" w:hAnsi="Times New Roman" w:cs="Times New Roman"/>
+          <w:lang w:val="en-GB"/>
+        </w:rPr>
+        <w:t>Transgovernmental</w:t>
+      </w:r>
+      <w:proofErr w:type="spellEnd"/>
+      <w:r>
+        <w:rPr>
+          <w:rFonts w:ascii="Times New Roman" w:hAnsi="Times New Roman" w:cs="Times New Roman"/>
+          <w:lang w:val="en-GB"/>
+        </w:rPr>
+        <w:t xml:space="preserve"> Interaction in the Inte</w:t>
       </w:r>
       <w:r>
         <w:rPr>
@@ -11864,13 +13313,41 @@
         </w:rPr>
         <w:t xml:space="preserve"> Szász, </w:t>
       </w:r>
+      <w:proofErr w:type="spellStart"/>
       <w:r>
         <w:rPr>
           <w:rFonts w:ascii="Times New Roman" w:hAnsi="Times New Roman" w:cs="Times New Roman"/>
           <w:i/>
           <w:lang w:val="en-GB"/>
         </w:rPr>
-        <w:t xml:space="preserve">Monetaire diplomatie. </w:t>
+        <w:t>Monetaire</w:t>
+      </w:r>
+      <w:proofErr w:type="spellEnd"/>
+      <w:r>
+        <w:rPr>
+          <w:rFonts w:ascii="Times New Roman" w:hAnsi="Times New Roman" w:cs="Times New Roman"/>
+          <w:i/>
+          <w:lang w:val="en-GB"/>
+        </w:rPr>
+        <w:t xml:space="preserve"> </w:t>
+      </w:r>
+      <w:proofErr w:type="spellStart"/>
+      <w:r>
+        <w:rPr>
+          <w:rFonts w:ascii="Times New Roman" w:hAnsi="Times New Roman" w:cs="Times New Roman"/>
+          <w:i/>
+          <w:lang w:val="en-GB"/>
+        </w:rPr>
+        <w:t>diplomatie</w:t>
+      </w:r>
+      <w:proofErr w:type="spellEnd"/>
+      <w:r>
+        <w:rPr>
+          <w:rFonts w:ascii="Times New Roman" w:hAnsi="Times New Roman" w:cs="Times New Roman"/>
+          <w:i/>
+          <w:lang w:val="en-GB"/>
+        </w:rPr>
+        <w:t xml:space="preserve">. </w:t>
       </w:r>
       <w:r>
         <w:rPr>
@@ -11899,7 +13376,23 @@
           <w:rFonts w:ascii="Times New Roman" w:hAnsi="Times New Roman" w:cs="Times New Roman"/>
           <w:lang w:val="nl-NL"/>
         </w:rPr>
-        <w:t>R. Janssen and M. d</w:t>
+        <w:t xml:space="preserve">R. Janssen </w:t>
+      </w:r>
+      <w:proofErr w:type="spellStart"/>
+      <w:r>
+        <w:rPr>
+          <w:rFonts w:ascii="Times New Roman" w:hAnsi="Times New Roman" w:cs="Times New Roman"/>
+          <w:lang w:val="nl-NL"/>
+        </w:rPr>
+        <w:t>and</w:t>
+      </w:r>
+      <w:proofErr w:type="spellEnd"/>
+      <w:r>
+        <w:rPr>
+          <w:rFonts w:ascii="Times New Roman" w:hAnsi="Times New Roman" w:cs="Times New Roman"/>
+          <w:lang w:val="nl-NL"/>
+        </w:rPr>
+        <w:t xml:space="preserve"> M. d</w:t>
       </w:r>
       <w:r>
         <w:rPr>
@@ -12000,12 +13493,21 @@
         </w:rPr>
         <w:t xml:space="preserve">; </w:t>
       </w:r>
+      <w:proofErr w:type="spellStart"/>
       <w:r>
         <w:rPr>
           <w:rFonts w:ascii="Times New Roman" w:hAnsi="Times New Roman" w:cs="Times New Roman"/>
           <w:lang w:val="nl-NL"/>
         </w:rPr>
-        <w:t xml:space="preserve">Bibeb, ‘Emile van Lennep: “Als regeringen mij een diner wilden aanbieden, zei ik: liever een concert”’ in </w:t>
+        <w:t>Bibeb</w:t>
+      </w:r>
+      <w:proofErr w:type="spellEnd"/>
+      <w:r>
+        <w:rPr>
+          <w:rFonts w:ascii="Times New Roman" w:hAnsi="Times New Roman" w:cs="Times New Roman"/>
+          <w:lang w:val="nl-NL"/>
+        </w:rPr>
+        <w:t xml:space="preserve">, ‘Emile van Lennep: “Als regeringen mij een diner wilden aanbieden, zei ik: liever een concert”’ in </w:t>
       </w:r>
       <w:r>
         <w:rPr>
@@ -12029,6 +13531,7 @@
         </w:rPr>
         <w:t xml:space="preserve">21 </w:t>
       </w:r>
+      <w:proofErr w:type="spellStart"/>
       <w:r>
         <w:rPr>
           <w:rFonts w:ascii="Times New Roman" w:hAnsi="Times New Roman" w:cs="Times New Roman"/>
@@ -12036,6 +13539,7 @@
         </w:rPr>
         <w:t>March</w:t>
       </w:r>
+      <w:proofErr w:type="spellEnd"/>
       <w:r>
         <w:rPr>
           <w:rFonts w:ascii="Times New Roman" w:hAnsi="Times New Roman" w:cs="Times New Roman"/>
@@ -12069,13 +13573,22 @@
           <w:rFonts w:ascii="Times New Roman" w:hAnsi="Times New Roman" w:cs="Times New Roman"/>
           <w:lang w:val="nl-NL"/>
         </w:rPr>
-        <w:t xml:space="preserve"> Chartier</w:t>
-      </w:r>
+        <w:t xml:space="preserve"> </w:t>
+      </w:r>
+      <w:proofErr w:type="spellStart"/>
       <w:r>
         <w:rPr>
           <w:rFonts w:ascii="Times New Roman" w:hAnsi="Times New Roman" w:cs="Times New Roman"/>
           <w:lang w:val="nl-NL"/>
         </w:rPr>
+        <w:t>Chartier</w:t>
+      </w:r>
+      <w:proofErr w:type="spellEnd"/>
+      <w:r>
+        <w:rPr>
+          <w:rFonts w:ascii="Times New Roman" w:hAnsi="Times New Roman" w:cs="Times New Roman"/>
+          <w:lang w:val="nl-NL"/>
+        </w:rPr>
         <w:t>, ‘</w:t>
       </w:r>
       <w:r>
@@ -12083,21 +13596,149 @@
           <w:rFonts w:ascii="Times New Roman" w:hAnsi="Times New Roman" w:cs="Times New Roman"/>
           <w:lang w:val="nl-NL"/>
         </w:rPr>
-        <w:t>Les Etats-Unis sont de</w:t>
-      </w:r>
+        <w:t xml:space="preserve">Les </w:t>
+      </w:r>
+      <w:proofErr w:type="spellStart"/>
       <w:r>
         <w:rPr>
           <w:rFonts w:ascii="Times New Roman" w:hAnsi="Times New Roman" w:cs="Times New Roman"/>
           <w:lang w:val="nl-NL"/>
         </w:rPr>
-        <w:t>venus un facteur d’</w:t>
-      </w:r>
+        <w:t>Etats-Unis</w:t>
+      </w:r>
+      <w:proofErr w:type="spellEnd"/>
       <w:r>
         <w:rPr>
           <w:rFonts w:ascii="Times New Roman" w:hAnsi="Times New Roman" w:cs="Times New Roman"/>
           <w:lang w:val="nl-NL"/>
         </w:rPr>
-        <w:t>instabilité: un entretien avec Emile van Lennep</w:t>
+        <w:t xml:space="preserve"> </w:t>
+      </w:r>
+      <w:proofErr w:type="spellStart"/>
+      <w:r>
+        <w:rPr>
+          <w:rFonts w:ascii="Times New Roman" w:hAnsi="Times New Roman" w:cs="Times New Roman"/>
+          <w:lang w:val="nl-NL"/>
+        </w:rPr>
+        <w:t>sont</w:t>
+      </w:r>
+      <w:proofErr w:type="spellEnd"/>
+      <w:r>
+        <w:rPr>
+          <w:rFonts w:ascii="Times New Roman" w:hAnsi="Times New Roman" w:cs="Times New Roman"/>
+          <w:lang w:val="nl-NL"/>
+        </w:rPr>
+        <w:t xml:space="preserve"> </w:t>
+      </w:r>
+      <w:proofErr w:type="spellStart"/>
+      <w:r>
+        <w:rPr>
+          <w:rFonts w:ascii="Times New Roman" w:hAnsi="Times New Roman" w:cs="Times New Roman"/>
+          <w:lang w:val="nl-NL"/>
+        </w:rPr>
+        <w:t>de</w:t>
+      </w:r>
+      <w:r>
+        <w:rPr>
+          <w:rFonts w:ascii="Times New Roman" w:hAnsi="Times New Roman" w:cs="Times New Roman"/>
+          <w:lang w:val="nl-NL"/>
+        </w:rPr>
+        <w:t>venus</w:t>
+      </w:r>
+      <w:proofErr w:type="spellEnd"/>
+      <w:r>
+        <w:rPr>
+          <w:rFonts w:ascii="Times New Roman" w:hAnsi="Times New Roman" w:cs="Times New Roman"/>
+          <w:lang w:val="nl-NL"/>
+        </w:rPr>
+        <w:t xml:space="preserve"> </w:t>
+      </w:r>
+      <w:proofErr w:type="spellStart"/>
+      <w:r>
+        <w:rPr>
+          <w:rFonts w:ascii="Times New Roman" w:hAnsi="Times New Roman" w:cs="Times New Roman"/>
+          <w:lang w:val="nl-NL"/>
+        </w:rPr>
+        <w:t>un</w:t>
+      </w:r>
+      <w:proofErr w:type="spellEnd"/>
+      <w:r>
+        <w:rPr>
+          <w:rFonts w:ascii="Times New Roman" w:hAnsi="Times New Roman" w:cs="Times New Roman"/>
+          <w:lang w:val="nl-NL"/>
+        </w:rPr>
+        <w:t xml:space="preserve"> facteur </w:t>
+      </w:r>
+      <w:proofErr w:type="spellStart"/>
+      <w:r>
+        <w:rPr>
+          <w:rFonts w:ascii="Times New Roman" w:hAnsi="Times New Roman" w:cs="Times New Roman"/>
+          <w:lang w:val="nl-NL"/>
+        </w:rPr>
+        <w:t>d’</w:t>
+      </w:r>
+      <w:r>
+        <w:rPr>
+          <w:rFonts w:ascii="Times New Roman" w:hAnsi="Times New Roman" w:cs="Times New Roman"/>
+          <w:lang w:val="nl-NL"/>
+        </w:rPr>
+        <w:t>instabilité</w:t>
+      </w:r>
+      <w:proofErr w:type="spellEnd"/>
+      <w:r>
+        <w:rPr>
+          <w:rFonts w:ascii="Times New Roman" w:hAnsi="Times New Roman" w:cs="Times New Roman"/>
+          <w:lang w:val="nl-NL"/>
+        </w:rPr>
+        <w:t xml:space="preserve">: </w:t>
+      </w:r>
+      <w:proofErr w:type="spellStart"/>
+      <w:r>
+        <w:rPr>
+          <w:rFonts w:ascii="Times New Roman" w:hAnsi="Times New Roman" w:cs="Times New Roman"/>
+          <w:lang w:val="nl-NL"/>
+        </w:rPr>
+        <w:t>un</w:t>
+      </w:r>
+      <w:proofErr w:type="spellEnd"/>
+      <w:r>
+        <w:rPr>
+          <w:rFonts w:ascii="Times New Roman" w:hAnsi="Times New Roman" w:cs="Times New Roman"/>
+          <w:lang w:val="nl-NL"/>
+        </w:rPr>
+        <w:t xml:space="preserve"> </w:t>
+      </w:r>
+      <w:proofErr w:type="spellStart"/>
+      <w:r>
+        <w:rPr>
+          <w:rFonts w:ascii="Times New Roman" w:hAnsi="Times New Roman" w:cs="Times New Roman"/>
+          <w:lang w:val="nl-NL"/>
+        </w:rPr>
+        <w:t>entretien</w:t>
+      </w:r>
+      <w:proofErr w:type="spellEnd"/>
+      <w:r>
+        <w:rPr>
+          <w:rFonts w:ascii="Times New Roman" w:hAnsi="Times New Roman" w:cs="Times New Roman"/>
+          <w:lang w:val="nl-NL"/>
+        </w:rPr>
+        <w:t xml:space="preserve"> </w:t>
+      </w:r>
+      <w:proofErr w:type="spellStart"/>
+      <w:r>
+        <w:rPr>
+          <w:rFonts w:ascii="Times New Roman" w:hAnsi="Times New Roman" w:cs="Times New Roman"/>
+          <w:lang w:val="nl-NL"/>
+        </w:rPr>
+        <w:t>avec</w:t>
+      </w:r>
+      <w:proofErr w:type="spellEnd"/>
+      <w:r>
+        <w:rPr>
+          <w:rFonts w:ascii="Times New Roman" w:hAnsi="Times New Roman" w:cs="Times New Roman"/>
+          <w:lang w:val="nl-NL"/>
+        </w:rPr>
+        <w:t xml:space="preserve"> Emile van Lennep</w:t>
       </w:r>
       <w:r>
         <w:rPr>
@@ -12142,18 +13783,27 @@
         </w:rPr>
         <w:t xml:space="preserve">10 </w:t>
       </w:r>
+      <w:proofErr w:type="spellStart"/>
       <w:r>
         <w:rPr>
           <w:rFonts w:ascii="Times New Roman" w:hAnsi="Times New Roman" w:cs="Times New Roman"/>
           <w:lang w:val="nl-NL"/>
         </w:rPr>
-        <w:t>January 1993</w:t>
-      </w:r>
+        <w:t>January</w:t>
+      </w:r>
+      <w:proofErr w:type="spellEnd"/>
       <w:r>
         <w:rPr>
           <w:rFonts w:ascii="Times New Roman" w:hAnsi="Times New Roman" w:cs="Times New Roman"/>
           <w:lang w:val="nl-NL"/>
         </w:rPr>
+        <w:t xml:space="preserve"> 1993</w:t>
+      </w:r>
+      <w:r>
+        <w:rPr>
+          <w:rFonts w:ascii="Times New Roman" w:hAnsi="Times New Roman" w:cs="Times New Roman"/>
+          <w:lang w:val="nl-NL"/>
+        </w:rPr>
         <w:t xml:space="preserve">; </w:t>
       </w:r>
       <w:r>
@@ -12168,7 +13818,23 @@
           <w:rFonts w:ascii="Times New Roman" w:hAnsi="Times New Roman" w:cs="Times New Roman"/>
           <w:lang w:val="nl-NL"/>
         </w:rPr>
-        <w:t>. van Lakerveld, ‘</w:t>
+        <w:t xml:space="preserve">. van </w:t>
+      </w:r>
+      <w:proofErr w:type="spellStart"/>
+      <w:r>
+        <w:rPr>
+          <w:rFonts w:ascii="Times New Roman" w:hAnsi="Times New Roman" w:cs="Times New Roman"/>
+          <w:lang w:val="nl-NL"/>
+        </w:rPr>
+        <w:t>Lakerveld</w:t>
+      </w:r>
+      <w:proofErr w:type="spellEnd"/>
+      <w:r>
+        <w:rPr>
+          <w:rFonts w:ascii="Times New Roman" w:hAnsi="Times New Roman" w:cs="Times New Roman"/>
+          <w:lang w:val="nl-NL"/>
+        </w:rPr>
+        <w:t>, ‘</w:t>
       </w:r>
       <w:r>
         <w:rPr>
@@ -12206,26 +13872,44 @@
         </w:rPr>
         <w:t xml:space="preserve">18 </w:t>
       </w:r>
+      <w:proofErr w:type="spellStart"/>
       <w:r>
         <w:rPr>
           <w:rFonts w:ascii="Times New Roman" w:hAnsi="Times New Roman" w:cs="Times New Roman"/>
           <w:lang w:val="nl-NL"/>
         </w:rPr>
-        <w:t>October 1996</w:t>
-      </w:r>
+        <w:t>October</w:t>
+      </w:r>
+      <w:proofErr w:type="spellEnd"/>
       <w:r>
         <w:rPr>
           <w:rFonts w:ascii="Times New Roman" w:hAnsi="Times New Roman" w:cs="Times New Roman"/>
           <w:lang w:val="nl-NL"/>
         </w:rPr>
+        <w:t xml:space="preserve"> 1996</w:t>
+      </w:r>
+      <w:r>
+        <w:rPr>
+          <w:rFonts w:ascii="Times New Roman" w:hAnsi="Times New Roman" w:cs="Times New Roman"/>
+          <w:lang w:val="nl-NL"/>
+        </w:rPr>
         <w:t xml:space="preserve">; </w:t>
       </w:r>
+      <w:proofErr w:type="spellStart"/>
       <w:r>
         <w:rPr>
           <w:rFonts w:ascii="Times New Roman" w:hAnsi="Times New Roman" w:cs="Times New Roman"/>
           <w:lang w:val="nl-NL"/>
         </w:rPr>
-        <w:t>J.Th. de Smidt</w:t>
+        <w:t>J.Th</w:t>
+      </w:r>
+      <w:proofErr w:type="spellEnd"/>
+      <w:r>
+        <w:rPr>
+          <w:rFonts w:ascii="Times New Roman" w:hAnsi="Times New Roman" w:cs="Times New Roman"/>
+          <w:lang w:val="nl-NL"/>
+        </w:rPr>
+        <w:t>. de Smidt</w:t>
       </w:r>
       <w:r>
         <w:rPr>
@@ -12261,65 +13945,25 @@
           <w:i/>
           <w:lang w:val="nl-NL"/>
         </w:rPr>
-        <w:t>Van tresorier tot thesaurier-generaal. Zes eeuwen financieel beleid in handen van e</w:t>
-      </w:r>
+        <w:t xml:space="preserve">Van </w:t>
+      </w:r>
+      <w:proofErr w:type="spellStart"/>
       <w:r>
         <w:rPr>
           <w:rFonts w:ascii="Times New Roman" w:hAnsi="Times New Roman" w:cs="Times New Roman"/>
           <w:i/>
           <w:lang w:val="nl-NL"/>
         </w:rPr>
-        <w:t>en hoge Nederlandse ambtsdrager</w:t>
-      </w:r>
-      <w:r>
-        <w:rPr>
-          <w:rFonts w:ascii="Times New Roman" w:hAnsi="Times New Roman" w:cs="Times New Roman"/>
-          <w:lang w:val="nl-NL"/>
-        </w:rPr>
-        <w:t xml:space="preserve">, </w:t>
-      </w:r>
-      <w:r>
-        <w:rPr>
-          <w:rFonts w:ascii="Times New Roman" w:hAnsi="Times New Roman" w:cs="Times New Roman"/>
-          <w:lang w:val="nl-NL"/>
-        </w:rPr>
-        <w:t xml:space="preserve">Hilversum 1996; </w:t>
-      </w:r>
-      <w:r>
-        <w:rPr>
-          <w:rFonts w:ascii="Times New Roman" w:hAnsi="Times New Roman" w:cs="Times New Roman"/>
-          <w:lang w:val="nl-NL"/>
-        </w:rPr>
-        <w:t>Obituaries</w:t>
-      </w:r>
-      <w:r>
-        <w:rPr>
-          <w:rFonts w:ascii="Times New Roman" w:hAnsi="Times New Roman" w:cs="Times New Roman"/>
-          <w:lang w:val="nl-NL"/>
-        </w:rPr>
-        <w:t xml:space="preserve"> in</w:t>
-      </w:r>
-      <w:r>
-        <w:rPr>
-          <w:rFonts w:ascii="Times New Roman" w:hAnsi="Times New Roman" w:cs="Times New Roman"/>
-          <w:lang w:val="nl-NL"/>
-        </w:rPr>
-        <w:t xml:space="preserve"> </w:t>
-      </w:r>
+        <w:t>tresorier</w:t>
+      </w:r>
+      <w:proofErr w:type="spellEnd"/>
       <w:r>
         <w:rPr>
           <w:rFonts w:ascii="Times New Roman" w:hAnsi="Times New Roman" w:cs="Times New Roman"/>
           <w:i/>
           <w:lang w:val="nl-NL"/>
         </w:rPr>
-        <w:t>Het Parool</w:t>
-      </w:r>
-      <w:r>
-        <w:rPr>
-          <w:rFonts w:ascii="Times New Roman" w:hAnsi="Times New Roman" w:cs="Times New Roman"/>
-          <w:lang w:val="nl-NL"/>
-        </w:rPr>
-        <w:t xml:space="preserve">, </w:t>
+        <w:t xml:space="preserve"> tot thesaurier-generaal. Zes eeuwen financieel beleid in handen van e</w:t>
       </w:r>
       <w:r>
         <w:rPr>
@@ -12327,7 +13971,7 @@
           <w:i/>
           <w:lang w:val="nl-NL"/>
         </w:rPr>
-        <w:t>NRC Handelsblad</w:t>
+        <w:t>en hoge Nederlandse ambtsdrager</w:t>
       </w:r>
       <w:r>
         <w:rPr>
@@ -12341,14 +13985,30 @@
           <w:rFonts w:ascii="Times New Roman" w:hAnsi="Times New Roman" w:cs="Times New Roman"/>
           <w:lang w:val="nl-NL"/>
         </w:rPr>
-        <w:t>3 October 1996</w:t>
-      </w:r>
+        <w:t xml:space="preserve">Hilversum 1996; </w:t>
+      </w:r>
+      <w:proofErr w:type="spellStart"/>
       <w:r>
         <w:rPr>
           <w:rFonts w:ascii="Times New Roman" w:hAnsi="Times New Roman" w:cs="Times New Roman"/>
           <w:lang w:val="nl-NL"/>
         </w:rPr>
-        <w:t xml:space="preserve">, </w:t>
+        <w:t>Obituaries</w:t>
+      </w:r>
+      <w:proofErr w:type="spellEnd"/>
+      <w:r>
+        <w:rPr>
+          <w:rFonts w:ascii="Times New Roman" w:hAnsi="Times New Roman" w:cs="Times New Roman"/>
+          <w:lang w:val="nl-NL"/>
+        </w:rPr>
+        <w:t xml:space="preserve"> in</w:t>
+      </w:r>
+      <w:r>
+        <w:rPr>
+          <w:rFonts w:ascii="Times New Roman" w:hAnsi="Times New Roman" w:cs="Times New Roman"/>
+          <w:lang w:val="nl-NL"/>
+        </w:rPr>
+        <w:t xml:space="preserve"> </w:t>
       </w:r>
       <w:r>
         <w:rPr>
@@ -12356,7 +14016,7 @@
           <w:i/>
           <w:lang w:val="nl-NL"/>
         </w:rPr>
-        <w:t>de Volkskrant</w:t>
+        <w:t>Het Parool</w:t>
       </w:r>
       <w:r>
         <w:rPr>
@@ -12371,7 +14031,37 @@
           <w:i/>
           <w:lang w:val="nl-NL"/>
         </w:rPr>
-        <w:t>Het Financieele Dagblad</w:t>
+        <w:t>NRC Handelsblad</w:t>
+      </w:r>
+      <w:r>
+        <w:rPr>
+          <w:rFonts w:ascii="Times New Roman" w:hAnsi="Times New Roman" w:cs="Times New Roman"/>
+          <w:lang w:val="nl-NL"/>
+        </w:rPr>
+        <w:t xml:space="preserve">, </w:t>
+      </w:r>
+      <w:r>
+        <w:rPr>
+          <w:rFonts w:ascii="Times New Roman" w:hAnsi="Times New Roman" w:cs="Times New Roman"/>
+          <w:lang w:val="nl-NL"/>
+        </w:rPr>
+        <w:t xml:space="preserve">3 </w:t>
+      </w:r>
+      <w:proofErr w:type="spellStart"/>
+      <w:r>
+        <w:rPr>
+          <w:rFonts w:ascii="Times New Roman" w:hAnsi="Times New Roman" w:cs="Times New Roman"/>
+          <w:lang w:val="nl-NL"/>
+        </w:rPr>
+        <w:t>October</w:t>
+      </w:r>
+      <w:proofErr w:type="spellEnd"/>
+      <w:r>
+        <w:rPr>
+          <w:rFonts w:ascii="Times New Roman" w:hAnsi="Times New Roman" w:cs="Times New Roman"/>
+          <w:lang w:val="nl-NL"/>
+        </w:rPr>
+        <w:t xml:space="preserve"> 1996</w:t>
       </w:r>
       <w:r>
         <w:rPr>
@@ -12386,21 +14076,14 @@
           <w:i/>
           <w:lang w:val="nl-NL"/>
         </w:rPr>
-        <w:t>Trouw</w:t>
+        <w:t>de Volkskrant</w:t>
       </w:r>
       <w:r>
         <w:rPr>
           <w:rFonts w:ascii="Times New Roman" w:hAnsi="Times New Roman" w:cs="Times New Roman"/>
           <w:lang w:val="nl-NL"/>
         </w:rPr>
-        <w:t>, 4 October 1996,</w:t>
-      </w:r>
-      <w:r>
-        <w:rPr>
-          <w:rFonts w:ascii="Times New Roman" w:hAnsi="Times New Roman" w:cs="Times New Roman"/>
-          <w:lang w:val="nl-NL"/>
-        </w:rPr>
-        <w:t xml:space="preserve"> </w:t>
+        <w:t xml:space="preserve">, </w:t>
       </w:r>
       <w:r>
         <w:rPr>
@@ -12408,72 +14091,32 @@
           <w:i/>
           <w:lang w:val="nl-NL"/>
         </w:rPr>
-        <w:t>The Independent</w:t>
-      </w:r>
-      <w:r>
-        <w:rPr>
-          <w:rFonts w:ascii="Times New Roman" w:hAnsi="Times New Roman" w:cs="Times New Roman"/>
-          <w:lang w:val="nl-NL"/>
-        </w:rPr>
-        <w:t xml:space="preserve">, </w:t>
-      </w:r>
+        <w:t xml:space="preserve">Het </w:t>
+      </w:r>
+      <w:proofErr w:type="spellStart"/>
       <w:r>
         <w:rPr>
           <w:rFonts w:ascii="Times New Roman" w:hAnsi="Times New Roman" w:cs="Times New Roman"/>
           <w:i/>
           <w:lang w:val="nl-NL"/>
         </w:rPr>
-        <w:t>Le Monde</w:t>
-      </w:r>
-      <w:r>
-        <w:rPr>
-          <w:rFonts w:ascii="Times New Roman" w:hAnsi="Times New Roman" w:cs="Times New Roman"/>
-          <w:lang w:val="nl-NL"/>
-        </w:rPr>
-        <w:t>, 7 October 1996;</w:t>
-      </w:r>
-      <w:r>
-        <w:rPr>
-          <w:rFonts w:ascii="Times New Roman" w:hAnsi="Times New Roman" w:cs="Times New Roman"/>
-          <w:lang w:val="nl-NL"/>
-        </w:rPr>
-        <w:t xml:space="preserve"> </w:t>
-      </w:r>
-      <w:r>
-        <w:rPr>
-          <w:rFonts w:ascii="Times New Roman" w:hAnsi="Times New Roman" w:cs="Times New Roman"/>
-          <w:lang w:val="nl-NL"/>
-        </w:rPr>
-        <w:t>A.F.P. Bakker and A.P.D</w:t>
-      </w:r>
-      <w:r>
-        <w:rPr>
-          <w:rFonts w:ascii="Times New Roman" w:hAnsi="Times New Roman" w:cs="Times New Roman"/>
-          <w:lang w:val="nl-NL"/>
-        </w:rPr>
-        <w:t>. Gruijters (</w:t>
-      </w:r>
-      <w:r>
-        <w:rPr>
-          <w:rFonts w:ascii="Times New Roman" w:hAnsi="Times New Roman" w:cs="Times New Roman"/>
-          <w:lang w:val="nl-NL"/>
-        </w:rPr>
-        <w:t>Ed</w:t>
-      </w:r>
-      <w:r>
-        <w:rPr>
-          <w:rFonts w:ascii="Times New Roman" w:hAnsi="Times New Roman" w:cs="Times New Roman"/>
-          <w:lang w:val="nl-NL"/>
-        </w:rPr>
-        <w:t xml:space="preserve">s), </w:t>
-      </w:r>
+        <w:t>Financieele</w:t>
+      </w:r>
+      <w:proofErr w:type="spellEnd"/>
       <w:r>
         <w:rPr>
           <w:rFonts w:ascii="Times New Roman" w:hAnsi="Times New Roman" w:cs="Times New Roman"/>
           <w:i/>
           <w:lang w:val="nl-NL"/>
         </w:rPr>
-        <w:t xml:space="preserve">A </w:t>
+        <w:t xml:space="preserve"> Dagblad</w:t>
+      </w:r>
+      <w:r>
+        <w:rPr>
+          <w:rFonts w:ascii="Times New Roman" w:hAnsi="Times New Roman" w:cs="Times New Roman"/>
+          <w:lang w:val="nl-NL"/>
+        </w:rPr>
+        <w:t xml:space="preserve">, </w:t>
       </w:r>
       <w:r>
         <w:rPr>
@@ -12481,12 +14124,226 @@
           <w:i/>
           <w:lang w:val="nl-NL"/>
         </w:rPr>
-        <w:t xml:space="preserve">Global Order of Sustainable Economic Growth. </w:t>
+        <w:t>Trouw</w:t>
+      </w:r>
+      <w:r>
+        <w:rPr>
+          <w:rFonts w:ascii="Times New Roman" w:hAnsi="Times New Roman" w:cs="Times New Roman"/>
+          <w:lang w:val="nl-NL"/>
+        </w:rPr>
+        <w:t xml:space="preserve">, 4 </w:t>
+      </w:r>
+      <w:proofErr w:type="spellStart"/>
+      <w:r>
+        <w:rPr>
+          <w:rFonts w:ascii="Times New Roman" w:hAnsi="Times New Roman" w:cs="Times New Roman"/>
+          <w:lang w:val="nl-NL"/>
+        </w:rPr>
+        <w:t>October</w:t>
+      </w:r>
+      <w:proofErr w:type="spellEnd"/>
+      <w:r>
+        <w:rPr>
+          <w:rFonts w:ascii="Times New Roman" w:hAnsi="Times New Roman" w:cs="Times New Roman"/>
+          <w:lang w:val="nl-NL"/>
+        </w:rPr>
+        <w:t xml:space="preserve"> 1996,</w:t>
+      </w:r>
+      <w:r>
+        <w:rPr>
+          <w:rFonts w:ascii="Times New Roman" w:hAnsi="Times New Roman" w:cs="Times New Roman"/>
+          <w:lang w:val="nl-NL"/>
+        </w:rPr>
+        <w:t xml:space="preserve"> </w:t>
       </w:r>
       <w:r>
         <w:rPr>
           <w:rFonts w:ascii="Times New Roman" w:hAnsi="Times New Roman" w:cs="Times New Roman"/>
           <w:i/>
+          <w:lang w:val="nl-NL"/>
+        </w:rPr>
+        <w:t>The Independent</w:t>
+      </w:r>
+      <w:r>
+        <w:rPr>
+          <w:rFonts w:ascii="Times New Roman" w:hAnsi="Times New Roman" w:cs="Times New Roman"/>
+          <w:lang w:val="nl-NL"/>
+        </w:rPr>
+        <w:t xml:space="preserve">, </w:t>
+      </w:r>
+      <w:r>
+        <w:rPr>
+          <w:rFonts w:ascii="Times New Roman" w:hAnsi="Times New Roman" w:cs="Times New Roman"/>
+          <w:i/>
+          <w:lang w:val="nl-NL"/>
+        </w:rPr>
+        <w:t>Le Monde</w:t>
+      </w:r>
+      <w:r>
+        <w:rPr>
+          <w:rFonts w:ascii="Times New Roman" w:hAnsi="Times New Roman" w:cs="Times New Roman"/>
+          <w:lang w:val="nl-NL"/>
+        </w:rPr>
+        <w:t xml:space="preserve">, 7 </w:t>
+      </w:r>
+      <w:proofErr w:type="spellStart"/>
+      <w:r>
+        <w:rPr>
+          <w:rFonts w:ascii="Times New Roman" w:hAnsi="Times New Roman" w:cs="Times New Roman"/>
+          <w:lang w:val="nl-NL"/>
+        </w:rPr>
+        <w:t>October</w:t>
+      </w:r>
+      <w:proofErr w:type="spellEnd"/>
+      <w:r>
+        <w:rPr>
+          <w:rFonts w:ascii="Times New Roman" w:hAnsi="Times New Roman" w:cs="Times New Roman"/>
+          <w:lang w:val="nl-NL"/>
+        </w:rPr>
+        <w:t xml:space="preserve"> 1996;</w:t>
+      </w:r>
+      <w:r>
+        <w:rPr>
+          <w:rFonts w:ascii="Times New Roman" w:hAnsi="Times New Roman" w:cs="Times New Roman"/>
+          <w:lang w:val="nl-NL"/>
+        </w:rPr>
+        <w:t xml:space="preserve"> </w:t>
+      </w:r>
+      <w:r>
+        <w:rPr>
+          <w:rFonts w:ascii="Times New Roman" w:hAnsi="Times New Roman" w:cs="Times New Roman"/>
+          <w:lang w:val="nl-NL"/>
+        </w:rPr>
+        <w:t xml:space="preserve">A.F.P. Bakker </w:t>
+      </w:r>
+      <w:proofErr w:type="spellStart"/>
+      <w:r>
+        <w:rPr>
+          <w:rFonts w:ascii="Times New Roman" w:hAnsi="Times New Roman" w:cs="Times New Roman"/>
+          <w:lang w:val="nl-NL"/>
+        </w:rPr>
+        <w:lastRenderedPageBreak/>
+        <w:t>and</w:t>
+      </w:r>
+      <w:proofErr w:type="spellEnd"/>
+      <w:r>
+        <w:rPr>
+          <w:rFonts w:ascii="Times New Roman" w:hAnsi="Times New Roman" w:cs="Times New Roman"/>
+          <w:lang w:val="nl-NL"/>
+        </w:rPr>
+        <w:t xml:space="preserve"> A.P.D</w:t>
+      </w:r>
+      <w:r>
+        <w:rPr>
+          <w:rFonts w:ascii="Times New Roman" w:hAnsi="Times New Roman" w:cs="Times New Roman"/>
+          <w:lang w:val="nl-NL"/>
+        </w:rPr>
+        <w:t xml:space="preserve">. </w:t>
+      </w:r>
+      <w:proofErr w:type="spellStart"/>
+      <w:r>
+        <w:rPr>
+          <w:rFonts w:ascii="Times New Roman" w:hAnsi="Times New Roman" w:cs="Times New Roman"/>
+          <w:lang w:val="nl-NL"/>
+        </w:rPr>
+        <w:t>Gruijters</w:t>
+      </w:r>
+      <w:proofErr w:type="spellEnd"/>
+      <w:r>
+        <w:rPr>
+          <w:rFonts w:ascii="Times New Roman" w:hAnsi="Times New Roman" w:cs="Times New Roman"/>
+          <w:lang w:val="nl-NL"/>
+        </w:rPr>
+        <w:t xml:space="preserve"> (</w:t>
+      </w:r>
+      <w:r>
+        <w:rPr>
+          <w:rFonts w:ascii="Times New Roman" w:hAnsi="Times New Roman" w:cs="Times New Roman"/>
+          <w:lang w:val="nl-NL"/>
+        </w:rPr>
+        <w:t>Ed</w:t>
+      </w:r>
+      <w:r>
+        <w:rPr>
+          <w:rFonts w:ascii="Times New Roman" w:hAnsi="Times New Roman" w:cs="Times New Roman"/>
+          <w:lang w:val="nl-NL"/>
+        </w:rPr>
+        <w:t xml:space="preserve">s), </w:t>
+      </w:r>
+      <w:r>
+        <w:rPr>
+          <w:rFonts w:ascii="Times New Roman" w:hAnsi="Times New Roman" w:cs="Times New Roman"/>
+          <w:i/>
+          <w:lang w:val="nl-NL"/>
+        </w:rPr>
+        <w:t xml:space="preserve">A </w:t>
+      </w:r>
+      <w:r>
+        <w:rPr>
+          <w:rFonts w:ascii="Times New Roman" w:hAnsi="Times New Roman" w:cs="Times New Roman"/>
+          <w:i/>
+          <w:lang w:val="nl-NL"/>
+        </w:rPr>
+        <w:t xml:space="preserve">Global Order of </w:t>
+      </w:r>
+      <w:proofErr w:type="spellStart"/>
+      <w:r>
+        <w:rPr>
+          <w:rFonts w:ascii="Times New Roman" w:hAnsi="Times New Roman" w:cs="Times New Roman"/>
+          <w:i/>
+          <w:lang w:val="nl-NL"/>
+        </w:rPr>
+        <w:t>Sustainable</w:t>
+      </w:r>
+      <w:proofErr w:type="spellEnd"/>
+      <w:r>
+        <w:rPr>
+          <w:rFonts w:ascii="Times New Roman" w:hAnsi="Times New Roman" w:cs="Times New Roman"/>
+          <w:i/>
+          <w:lang w:val="nl-NL"/>
+        </w:rPr>
+        <w:t xml:space="preserve"> </w:t>
+      </w:r>
+      <w:proofErr w:type="spellStart"/>
+      <w:r>
+        <w:rPr>
+          <w:rFonts w:ascii="Times New Roman" w:hAnsi="Times New Roman" w:cs="Times New Roman"/>
+          <w:i/>
+          <w:lang w:val="nl-NL"/>
+        </w:rPr>
+        <w:t>Economic</w:t>
+      </w:r>
+      <w:proofErr w:type="spellEnd"/>
+      <w:r>
+        <w:rPr>
+          <w:rFonts w:ascii="Times New Roman" w:hAnsi="Times New Roman" w:cs="Times New Roman"/>
+          <w:i/>
+          <w:lang w:val="nl-NL"/>
+        </w:rPr>
+        <w:t xml:space="preserve"> </w:t>
+      </w:r>
+      <w:proofErr w:type="spellStart"/>
+      <w:r>
+        <w:rPr>
+          <w:rFonts w:ascii="Times New Roman" w:hAnsi="Times New Roman" w:cs="Times New Roman"/>
+          <w:i/>
+          <w:lang w:val="nl-NL"/>
+        </w:rPr>
+        <w:t>Growth</w:t>
+      </w:r>
+      <w:proofErr w:type="spellEnd"/>
+      <w:r>
+        <w:rPr>
+          <w:rFonts w:ascii="Times New Roman" w:hAnsi="Times New Roman" w:cs="Times New Roman"/>
+          <w:i/>
+          <w:lang w:val="nl-NL"/>
+        </w:rPr>
+        <w:t xml:space="preserve">. </w:t>
+      </w:r>
+      <w:r>
+        <w:rPr>
+          <w:rFonts w:ascii="Times New Roman" w:hAnsi="Times New Roman" w:cs="Times New Roman"/>
+          <w:i/>
           <w:lang w:val="en-GB"/>
         </w:rPr>
         <w:t xml:space="preserve">Emile </w:t>
@@ -12507,20 +14364,30 @@
         </w:rPr>
         <w:t xml:space="preserve">an </w:t>
       </w:r>
+      <w:proofErr w:type="spellStart"/>
       <w:r>
         <w:rPr>
           <w:rFonts w:ascii="Times New Roman" w:hAnsi="Times New Roman" w:cs="Times New Roman"/>
           <w:i/>
           <w:lang w:val="en-GB"/>
         </w:rPr>
-        <w:t xml:space="preserve">Lennep </w:t>
-      </w:r>
+        <w:t>Lennep</w:t>
+      </w:r>
+      <w:proofErr w:type="spellEnd"/>
       <w:r>
         <w:rPr>
           <w:rFonts w:ascii="Times New Roman" w:hAnsi="Times New Roman" w:cs="Times New Roman"/>
           <w:i/>
           <w:lang w:val="en-GB"/>
         </w:rPr>
+        <w:t xml:space="preserve"> </w:t>
+      </w:r>
+      <w:r>
+        <w:rPr>
+          <w:rFonts w:ascii="Times New Roman" w:hAnsi="Times New Roman" w:cs="Times New Roman"/>
+          <w:i/>
+          <w:lang w:val="en-GB"/>
+        </w:rPr>
         <w:t>Memorial Conference</w:t>
       </w:r>
       <w:r>
@@ -12615,12 +14482,37 @@
         </w:rPr>
         <w:t>, ‘</w:t>
       </w:r>
-      <w:r>
-        <w:rPr>
-          <w:rFonts w:ascii="Times New Roman" w:hAnsi="Times New Roman" w:cs="Times New Roman"/>
-          <w:lang w:val="en-GB"/>
-        </w:rPr>
-        <w:t>Lennep, jhr. Emile van</w:t>
+      <w:proofErr w:type="spellStart"/>
+      <w:r>
+        <w:rPr>
+          <w:rFonts w:ascii="Times New Roman" w:hAnsi="Times New Roman" w:cs="Times New Roman"/>
+          <w:lang w:val="en-GB"/>
+        </w:rPr>
+        <w:t>Lennep</w:t>
+      </w:r>
+      <w:proofErr w:type="spellEnd"/>
+      <w:r>
+        <w:rPr>
+          <w:rFonts w:ascii="Times New Roman" w:hAnsi="Times New Roman" w:cs="Times New Roman"/>
+          <w:lang w:val="en-GB"/>
+        </w:rPr>
+        <w:t xml:space="preserve">, </w:t>
+      </w:r>
+      <w:proofErr w:type="spellStart"/>
+      <w:r>
+        <w:rPr>
+          <w:rFonts w:ascii="Times New Roman" w:hAnsi="Times New Roman" w:cs="Times New Roman"/>
+          <w:lang w:val="en-GB"/>
+        </w:rPr>
+        <w:t>jhr</w:t>
+      </w:r>
+      <w:proofErr w:type="spellEnd"/>
+      <w:r>
+        <w:rPr>
+          <w:rFonts w:ascii="Times New Roman" w:hAnsi="Times New Roman" w:cs="Times New Roman"/>
+          <w:lang w:val="en-GB"/>
+        </w:rPr>
+        <w:t>. Emile van</w:t>
       </w:r>
       <w:r>
         <w:rPr>
@@ -12636,13 +14528,41 @@
         </w:rPr>
         <w:t xml:space="preserve"> in </w:t>
       </w:r>
+      <w:proofErr w:type="spellStart"/>
       <w:r>
         <w:rPr>
           <w:rFonts w:ascii="Times New Roman" w:hAnsi="Times New Roman" w:cs="Times New Roman"/>
           <w:i/>
           <w:lang w:val="en-GB"/>
         </w:rPr>
-        <w:t>Biografisch Woordenboek van Nederland</w:t>
+        <w:t>Biografisch</w:t>
+      </w:r>
+      <w:proofErr w:type="spellEnd"/>
+      <w:r>
+        <w:rPr>
+          <w:rFonts w:ascii="Times New Roman" w:hAnsi="Times New Roman" w:cs="Times New Roman"/>
+          <w:i/>
+          <w:lang w:val="en-GB"/>
+        </w:rPr>
+        <w:t xml:space="preserve"> </w:t>
+      </w:r>
+      <w:proofErr w:type="spellStart"/>
+      <w:r>
+        <w:rPr>
+          <w:rFonts w:ascii="Times New Roman" w:hAnsi="Times New Roman" w:cs="Times New Roman"/>
+          <w:i/>
+          <w:lang w:val="en-GB"/>
+        </w:rPr>
+        <w:t>Woordenboek</w:t>
+      </w:r>
+      <w:proofErr w:type="spellEnd"/>
+      <w:r>
+        <w:rPr>
+          <w:rFonts w:ascii="Times New Roman" w:hAnsi="Times New Roman" w:cs="Times New Roman"/>
+          <w:i/>
+          <w:lang w:val="en-GB"/>
+        </w:rPr>
+        <w:t xml:space="preserve"> van Nederland</w:t>
       </w:r>
       <w:r>
         <w:rPr>
@@ -12665,7 +14585,7 @@
         </w:rPr>
         <w:t xml:space="preserve">286, available at </w:t>
       </w:r>
-      <w:hyperlink r:id="rId11" w:history="1">
+      <w:hyperlink r:id="rId10" w:history="1">
         <w:r>
           <w:rPr>
             <w:rStyle w:val="Hyperlink"/>
@@ -12774,7 +14694,6 @@
           <w:i/>
           <w:lang w:val="en-GB"/>
         </w:rPr>
-        <w:lastRenderedPageBreak/>
         <w:t>European Review of History</w:t>
       </w:r>
       <w:r>
@@ -12796,7 +14715,23 @@
           <w:rFonts w:ascii="Times New Roman" w:hAnsi="Times New Roman" w:cs="Times New Roman"/>
           <w:lang w:val="en-GB"/>
         </w:rPr>
-        <w:t xml:space="preserve">M. Leimgruber, ‘The Embattled Standard-Bearer of Social Insurance and Its Challenger: The ILO, the OECD and the “Crisis of the Welfare State”’, 1975-1985’ in S. Kott and J. Droux (Eds), </w:t>
+        <w:t xml:space="preserve">M. Leimgruber, ‘The Embattled Standard-Bearer of Social Insurance and Its Challenger: The ILO, the OECD and the “Crisis of the Welfare State”’, 1975-1985’ in S. Kott and J. </w:t>
+      </w:r>
+      <w:proofErr w:type="spellStart"/>
+      <w:r>
+        <w:rPr>
+          <w:rFonts w:ascii="Times New Roman" w:hAnsi="Times New Roman" w:cs="Times New Roman"/>
+          <w:lang w:val="en-GB"/>
+        </w:rPr>
+        <w:t>Droux</w:t>
+      </w:r>
+      <w:proofErr w:type="spellEnd"/>
+      <w:r>
+        <w:rPr>
+          <w:rFonts w:ascii="Times New Roman" w:hAnsi="Times New Roman" w:cs="Times New Roman"/>
+          <w:lang w:val="en-GB"/>
+        </w:rPr>
+        <w:t xml:space="preserve"> (Eds), </w:t>
       </w:r>
       <w:r>
         <w:rPr>
@@ -12924,14 +14859,94 @@
           <w:rFonts w:ascii="Times New Roman" w:hAnsi="Times New Roman" w:cs="Times New Roman"/>
           <w:lang w:val="en-GB"/>
         </w:rPr>
-        <w:t xml:space="preserve">Le keynésianisme international se débat. Sens de l’acceptable </w:t>
-      </w:r>
-      <w:r>
-        <w:rPr>
-          <w:rFonts w:ascii="Times New Roman" w:hAnsi="Times New Roman" w:cs="Times New Roman"/>
-          <w:lang w:val="en-GB"/>
-        </w:rPr>
-        <w:t>et tournant néolibéral à l’OCDE’ in</w:t>
+        <w:t xml:space="preserve">Le </w:t>
+      </w:r>
+      <w:proofErr w:type="spellStart"/>
+      <w:r>
+        <w:rPr>
+          <w:rFonts w:ascii="Times New Roman" w:hAnsi="Times New Roman" w:cs="Times New Roman"/>
+          <w:lang w:val="en-GB"/>
+        </w:rPr>
+        <w:t>keynésianisme</w:t>
+      </w:r>
+      <w:proofErr w:type="spellEnd"/>
+      <w:r>
+        <w:rPr>
+          <w:rFonts w:ascii="Times New Roman" w:hAnsi="Times New Roman" w:cs="Times New Roman"/>
+          <w:lang w:val="en-GB"/>
+        </w:rPr>
+        <w:t xml:space="preserve"> international se </w:t>
+      </w:r>
+      <w:proofErr w:type="spellStart"/>
+      <w:r>
+        <w:rPr>
+          <w:rFonts w:ascii="Times New Roman" w:hAnsi="Times New Roman" w:cs="Times New Roman"/>
+          <w:lang w:val="en-GB"/>
+        </w:rPr>
+        <w:t>débat</w:t>
+      </w:r>
+      <w:proofErr w:type="spellEnd"/>
+      <w:r>
+        <w:rPr>
+          <w:rFonts w:ascii="Times New Roman" w:hAnsi="Times New Roman" w:cs="Times New Roman"/>
+          <w:lang w:val="en-GB"/>
+        </w:rPr>
+        <w:t xml:space="preserve">. Sens de </w:t>
+      </w:r>
+      <w:proofErr w:type="spellStart"/>
+      <w:r>
+        <w:rPr>
+          <w:rFonts w:ascii="Times New Roman" w:hAnsi="Times New Roman" w:cs="Times New Roman"/>
+          <w:lang w:val="en-GB"/>
+        </w:rPr>
+        <w:t>l’acceptable</w:t>
+      </w:r>
+      <w:proofErr w:type="spellEnd"/>
+      <w:r>
+        <w:rPr>
+          <w:rFonts w:ascii="Times New Roman" w:hAnsi="Times New Roman" w:cs="Times New Roman"/>
+          <w:lang w:val="en-GB"/>
+        </w:rPr>
+        <w:t xml:space="preserve"> </w:t>
+      </w:r>
+      <w:r>
+        <w:rPr>
+          <w:rFonts w:ascii="Times New Roman" w:hAnsi="Times New Roman" w:cs="Times New Roman"/>
+          <w:lang w:val="en-GB"/>
+        </w:rPr>
+        <w:t xml:space="preserve">et tournant </w:t>
+      </w:r>
+      <w:proofErr w:type="spellStart"/>
+      <w:r>
+        <w:rPr>
+          <w:rFonts w:ascii="Times New Roman" w:hAnsi="Times New Roman" w:cs="Times New Roman"/>
+          <w:lang w:val="en-GB"/>
+        </w:rPr>
+        <w:t>néolibéral</w:t>
+      </w:r>
+      <w:proofErr w:type="spellEnd"/>
+      <w:r>
+        <w:rPr>
+          <w:rFonts w:ascii="Times New Roman" w:hAnsi="Times New Roman" w:cs="Times New Roman"/>
+          <w:lang w:val="en-GB"/>
+        </w:rPr>
+        <w:t xml:space="preserve"> à </w:t>
+      </w:r>
+      <w:proofErr w:type="spellStart"/>
+      <w:r>
+        <w:rPr>
+          <w:rFonts w:ascii="Times New Roman" w:hAnsi="Times New Roman" w:cs="Times New Roman"/>
+          <w:lang w:val="en-GB"/>
+        </w:rPr>
+        <w:t>l’OCDE</w:t>
+      </w:r>
+      <w:proofErr w:type="spellEnd"/>
+      <w:r>
+        <w:rPr>
+          <w:rFonts w:ascii="Times New Roman" w:hAnsi="Times New Roman" w:cs="Times New Roman"/>
+          <w:lang w:val="en-GB"/>
+        </w:rPr>
+        <w:t>’ in</w:t>
       </w:r>
       <w:r>
         <w:rPr>
@@ -12970,8 +14985,18 @@
           <w:i/>
           <w:lang w:val="en-GB"/>
         </w:rPr>
-        <w:t>Histoire, Sciences Sociales</w:t>
-      </w:r>
+        <w:t xml:space="preserve">Histoire, Sciences </w:t>
+      </w:r>
+      <w:proofErr w:type="spellStart"/>
+      <w:r>
+        <w:rPr>
+          <w:rFonts w:ascii="Times New Roman" w:hAnsi="Times New Roman" w:cs="Times New Roman"/>
+          <w:i/>
+          <w:lang w:val="en-GB"/>
+        </w:rPr>
+        <w:t>Sociales</w:t>
+      </w:r>
+      <w:proofErr w:type="spellEnd"/>
       <w:r>
         <w:rPr>
           <w:rFonts w:ascii="Times New Roman" w:hAnsi="Times New Roman" w:cs="Times New Roman"/>
@@ -13005,7 +15030,23 @@
           <w:rFonts w:ascii="Times New Roman" w:hAnsi="Times New Roman" w:cs="Times New Roman"/>
           <w:lang w:val="en-GB"/>
         </w:rPr>
-        <w:t>S. Beroud, ‘</w:t>
+        <w:t xml:space="preserve">S. </w:t>
+      </w:r>
+      <w:proofErr w:type="spellStart"/>
+      <w:r>
+        <w:rPr>
+          <w:rFonts w:ascii="Times New Roman" w:hAnsi="Times New Roman" w:cs="Times New Roman"/>
+          <w:lang w:val="en-GB"/>
+        </w:rPr>
+        <w:t>Beroud</w:t>
+      </w:r>
+      <w:proofErr w:type="spellEnd"/>
+      <w:r>
+        <w:rPr>
+          <w:rFonts w:ascii="Times New Roman" w:hAnsi="Times New Roman" w:cs="Times New Roman"/>
+          <w:lang w:val="en-GB"/>
+        </w:rPr>
+        <w:t>, ‘</w:t>
       </w:r>
       <w:r>
         <w:rPr>
@@ -13051,7 +15092,39 @@
           <w:rFonts w:ascii="Times New Roman" w:hAnsi="Times New Roman" w:cs="Times New Roman"/>
           <w:lang w:val="en-GB"/>
         </w:rPr>
-        <w:t xml:space="preserve">; ‘Jhr. Mr. E. (Emiel) van Lennep’ </w:t>
+        <w:t>; ‘</w:t>
+      </w:r>
+      <w:proofErr w:type="spellStart"/>
+      <w:r>
+        <w:rPr>
+          <w:rFonts w:ascii="Times New Roman" w:hAnsi="Times New Roman" w:cs="Times New Roman"/>
+          <w:lang w:val="en-GB"/>
+        </w:rPr>
+        <w:t>Jhr</w:t>
+      </w:r>
+      <w:proofErr w:type="spellEnd"/>
+      <w:r>
+        <w:rPr>
+          <w:rFonts w:ascii="Times New Roman" w:hAnsi="Times New Roman" w:cs="Times New Roman"/>
+          <w:lang w:val="en-GB"/>
+        </w:rPr>
+        <w:t xml:space="preserve">. Mr. E. (Emiel) van </w:t>
+      </w:r>
+      <w:proofErr w:type="spellStart"/>
+      <w:r>
+        <w:rPr>
+          <w:rFonts w:ascii="Times New Roman" w:hAnsi="Times New Roman" w:cs="Times New Roman"/>
+          <w:lang w:val="en-GB"/>
+        </w:rPr>
+        <w:t>Lennep</w:t>
+      </w:r>
+      <w:proofErr w:type="spellEnd"/>
+      <w:r>
+        <w:rPr>
+          <w:rFonts w:ascii="Times New Roman" w:hAnsi="Times New Roman" w:cs="Times New Roman"/>
+          <w:lang w:val="en-GB"/>
+        </w:rPr>
+        <w:t xml:space="preserve">’ </w:t>
       </w:r>
       <w:r>
         <w:rPr>
@@ -13067,7 +15140,7 @@
         </w:rPr>
         <w:t xml:space="preserve"> </w:t>
       </w:r>
-      <w:hyperlink r:id="rId12" w:history="1">
+      <w:hyperlink r:id="rId11" w:history="1">
         <w:r>
           <w:rPr>
             <w:rStyle w:val="Hyperlink"/>
@@ -13075,8 +15148,19 @@
             <w:u w:val="none"/>
             <w:lang w:val="en-GB"/>
           </w:rPr>
-          <w:t>www.parlement.com/id/vg09llh9vvxg/e_emiel _van_lennep</w:t>
+          <w:t>www.parlement.com/id/vg09llh9vvxg/e_emiel _</w:t>
         </w:r>
+        <w:proofErr w:type="spellStart"/>
+        <w:r>
+          <w:rPr>
+            <w:rStyle w:val="Hyperlink"/>
+            <w:rFonts w:ascii="Times New Roman" w:hAnsi="Times New Roman" w:cs="Times New Roman"/>
+            <w:u w:val="none"/>
+            <w:lang w:val="en-GB"/>
+          </w:rPr>
+          <w:t>van_lennep</w:t>
+        </w:r>
+        <w:proofErr w:type="spellEnd"/>
       </w:hyperlink>
       <w:r>
         <w:rPr>
@@ -13291,7 +15375,23 @@
           <w:rFonts w:ascii="Times New Roman" w:hAnsi="Times New Roman" w:cs="Times New Roman"/>
           <w:lang w:val="en-GB"/>
         </w:rPr>
-        <w:t>Van Lennep, Emile</w:t>
+        <w:t xml:space="preserve">Van </w:t>
+      </w:r>
+      <w:proofErr w:type="spellStart"/>
+      <w:r>
+        <w:rPr>
+          <w:rFonts w:ascii="Times New Roman" w:hAnsi="Times New Roman" w:cs="Times New Roman"/>
+          <w:lang w:val="en-GB"/>
+        </w:rPr>
+        <w:t>Lennep</w:t>
+      </w:r>
+      <w:proofErr w:type="spellEnd"/>
+      <w:r>
+        <w:rPr>
+          <w:rFonts w:ascii="Times New Roman" w:hAnsi="Times New Roman" w:cs="Times New Roman"/>
+          <w:lang w:val="en-GB"/>
+        </w:rPr>
+        <w:t>, Emile</w:t>
       </w:r>
       <w:r>
         <w:rPr>
@@ -13311,13 +15411,75 @@
           <w:rFonts w:ascii="Times New Roman" w:hAnsi="Times New Roman" w:cs="Times New Roman"/>
           <w:i/>
         </w:rPr>
-        <w:t>IO BIO, Biographical Dictionary of Secretaries-General of International Organizations</w:t>
-      </w:r>
-      <w:r>
-        <w:rPr>
-          <w:rFonts w:ascii="Times New Roman" w:hAnsi="Times New Roman" w:cs="Times New Roman"/>
-        </w:rPr>
-        <w:t xml:space="preserve">, Edited by Bob Reinalda, Kent J. Kille and Jaci </w:t>
+        <w:t xml:space="preserve">IO BIO, </w:t>
+      </w:r>
+      <w:proofErr w:type="spellStart"/>
+      <w:r>
+        <w:rPr>
+          <w:rFonts w:ascii="Times New Roman" w:hAnsi="Times New Roman" w:cs="Times New Roman"/>
+          <w:i/>
+        </w:rPr>
+        <w:t>Biographical</w:t>
+      </w:r>
+      <w:proofErr w:type="spellEnd"/>
+      <w:r>
+        <w:rPr>
+          <w:rFonts w:ascii="Times New Roman" w:hAnsi="Times New Roman" w:cs="Times New Roman"/>
+          <w:i/>
+        </w:rPr>
+        <w:t xml:space="preserve"> </w:t>
+      </w:r>
+      <w:proofErr w:type="spellStart"/>
+      <w:r>
+        <w:rPr>
+          <w:rFonts w:ascii="Times New Roman" w:hAnsi="Times New Roman" w:cs="Times New Roman"/>
+          <w:i/>
+        </w:rPr>
+        <w:t>Dictionary</w:t>
+      </w:r>
+      <w:proofErr w:type="spellEnd"/>
+      <w:r>
+        <w:rPr>
+          <w:rFonts w:ascii="Times New Roman" w:hAnsi="Times New Roman" w:cs="Times New Roman"/>
+          <w:i/>
+        </w:rPr>
+        <w:t xml:space="preserve"> of </w:t>
+      </w:r>
+      <w:proofErr w:type="spellStart"/>
+      <w:r>
+        <w:rPr>
+          <w:rFonts w:ascii="Times New Roman" w:hAnsi="Times New Roman" w:cs="Times New Roman"/>
+          <w:i/>
+        </w:rPr>
+        <w:t>Secretaries</w:t>
+      </w:r>
+      <w:proofErr w:type="spellEnd"/>
+      <w:r>
+        <w:rPr>
+          <w:rFonts w:ascii="Times New Roman" w:hAnsi="Times New Roman" w:cs="Times New Roman"/>
+          <w:i/>
+        </w:rPr>
+        <w:t>-General of International Organizations</w:t>
+      </w:r>
+      <w:r>
+        <w:rPr>
+          <w:rFonts w:ascii="Times New Roman" w:hAnsi="Times New Roman" w:cs="Times New Roman"/>
+        </w:rPr>
+        <w:t xml:space="preserve">, </w:t>
+      </w:r>
+      <w:proofErr w:type="spellStart"/>
+      <w:r>
+        <w:rPr>
+          <w:rFonts w:ascii="Times New Roman" w:hAnsi="Times New Roman" w:cs="Times New Roman"/>
+        </w:rPr>
+        <w:t>Edited</w:t>
+      </w:r>
+      <w:proofErr w:type="spellEnd"/>
+      <w:r>
+        <w:rPr>
+          <w:rFonts w:ascii="Times New Roman" w:hAnsi="Times New Roman" w:cs="Times New Roman"/>
+        </w:rPr>
+        <w:t xml:space="preserve"> by Bob Reinalda, Kent J. Kille and Jaci </w:t>
       </w:r>
       <w:r>
         <w:rPr>
@@ -13331,7 +15493,7 @@
         </w:rPr>
         <w:t xml:space="preserve">Eisenberg, </w:t>
       </w:r>
-      <w:hyperlink r:id="rId13" w:history="1">
+      <w:hyperlink r:id="rId12" w:history="1">
         <w:r>
           <w:rPr>
             <w:rStyle w:val="Hyperlink"/>
@@ -13345,13 +15507,27 @@
         <w:rPr>
           <w:rFonts w:ascii="Times New Roman" w:hAnsi="Times New Roman" w:cs="Times New Roman"/>
         </w:rPr>
-        <w:t>, Accessed DAY MONTH YEAR</w:t>
+        <w:t xml:space="preserve">, </w:t>
+      </w:r>
+      <w:proofErr w:type="spellStart"/>
+      <w:r>
+        <w:rPr>
+          <w:rFonts w:ascii="Times New Roman" w:hAnsi="Times New Roman" w:cs="Times New Roman"/>
+        </w:rPr>
+        <w:t>Accessed</w:t>
+      </w:r>
+      <w:proofErr w:type="spellEnd"/>
+      <w:r>
+        <w:rPr>
+          <w:rFonts w:ascii="Times New Roman" w:hAnsi="Times New Roman" w:cs="Times New Roman"/>
+        </w:rPr>
+        <w:t xml:space="preserve"> DAY MONTH YEAR</w:t>
       </w:r>
     </w:p>
     <w:sectPr>
-      <w:headerReference w:type="even" r:id="rId14"/>
-      <w:headerReference w:type="default" r:id="rId15"/>
-      <w:footerReference w:type="default" r:id="rId16"/>
+      <w:headerReference w:type="even" r:id="rId13"/>
+      <w:headerReference w:type="default" r:id="rId14"/>
+      <w:footerReference w:type="default" r:id="rId15"/>
       <w:pgSz w:w="11901" w:h="16840"/>
       <w:pgMar w:top="1418" w:right="1418" w:bottom="1418" w:left="1418" w:header="709" w:footer="709" w:gutter="0"/>
       <w:cols w:space="708"/>
@@ -13362,7 +15538,7 @@
 </file>
 
 <file path=word/endnotes.xml><?xml version="1.0" encoding="utf-8"?>
-<w:endnotes xmlns:wpc="http://schemas.microsoft.com/office/word/2010/wordprocessingCanvas" xmlns:cx="http://schemas.microsoft.com/office/drawing/2014/chartex" xmlns:cx1="http://schemas.microsoft.com/office/drawing/2015/9/8/chartex" xmlns:cx2="http://schemas.microsoft.com/office/drawing/2015/10/21/chartex" xmlns:cx3="http://schemas.microsoft.com/office/drawing/2016/5/9/chartex" xmlns:cx4="http://schemas.microsoft.com/office/drawing/2016/5/10/chartex" xmlns:cx5="http://schemas.microsoft.com/office/drawing/2016/5/11/chartex" xmlns:cx6="http://schemas.microsoft.com/office/drawing/2016/5/12/chartex" xmlns:cx7="http://schemas.microsoft.com/office/drawing/2016/5/13/chartex" xmlns:cx8="http://schemas.microsoft.com/office/drawing/2016/5/14/chartex" xmlns:mc="http://schemas.openxmlformats.org/markup-compatibility/2006" xmlns:aink="http://schemas.microsoft.com/office/drawing/2016/ink" xmlns:am3d="http://schemas.microsoft.com/office/drawing/2017/model3d" xmlns:o="urn:schemas-microsoft-com:office:office" xmlns:oel="http://schemas.microsoft.com/office/2019/extlst" xmlns:r="http://schemas.openxmlformats.org/officeDocument/2006/relationships" xmlns:m="http://schemas.openxmlformats.org/officeDocument/2006/math" xmlns:v="urn:schemas-microsoft-com:vml" xmlns:wp14="http://schemas.microsoft.com/office/word/2010/wordprocessingDrawing" xmlns:wp="http://schemas.openxmlformats.org/drawingml/2006/wordprocessingDrawing" xmlns:w10="urn:schemas-microsoft-com:office:word" xmlns:w="http://schemas.openxmlformats.org/wordprocessingml/2006/main" xmlns:w14="http://schemas.microsoft.com/office/word/2010/wordml" xmlns:w15="http://schemas.microsoft.com/office/word/2012/wordml" xmlns:w16cex="http://schemas.microsoft.com/office/word/2018/wordml/cex" xmlns:w16cid="http://schemas.microsoft.com/office/word/2016/wordml/cid" xmlns:w16="http://schemas.microsoft.com/office/word/2018/wordml" xmlns:w16du="http://schemas.microsoft.com/office/word/2023/wordml/word16du" xmlns:w16sdtdh="http://schemas.microsoft.com/office/word/2020/wordml/sdtdatahash" xmlns:w16sdtfl="http://schemas.microsoft.com/office/word/2024/wordml/sdtformatlock" xmlns:w16se="http://schemas.microsoft.com/office/word/2015/wordml/symex" xmlns:wpg="http://schemas.microsoft.com/office/word/2010/wordprocessingGroup" xmlns:wpi="http://schemas.microsoft.com/office/word/2010/wordprocessingInk" xmlns:wne="http://schemas.microsoft.com/office/word/2006/wordml" xmlns:wps="http://schemas.microsoft.com/office/word/2010/wordprocessingShape" mc:Ignorable="w14 w15 w16se w16cid w16 w16cex w16sdtdh w16sdtfl w16du wp14">
+<w:endnotes xmlns:wpc="http://schemas.microsoft.com/office/word/2010/wordprocessingCanvas" xmlns:cx="http://schemas.microsoft.com/office/drawing/2014/chartex" xmlns:cx1="http://schemas.microsoft.com/office/drawing/2015/9/8/chartex" xmlns:cx2="http://schemas.microsoft.com/office/drawing/2015/10/21/chartex" xmlns:cx3="http://schemas.microsoft.com/office/drawing/2016/5/9/chartex" xmlns:cx4="http://schemas.microsoft.com/office/drawing/2016/5/10/chartex" xmlns:cx5="http://schemas.microsoft.com/office/drawing/2016/5/11/chartex" xmlns:cx6="http://schemas.microsoft.com/office/drawing/2016/5/12/chartex" xmlns:cx7="http://schemas.microsoft.com/office/drawing/2016/5/13/chartex" xmlns:cx8="http://schemas.microsoft.com/office/drawing/2016/5/14/chartex" xmlns:mc="http://schemas.openxmlformats.org/markup-compatibility/2006" xmlns:m="http://schemas.openxmlformats.org/officeDocument/2006/math" xmlns:aink="http://schemas.microsoft.com/office/drawing/2016/ink" xmlns:am3d="http://schemas.microsoft.com/office/drawing/2017/model3d" xmlns:oel="http://schemas.microsoft.com/office/2019/extlst" xmlns:r="http://schemas.openxmlformats.org/officeDocument/2006/relationships" xmlns:wp14="http://schemas.microsoft.com/office/word/2010/wordprocessingDrawing" xmlns:wp="http://schemas.openxmlformats.org/drawingml/2006/wordprocessingDrawing" xmlns:wpg="http://schemas.microsoft.com/office/word/2010/wordprocessingGroup" xmlns:wpi="http://schemas.microsoft.com/office/word/2010/wordprocessingInk" xmlns:wps="http://schemas.microsoft.com/office/word/2010/wordprocessingShape" xmlns:o="urn:schemas-microsoft-com:office:office" xmlns:v="urn:schemas-microsoft-com:vml" xmlns:w10="urn:schemas-microsoft-com:office:word" xmlns:w="http://schemas.openxmlformats.org/wordprocessingml/2006/main" xmlns:w14="http://schemas.microsoft.com/office/word/2010/wordml" xmlns:w15="http://schemas.microsoft.com/office/word/2012/wordml" xmlns:w16cei="http://schemas.microsoft.com/office/word/2026/wordml/cei" xmlns:w16cex="http://schemas.microsoft.com/office/word/2018/wordml/cex" xmlns:w16cid="http://schemas.microsoft.com/office/word/2016/wordml/cid" xmlns:w16="http://schemas.microsoft.com/office/word/2018/wordml" xmlns:w16sdtdh="http://schemas.microsoft.com/office/word/2020/wordml/sdtdatahash" xmlns:w16sdtfl="http://schemas.microsoft.com/office/word/2024/wordml/sdtformatlock" xmlns:w16se="http://schemas.microsoft.com/office/word/2015/wordml/symex" xmlns:w16du="http://schemas.microsoft.com/office/word/2023/wordml/word16du" xmlns:wne="http://schemas.microsoft.com/office/word/2006/wordml" mc:Ignorable="w14 w15 w16se w16cid w16 w16cex w16sdtdh w16sdtfl w16du wp14">
   <w:endnote w:type="separator" w:id="-1">
     <w:p>
       <w:r>
@@ -13381,7 +15557,7 @@
 </file>
 
 <file path=word/footer1.xml><?xml version="1.0" encoding="utf-8"?>
-<w:ftr xmlns:wpc="http://schemas.microsoft.com/office/word/2010/wordprocessingCanvas" xmlns:cx="http://schemas.microsoft.com/office/drawing/2014/chartex" xmlns:cx1="http://schemas.microsoft.com/office/drawing/2015/9/8/chartex" xmlns:cx2="http://schemas.microsoft.com/office/drawing/2015/10/21/chartex" xmlns:cx3="http://schemas.microsoft.com/office/drawing/2016/5/9/chartex" xmlns:cx4="http://schemas.microsoft.com/office/drawing/2016/5/10/chartex" xmlns:cx5="http://schemas.microsoft.com/office/drawing/2016/5/11/chartex" xmlns:cx6="http://schemas.microsoft.com/office/drawing/2016/5/12/chartex" xmlns:cx7="http://schemas.microsoft.com/office/drawing/2016/5/13/chartex" xmlns:cx8="http://schemas.microsoft.com/office/drawing/2016/5/14/chartex" xmlns:mc="http://schemas.openxmlformats.org/markup-compatibility/2006" xmlns:aink="http://schemas.microsoft.com/office/drawing/2016/ink" xmlns:am3d="http://schemas.microsoft.com/office/drawing/2017/model3d" xmlns:o="urn:schemas-microsoft-com:office:office" xmlns:oel="http://schemas.microsoft.com/office/2019/extlst" xmlns:r="http://schemas.openxmlformats.org/officeDocument/2006/relationships" xmlns:m="http://schemas.openxmlformats.org/officeDocument/2006/math" xmlns:v="urn:schemas-microsoft-com:vml" xmlns:wp14="http://schemas.microsoft.com/office/word/2010/wordprocessingDrawing" xmlns:wp="http://schemas.openxmlformats.org/drawingml/2006/wordprocessingDrawing" xmlns:w10="urn:schemas-microsoft-com:office:word" xmlns:w="http://schemas.openxmlformats.org/wordprocessingml/2006/main" xmlns:w14="http://schemas.microsoft.com/office/word/2010/wordml" xmlns:w15="http://schemas.microsoft.com/office/word/2012/wordml" xmlns:w16cex="http://schemas.microsoft.com/office/word/2018/wordml/cex" xmlns:w16cid="http://schemas.microsoft.com/office/word/2016/wordml/cid" xmlns:w16="http://schemas.microsoft.com/office/word/2018/wordml" xmlns:w16du="http://schemas.microsoft.com/office/word/2023/wordml/word16du" xmlns:w16sdtdh="http://schemas.microsoft.com/office/word/2020/wordml/sdtdatahash" xmlns:w16sdtfl="http://schemas.microsoft.com/office/word/2024/wordml/sdtformatlock" xmlns:w16se="http://schemas.microsoft.com/office/word/2015/wordml/symex" xmlns:wpg="http://schemas.microsoft.com/office/word/2010/wordprocessingGroup" xmlns:wpi="http://schemas.microsoft.com/office/word/2010/wordprocessingInk" xmlns:wne="http://schemas.microsoft.com/office/word/2006/wordml" xmlns:wps="http://schemas.microsoft.com/office/word/2010/wordprocessingShape" mc:Ignorable="w14 w15 w16se w16cid w16 w16cex w16sdtdh w16sdtfl w16du wp14">
+<w:ftr xmlns:wpc="http://schemas.microsoft.com/office/word/2010/wordprocessingCanvas" xmlns:cx="http://schemas.microsoft.com/office/drawing/2014/chartex" xmlns:cx1="http://schemas.microsoft.com/office/drawing/2015/9/8/chartex" xmlns:cx2="http://schemas.microsoft.com/office/drawing/2015/10/21/chartex" xmlns:cx3="http://schemas.microsoft.com/office/drawing/2016/5/9/chartex" xmlns:cx4="http://schemas.microsoft.com/office/drawing/2016/5/10/chartex" xmlns:cx5="http://schemas.microsoft.com/office/drawing/2016/5/11/chartex" xmlns:cx6="http://schemas.microsoft.com/office/drawing/2016/5/12/chartex" xmlns:cx7="http://schemas.microsoft.com/office/drawing/2016/5/13/chartex" xmlns:cx8="http://schemas.microsoft.com/office/drawing/2016/5/14/chartex" xmlns:mc="http://schemas.openxmlformats.org/markup-compatibility/2006" xmlns:m="http://schemas.openxmlformats.org/officeDocument/2006/math" xmlns:aink="http://schemas.microsoft.com/office/drawing/2016/ink" xmlns:am3d="http://schemas.microsoft.com/office/drawing/2017/model3d" xmlns:oel="http://schemas.microsoft.com/office/2019/extlst" xmlns:r="http://schemas.openxmlformats.org/officeDocument/2006/relationships" xmlns:wp14="http://schemas.microsoft.com/office/word/2010/wordprocessingDrawing" xmlns:wp="http://schemas.openxmlformats.org/drawingml/2006/wordprocessingDrawing" xmlns:wpg="http://schemas.microsoft.com/office/word/2010/wordprocessingGroup" xmlns:wpi="http://schemas.microsoft.com/office/word/2010/wordprocessingInk" xmlns:wps="http://schemas.microsoft.com/office/word/2010/wordprocessingShape" xmlns:o="urn:schemas-microsoft-com:office:office" xmlns:v="urn:schemas-microsoft-com:vml" xmlns:w10="urn:schemas-microsoft-com:office:word" xmlns:w="http://schemas.openxmlformats.org/wordprocessingml/2006/main" xmlns:w14="http://schemas.microsoft.com/office/word/2010/wordml" xmlns:w15="http://schemas.microsoft.com/office/word/2012/wordml" xmlns:w16cei="http://schemas.microsoft.com/office/word/2026/wordml/cei" xmlns:w16cex="http://schemas.microsoft.com/office/word/2018/wordml/cex" xmlns:w16cid="http://schemas.microsoft.com/office/word/2016/wordml/cid" xmlns:w16="http://schemas.microsoft.com/office/word/2018/wordml" xmlns:w16sdtdh="http://schemas.microsoft.com/office/word/2020/wordml/sdtdatahash" xmlns:w16sdtfl="http://schemas.microsoft.com/office/word/2024/wordml/sdtformatlock" xmlns:w16se="http://schemas.microsoft.com/office/word/2015/wordml/symex" xmlns:w16du="http://schemas.microsoft.com/office/word/2023/wordml/word16du" xmlns:wne="http://schemas.microsoft.com/office/word/2006/wordml" mc:Ignorable="w14 w15 w16se w16cid w16 w16cex w16sdtdh w16sdtfl w16du wp14">
   <w:p>
     <w:pPr>
       <w:pStyle w:val="Voettekst"/>
@@ -13433,7 +15609,7 @@
 </file>
 
 <file path=word/footnotes.xml><?xml version="1.0" encoding="utf-8"?>
-<w:footnotes xmlns:wpc="http://schemas.microsoft.com/office/word/2010/wordprocessingCanvas" xmlns:cx="http://schemas.microsoft.com/office/drawing/2014/chartex" xmlns:cx1="http://schemas.microsoft.com/office/drawing/2015/9/8/chartex" xmlns:cx2="http://schemas.microsoft.com/office/drawing/2015/10/21/chartex" xmlns:cx3="http://schemas.microsoft.com/office/drawing/2016/5/9/chartex" xmlns:cx4="http://schemas.microsoft.com/office/drawing/2016/5/10/chartex" xmlns:cx5="http://schemas.microsoft.com/office/drawing/2016/5/11/chartex" xmlns:cx6="http://schemas.microsoft.com/office/drawing/2016/5/12/chartex" xmlns:cx7="http://schemas.microsoft.com/office/drawing/2016/5/13/chartex" xmlns:cx8="http://schemas.microsoft.com/office/drawing/2016/5/14/chartex" xmlns:mc="http://schemas.openxmlformats.org/markup-compatibility/2006" xmlns:aink="http://schemas.microsoft.com/office/drawing/2016/ink" xmlns:am3d="http://schemas.microsoft.com/office/drawing/2017/model3d" xmlns:o="urn:schemas-microsoft-com:office:office" xmlns:oel="http://schemas.microsoft.com/office/2019/extlst" xmlns:r="http://schemas.openxmlformats.org/officeDocument/2006/relationships" xmlns:m="http://schemas.openxmlformats.org/officeDocument/2006/math" xmlns:v="urn:schemas-microsoft-com:vml" xmlns:wp14="http://schemas.microsoft.com/office/word/2010/wordprocessingDrawing" xmlns:wp="http://schemas.openxmlformats.org/drawingml/2006/wordprocessingDrawing" xmlns:w10="urn:schemas-microsoft-com:office:word" xmlns:w="http://schemas.openxmlformats.org/wordprocessingml/2006/main" xmlns:w14="http://schemas.microsoft.com/office/word/2010/wordml" xmlns:w15="http://schemas.microsoft.com/office/word/2012/wordml" xmlns:w16cex="http://schemas.microsoft.com/office/word/2018/wordml/cex" xmlns:w16cid="http://schemas.microsoft.com/office/word/2016/wordml/cid" xmlns:w16="http://schemas.microsoft.com/office/word/2018/wordml" xmlns:w16du="http://schemas.microsoft.com/office/word/2023/wordml/word16du" xmlns:w16sdtdh="http://schemas.microsoft.com/office/word/2020/wordml/sdtdatahash" xmlns:w16sdtfl="http://schemas.microsoft.com/office/word/2024/wordml/sdtformatlock" xmlns:w16se="http://schemas.microsoft.com/office/word/2015/wordml/symex" xmlns:wpg="http://schemas.microsoft.com/office/word/2010/wordprocessingGroup" xmlns:wpi="http://schemas.microsoft.com/office/word/2010/wordprocessingInk" xmlns:wne="http://schemas.microsoft.com/office/word/2006/wordml" xmlns:wps="http://schemas.microsoft.com/office/word/2010/wordprocessingShape" mc:Ignorable="w14 w15 w16se w16cid w16 w16cex w16sdtdh w16sdtfl w16du wp14">
+<w:footnotes xmlns:wpc="http://schemas.microsoft.com/office/word/2010/wordprocessingCanvas" xmlns:cx="http://schemas.microsoft.com/office/drawing/2014/chartex" xmlns:cx1="http://schemas.microsoft.com/office/drawing/2015/9/8/chartex" xmlns:cx2="http://schemas.microsoft.com/office/drawing/2015/10/21/chartex" xmlns:cx3="http://schemas.microsoft.com/office/drawing/2016/5/9/chartex" xmlns:cx4="http://schemas.microsoft.com/office/drawing/2016/5/10/chartex" xmlns:cx5="http://schemas.microsoft.com/office/drawing/2016/5/11/chartex" xmlns:cx6="http://schemas.microsoft.com/office/drawing/2016/5/12/chartex" xmlns:cx7="http://schemas.microsoft.com/office/drawing/2016/5/13/chartex" xmlns:cx8="http://schemas.microsoft.com/office/drawing/2016/5/14/chartex" xmlns:mc="http://schemas.openxmlformats.org/markup-compatibility/2006" xmlns:m="http://schemas.openxmlformats.org/officeDocument/2006/math" xmlns:aink="http://schemas.microsoft.com/office/drawing/2016/ink" xmlns:am3d="http://schemas.microsoft.com/office/drawing/2017/model3d" xmlns:oel="http://schemas.microsoft.com/office/2019/extlst" xmlns:r="http://schemas.openxmlformats.org/officeDocument/2006/relationships" xmlns:wp14="http://schemas.microsoft.com/office/word/2010/wordprocessingDrawing" xmlns:wp="http://schemas.openxmlformats.org/drawingml/2006/wordprocessingDrawing" xmlns:wpg="http://schemas.microsoft.com/office/word/2010/wordprocessingGroup" xmlns:wpi="http://schemas.microsoft.com/office/word/2010/wordprocessingInk" xmlns:wps="http://schemas.microsoft.com/office/word/2010/wordprocessingShape" xmlns:o="urn:schemas-microsoft-com:office:office" xmlns:v="urn:schemas-microsoft-com:vml" xmlns:w10="urn:schemas-microsoft-com:office:word" xmlns:w="http://schemas.openxmlformats.org/wordprocessingml/2006/main" xmlns:w14="http://schemas.microsoft.com/office/word/2010/wordml" xmlns:w15="http://schemas.microsoft.com/office/word/2012/wordml" xmlns:w16cei="http://schemas.microsoft.com/office/word/2026/wordml/cei" xmlns:w16cex="http://schemas.microsoft.com/office/word/2018/wordml/cex" xmlns:w16cid="http://schemas.microsoft.com/office/word/2016/wordml/cid" xmlns:w16="http://schemas.microsoft.com/office/word/2018/wordml" xmlns:w16sdtdh="http://schemas.microsoft.com/office/word/2020/wordml/sdtdatahash" xmlns:w16sdtfl="http://schemas.microsoft.com/office/word/2024/wordml/sdtformatlock" xmlns:w16se="http://schemas.microsoft.com/office/word/2015/wordml/symex" xmlns:w16du="http://schemas.microsoft.com/office/word/2023/wordml/word16du" xmlns:wne="http://schemas.microsoft.com/office/word/2006/wordml" mc:Ignorable="w14 w15 w16se w16cid w16 w16cex w16sdtdh w16sdtfl w16du wp14">
   <w:footnote w:type="separator" w:id="-1">
     <w:p>
       <w:r>
@@ -13452,7 +15628,7 @@
 </file>
 
 <file path=word/header1.xml><?xml version="1.0" encoding="utf-8"?>
-<w:hdr xmlns:wpc="http://schemas.microsoft.com/office/word/2010/wordprocessingCanvas" xmlns:cx="http://schemas.microsoft.com/office/drawing/2014/chartex" xmlns:cx1="http://schemas.microsoft.com/office/drawing/2015/9/8/chartex" xmlns:cx2="http://schemas.microsoft.com/office/drawing/2015/10/21/chartex" xmlns:cx3="http://schemas.microsoft.com/office/drawing/2016/5/9/chartex" xmlns:cx4="http://schemas.microsoft.com/office/drawing/2016/5/10/chartex" xmlns:cx5="http://schemas.microsoft.com/office/drawing/2016/5/11/chartex" xmlns:cx6="http://schemas.microsoft.com/office/drawing/2016/5/12/chartex" xmlns:cx7="http://schemas.microsoft.com/office/drawing/2016/5/13/chartex" xmlns:cx8="http://schemas.microsoft.com/office/drawing/2016/5/14/chartex" xmlns:mc="http://schemas.openxmlformats.org/markup-compatibility/2006" xmlns:aink="http://schemas.microsoft.com/office/drawing/2016/ink" xmlns:am3d="http://schemas.microsoft.com/office/drawing/2017/model3d" xmlns:o="urn:schemas-microsoft-com:office:office" xmlns:oel="http://schemas.microsoft.com/office/2019/extlst" xmlns:r="http://schemas.openxmlformats.org/officeDocument/2006/relationships" xmlns:m="http://schemas.openxmlformats.org/officeDocument/2006/math" xmlns:v="urn:schemas-microsoft-com:vml" xmlns:wp14="http://schemas.microsoft.com/office/word/2010/wordprocessingDrawing" xmlns:wp="http://schemas.openxmlformats.org/drawingml/2006/wordprocessingDrawing" xmlns:w10="urn:schemas-microsoft-com:office:word" xmlns:w="http://schemas.openxmlformats.org/wordprocessingml/2006/main" xmlns:w14="http://schemas.microsoft.com/office/word/2010/wordml" xmlns:w15="http://schemas.microsoft.com/office/word/2012/wordml" xmlns:w16cex="http://schemas.microsoft.com/office/word/2018/wordml/cex" xmlns:w16cid="http://schemas.microsoft.com/office/word/2016/wordml/cid" xmlns:w16="http://schemas.microsoft.com/office/word/2018/wordml" xmlns:w16du="http://schemas.microsoft.com/office/word/2023/wordml/word16du" xmlns:w16sdtdh="http://schemas.microsoft.com/office/word/2020/wordml/sdtdatahash" xmlns:w16sdtfl="http://schemas.microsoft.com/office/word/2024/wordml/sdtformatlock" xmlns:w16se="http://schemas.microsoft.com/office/word/2015/wordml/symex" xmlns:wpg="http://schemas.microsoft.com/office/word/2010/wordprocessingGroup" xmlns:wpi="http://schemas.microsoft.com/office/word/2010/wordprocessingInk" xmlns:wne="http://schemas.microsoft.com/office/word/2006/wordml" xmlns:wps="http://schemas.microsoft.com/office/word/2010/wordprocessingShape" mc:Ignorable="w14 w15 w16se w16cid w16 w16cex w16sdtdh w16sdtfl w16du wp14">
+<w:hdr xmlns:wpc="http://schemas.microsoft.com/office/word/2010/wordprocessingCanvas" xmlns:cx="http://schemas.microsoft.com/office/drawing/2014/chartex" xmlns:cx1="http://schemas.microsoft.com/office/drawing/2015/9/8/chartex" xmlns:cx2="http://schemas.microsoft.com/office/drawing/2015/10/21/chartex" xmlns:cx3="http://schemas.microsoft.com/office/drawing/2016/5/9/chartex" xmlns:cx4="http://schemas.microsoft.com/office/drawing/2016/5/10/chartex" xmlns:cx5="http://schemas.microsoft.com/office/drawing/2016/5/11/chartex" xmlns:cx6="http://schemas.microsoft.com/office/drawing/2016/5/12/chartex" xmlns:cx7="http://schemas.microsoft.com/office/drawing/2016/5/13/chartex" xmlns:cx8="http://schemas.microsoft.com/office/drawing/2016/5/14/chartex" xmlns:mc="http://schemas.openxmlformats.org/markup-compatibility/2006" xmlns:m="http://schemas.openxmlformats.org/officeDocument/2006/math" xmlns:aink="http://schemas.microsoft.com/office/drawing/2016/ink" xmlns:am3d="http://schemas.microsoft.com/office/drawing/2017/model3d" xmlns:oel="http://schemas.microsoft.com/office/2019/extlst" xmlns:r="http://schemas.openxmlformats.org/officeDocument/2006/relationships" xmlns:wp14="http://schemas.microsoft.com/office/word/2010/wordprocessingDrawing" xmlns:wp="http://schemas.openxmlformats.org/drawingml/2006/wordprocessingDrawing" xmlns:wpg="http://schemas.microsoft.com/office/word/2010/wordprocessingGroup" xmlns:wpi="http://schemas.microsoft.com/office/word/2010/wordprocessingInk" xmlns:wps="http://schemas.microsoft.com/office/word/2010/wordprocessingShape" xmlns:o="urn:schemas-microsoft-com:office:office" xmlns:v="urn:schemas-microsoft-com:vml" xmlns:w10="urn:schemas-microsoft-com:office:word" xmlns:w="http://schemas.openxmlformats.org/wordprocessingml/2006/main" xmlns:w14="http://schemas.microsoft.com/office/word/2010/wordml" xmlns:w15="http://schemas.microsoft.com/office/word/2012/wordml" xmlns:w16cei="http://schemas.microsoft.com/office/word/2026/wordml/cei" xmlns:w16cex="http://schemas.microsoft.com/office/word/2018/wordml/cex" xmlns:w16cid="http://schemas.microsoft.com/office/word/2016/wordml/cid" xmlns:w16="http://schemas.microsoft.com/office/word/2018/wordml" xmlns:w16sdtdh="http://schemas.microsoft.com/office/word/2020/wordml/sdtdatahash" xmlns:w16sdtfl="http://schemas.microsoft.com/office/word/2024/wordml/sdtformatlock" xmlns:w16se="http://schemas.microsoft.com/office/word/2015/wordml/symex" xmlns:w16du="http://schemas.microsoft.com/office/word/2023/wordml/word16du" xmlns:wne="http://schemas.microsoft.com/office/word/2006/wordml" mc:Ignorable="w14 w15 w16se w16cid w16 w16cex w16sdtdh w16sdtfl w16du wp14">
   <w:p>
     <w:pPr>
       <w:pStyle w:val="Koptekst"/>
@@ -13518,7 +15694,7 @@
 </file>
 
 <file path=word/header2.xml><?xml version="1.0" encoding="utf-8"?>
-<w:hdr xmlns:wpc="http://schemas.microsoft.com/office/word/2010/wordprocessingCanvas" xmlns:cx="http://schemas.microsoft.com/office/drawing/2014/chartex" xmlns:cx1="http://schemas.microsoft.com/office/drawing/2015/9/8/chartex" xmlns:cx2="http://schemas.microsoft.com/office/drawing/2015/10/21/chartex" xmlns:cx3="http://schemas.microsoft.com/office/drawing/2016/5/9/chartex" xmlns:cx4="http://schemas.microsoft.com/office/drawing/2016/5/10/chartex" xmlns:cx5="http://schemas.microsoft.com/office/drawing/2016/5/11/chartex" xmlns:cx6="http://schemas.microsoft.com/office/drawing/2016/5/12/chartex" xmlns:cx7="http://schemas.microsoft.com/office/drawing/2016/5/13/chartex" xmlns:cx8="http://schemas.microsoft.com/office/drawing/2016/5/14/chartex" xmlns:mc="http://schemas.openxmlformats.org/markup-compatibility/2006" xmlns:aink="http://schemas.microsoft.com/office/drawing/2016/ink" xmlns:am3d="http://schemas.microsoft.com/office/drawing/2017/model3d" xmlns:o="urn:schemas-microsoft-com:office:office" xmlns:oel="http://schemas.microsoft.com/office/2019/extlst" xmlns:r="http://schemas.openxmlformats.org/officeDocument/2006/relationships" xmlns:m="http://schemas.openxmlformats.org/officeDocument/2006/math" xmlns:v="urn:schemas-microsoft-com:vml" xmlns:wp14="http://schemas.microsoft.com/office/word/2010/wordprocessingDrawing" xmlns:wp="http://schemas.openxmlformats.org/drawingml/2006/wordprocessingDrawing" xmlns:w10="urn:schemas-microsoft-com:office:word" xmlns:w="http://schemas.openxmlformats.org/wordprocessingml/2006/main" xmlns:w14="http://schemas.microsoft.com/office/word/2010/wordml" xmlns:w15="http://schemas.microsoft.com/office/word/2012/wordml" xmlns:w16cex="http://schemas.microsoft.com/office/word/2018/wordml/cex" xmlns:w16cid="http://schemas.microsoft.com/office/word/2016/wordml/cid" xmlns:w16="http://schemas.microsoft.com/office/word/2018/wordml" xmlns:w16du="http://schemas.microsoft.com/office/word/2023/wordml/word16du" xmlns:w16sdtdh="http://schemas.microsoft.com/office/word/2020/wordml/sdtdatahash" xmlns:w16sdtfl="http://schemas.microsoft.com/office/word/2024/wordml/sdtformatlock" xmlns:w16se="http://schemas.microsoft.com/office/word/2015/wordml/symex" xmlns:wpg="http://schemas.microsoft.com/office/word/2010/wordprocessingGroup" xmlns:wpi="http://schemas.microsoft.com/office/word/2010/wordprocessingInk" xmlns:wne="http://schemas.microsoft.com/office/word/2006/wordml" xmlns:wps="http://schemas.microsoft.com/office/word/2010/wordprocessingShape" mc:Ignorable="w14 w15 w16se w16cid w16 w16cex w16sdtdh w16sdtfl w16du wp14">
+<w:hdr xmlns:wpc="http://schemas.microsoft.com/office/word/2010/wordprocessingCanvas" xmlns:cx="http://schemas.microsoft.com/office/drawing/2014/chartex" xmlns:cx1="http://schemas.microsoft.com/office/drawing/2015/9/8/chartex" xmlns:cx2="http://schemas.microsoft.com/office/drawing/2015/10/21/chartex" xmlns:cx3="http://schemas.microsoft.com/office/drawing/2016/5/9/chartex" xmlns:cx4="http://schemas.microsoft.com/office/drawing/2016/5/10/chartex" xmlns:cx5="http://schemas.microsoft.com/office/drawing/2016/5/11/chartex" xmlns:cx6="http://schemas.microsoft.com/office/drawing/2016/5/12/chartex" xmlns:cx7="http://schemas.microsoft.com/office/drawing/2016/5/13/chartex" xmlns:cx8="http://schemas.microsoft.com/office/drawing/2016/5/14/chartex" xmlns:mc="http://schemas.openxmlformats.org/markup-compatibility/2006" xmlns:m="http://schemas.openxmlformats.org/officeDocument/2006/math" xmlns:aink="http://schemas.microsoft.com/office/drawing/2016/ink" xmlns:am3d="http://schemas.microsoft.com/office/drawing/2017/model3d" xmlns:oel="http://schemas.microsoft.com/office/2019/extlst" xmlns:r="http://schemas.openxmlformats.org/officeDocument/2006/relationships" xmlns:wp14="http://schemas.microsoft.com/office/word/2010/wordprocessingDrawing" xmlns:wp="http://schemas.openxmlformats.org/drawingml/2006/wordprocessingDrawing" xmlns:wpg="http://schemas.microsoft.com/office/word/2010/wordprocessingGroup" xmlns:wpi="http://schemas.microsoft.com/office/word/2010/wordprocessingInk" xmlns:wps="http://schemas.microsoft.com/office/word/2010/wordprocessingShape" xmlns:o="urn:schemas-microsoft-com:office:office" xmlns:v="urn:schemas-microsoft-com:vml" xmlns:w10="urn:schemas-microsoft-com:office:word" xmlns:w="http://schemas.openxmlformats.org/wordprocessingml/2006/main" xmlns:w14="http://schemas.microsoft.com/office/word/2010/wordml" xmlns:w15="http://schemas.microsoft.com/office/word/2012/wordml" xmlns:w16cei="http://schemas.microsoft.com/office/word/2026/wordml/cei" xmlns:w16cex="http://schemas.microsoft.com/office/word/2018/wordml/cex" xmlns:w16cid="http://schemas.microsoft.com/office/word/2016/wordml/cid" xmlns:w16="http://schemas.microsoft.com/office/word/2018/wordml" xmlns:w16sdtdh="http://schemas.microsoft.com/office/word/2020/wordml/sdtdatahash" xmlns:w16sdtfl="http://schemas.microsoft.com/office/word/2024/wordml/sdtformatlock" xmlns:w16se="http://schemas.microsoft.com/office/word/2015/wordml/symex" xmlns:w16du="http://schemas.microsoft.com/office/word/2023/wordml/word16du" xmlns:wne="http://schemas.microsoft.com/office/word/2006/wordml" mc:Ignorable="w14 w15 w16se w16cid w16 w16cex w16sdtdh w16sdtfl w16du wp14">
   <w:p>
     <w:pPr>
       <w:pStyle w:val="Koptekst"/>
@@ -13568,7 +15744,7 @@
 </file>
 
 <file path=word/numbering.xml><?xml version="1.0" encoding="utf-8"?>
-<w:numbering xmlns:wpc="http://schemas.microsoft.com/office/word/2010/wordprocessingCanvas" xmlns:cx="http://schemas.microsoft.com/office/drawing/2014/chartex" xmlns:cx1="http://schemas.microsoft.com/office/drawing/2015/9/8/chartex" xmlns:cx2="http://schemas.microsoft.com/office/drawing/2015/10/21/chartex" xmlns:cx3="http://schemas.microsoft.com/office/drawing/2016/5/9/chartex" xmlns:cx4="http://schemas.microsoft.com/office/drawing/2016/5/10/chartex" xmlns:cx5="http://schemas.microsoft.com/office/drawing/2016/5/11/chartex" xmlns:cx6="http://schemas.microsoft.com/office/drawing/2016/5/12/chartex" xmlns:cx7="http://schemas.microsoft.com/office/drawing/2016/5/13/chartex" xmlns:cx8="http://schemas.microsoft.com/office/drawing/2016/5/14/chartex" xmlns:mc="http://schemas.openxmlformats.org/markup-compatibility/2006" xmlns:aink="http://schemas.microsoft.com/office/drawing/2016/ink" xmlns:am3d="http://schemas.microsoft.com/office/drawing/2017/model3d" xmlns:o="urn:schemas-microsoft-com:office:office" xmlns:oel="http://schemas.microsoft.com/office/2019/extlst" xmlns:r="http://schemas.openxmlformats.org/officeDocument/2006/relationships" xmlns:m="http://schemas.openxmlformats.org/officeDocument/2006/math" xmlns:v="urn:schemas-microsoft-com:vml" xmlns:wp14="http://schemas.microsoft.com/office/word/2010/wordprocessingDrawing" xmlns:wp="http://schemas.openxmlformats.org/drawingml/2006/wordprocessingDrawing" xmlns:w10="urn:schemas-microsoft-com:office:word" xmlns:w="http://schemas.openxmlformats.org/wordprocessingml/2006/main" xmlns:w14="http://schemas.microsoft.com/office/word/2010/wordml" xmlns:w15="http://schemas.microsoft.com/office/word/2012/wordml" xmlns:w16cex="http://schemas.microsoft.com/office/word/2018/wordml/cex" xmlns:w16cid="http://schemas.microsoft.com/office/word/2016/wordml/cid" xmlns:w16="http://schemas.microsoft.com/office/word/2018/wordml" xmlns:w16du="http://schemas.microsoft.com/office/word/2023/wordml/word16du" xmlns:w16sdtdh="http://schemas.microsoft.com/office/word/2020/wordml/sdtdatahash" xmlns:w16sdtfl="http://schemas.microsoft.com/office/word/2024/wordml/sdtformatlock" xmlns:w16se="http://schemas.microsoft.com/office/word/2015/wordml/symex" xmlns:wpg="http://schemas.microsoft.com/office/word/2010/wordprocessingGroup" xmlns:wpi="http://schemas.microsoft.com/office/word/2010/wordprocessingInk" xmlns:wne="http://schemas.microsoft.com/office/word/2006/wordml" xmlns:wps="http://schemas.microsoft.com/office/word/2010/wordprocessingShape" mc:Ignorable="w14 w15 w16se w16cid w16 w16cex w16sdtdh w16sdtfl w16du wp14">
+<w:numbering xmlns:wpc="http://schemas.microsoft.com/office/word/2010/wordprocessingCanvas" xmlns:cx="http://schemas.microsoft.com/office/drawing/2014/chartex" xmlns:cx1="http://schemas.microsoft.com/office/drawing/2015/9/8/chartex" xmlns:cx2="http://schemas.microsoft.com/office/drawing/2015/10/21/chartex" xmlns:cx3="http://schemas.microsoft.com/office/drawing/2016/5/9/chartex" xmlns:cx4="http://schemas.microsoft.com/office/drawing/2016/5/10/chartex" xmlns:cx5="http://schemas.microsoft.com/office/drawing/2016/5/11/chartex" xmlns:cx6="http://schemas.microsoft.com/office/drawing/2016/5/12/chartex" xmlns:cx7="http://schemas.microsoft.com/office/drawing/2016/5/13/chartex" xmlns:cx8="http://schemas.microsoft.com/office/drawing/2016/5/14/chartex" xmlns:mc="http://schemas.openxmlformats.org/markup-compatibility/2006" xmlns:m="http://schemas.openxmlformats.org/officeDocument/2006/math" xmlns:aink="http://schemas.microsoft.com/office/drawing/2016/ink" xmlns:am3d="http://schemas.microsoft.com/office/drawing/2017/model3d" xmlns:oel="http://schemas.microsoft.com/office/2019/extlst" xmlns:r="http://schemas.openxmlformats.org/officeDocument/2006/relationships" xmlns:wp14="http://schemas.microsoft.com/office/word/2010/wordprocessingDrawing" xmlns:wp="http://schemas.openxmlformats.org/drawingml/2006/wordprocessingDrawing" xmlns:wpg="http://schemas.microsoft.com/office/word/2010/wordprocessingGroup" xmlns:wpi="http://schemas.microsoft.com/office/word/2010/wordprocessingInk" xmlns:wps="http://schemas.microsoft.com/office/word/2010/wordprocessingShape" xmlns:o="urn:schemas-microsoft-com:office:office" xmlns:v="urn:schemas-microsoft-com:vml" xmlns:w10="urn:schemas-microsoft-com:office:word" xmlns:w="http://schemas.openxmlformats.org/wordprocessingml/2006/main" xmlns:w14="http://schemas.microsoft.com/office/word/2010/wordml" xmlns:w15="http://schemas.microsoft.com/office/word/2012/wordml" xmlns:w16cei="http://schemas.microsoft.com/office/word/2026/wordml/cei" xmlns:w16cex="http://schemas.microsoft.com/office/word/2018/wordml/cex" xmlns:w16cid="http://schemas.microsoft.com/office/word/2016/wordml/cid" xmlns:w16="http://schemas.microsoft.com/office/word/2018/wordml" xmlns:w16sdtdh="http://schemas.microsoft.com/office/word/2020/wordml/sdtdatahash" xmlns:w16sdtfl="http://schemas.microsoft.com/office/word/2024/wordml/sdtformatlock" xmlns:w16se="http://schemas.microsoft.com/office/word/2015/wordml/symex" xmlns:w16du="http://schemas.microsoft.com/office/word/2023/wordml/word16du" xmlns:wne="http://schemas.microsoft.com/office/word/2006/wordml" mc:Ignorable="w14 w15 w16se w16cid w16 w16cex w16sdtdh w16sdtfl w16du wp14">
   <w:abstractNum w:abstractNumId="0" w15:restartNumberingAfterBreak="0">
     <w:nsid w:val="00000001"/>
     <w:multiLevelType w:val="hybridMultilevel"/>
@@ -14741,7 +16917,7 @@
 </file>
 
 <file path=word/styles.xml><?xml version="1.0" encoding="utf-8"?>
-<w:styles xmlns:mc="http://schemas.openxmlformats.org/markup-compatibility/2006" xmlns:r="http://schemas.openxmlformats.org/officeDocument/2006/relationships" xmlns:w="http://schemas.openxmlformats.org/wordprocessingml/2006/main" xmlns:w14="http://schemas.microsoft.com/office/word/2010/wordml" xmlns:w15="http://schemas.microsoft.com/office/word/2012/wordml" xmlns:w16cex="http://schemas.microsoft.com/office/word/2018/wordml/cex" xmlns:w16cid="http://schemas.microsoft.com/office/word/2016/wordml/cid" xmlns:w16="http://schemas.microsoft.com/office/word/2018/wordml" xmlns:w16du="http://schemas.microsoft.com/office/word/2023/wordml/word16du" xmlns:w16sdtdh="http://schemas.microsoft.com/office/word/2020/wordml/sdtdatahash" xmlns:w16sdtfl="http://schemas.microsoft.com/office/word/2024/wordml/sdtformatlock" xmlns:w16se="http://schemas.microsoft.com/office/word/2015/wordml/symex" mc:Ignorable="w14 w15 w16se w16cid w16 w16cex w16sdtdh w16sdtfl w16du">
+<w:styles xmlns:mc="http://schemas.openxmlformats.org/markup-compatibility/2006" xmlns:r="http://schemas.openxmlformats.org/officeDocument/2006/relationships" xmlns:w="http://schemas.openxmlformats.org/wordprocessingml/2006/main" xmlns:w14="http://schemas.microsoft.com/office/word/2010/wordml" xmlns:w15="http://schemas.microsoft.com/office/word/2012/wordml" xmlns:w16cex="http://schemas.microsoft.com/office/word/2018/wordml/cex" xmlns:w16cid="http://schemas.microsoft.com/office/word/2016/wordml/cid" xmlns:w16="http://schemas.microsoft.com/office/word/2018/wordml" xmlns:w16sdtdh="http://schemas.microsoft.com/office/word/2020/wordml/sdtdatahash" xmlns:w16sdtfl="http://schemas.microsoft.com/office/word/2024/wordml/sdtformatlock" xmlns:w16se="http://schemas.microsoft.com/office/word/2015/wordml/symex" xmlns:w16du="http://schemas.microsoft.com/office/word/2023/wordml/word16du" mc:Ignorable="w14 w15 w16se w16cid w16 w16cex w16sdtdh w16sdtfl w16du">
   <w:docDefaults>
     <w:rPrDefault>
       <w:rPr>

</xml_diff>